<commit_message>
Updated the Week 9 Scripting Lab I write-up.
</commit_message>
<xml_diff>
--- a/Assignement 2 Supporting Evidence/Week 9/Week 9 - Session 2 - Lab/Week 9 - Session 2 - Lab - Scripting Lab I - Implementing Controlled Automation Tasks with Documented Output.docx
+++ b/Assignement 2 Supporting Evidence/Week 9/Week 9 - Session 2 - Lab/Week 9 - Session 2 - Lab - Scripting Lab I - Implementing Controlled Automation Tasks with Documented Output.docx
@@ -1,6 +1,6 @@
 
 <file path=word/document.xml><?xml version="1.0" encoding="utf-8"?>
-<w:document xmlns:wpc="http://schemas.microsoft.com/office/word/2010/wordprocessingCanvas" xmlns:cx="http://schemas.microsoft.com/office/drawing/2014/chartex" xmlns:cx1="http://schemas.microsoft.com/office/drawing/2015/9/8/chartex" xmlns:cx2="http://schemas.microsoft.com/office/drawing/2015/10/21/chartex" xmlns:cx3="http://schemas.microsoft.com/office/drawing/2016/5/9/chartex" xmlns:cx4="http://schemas.microsoft.com/office/drawing/2016/5/10/chartex" xmlns:cx5="http://schemas.microsoft.com/office/drawing/2016/5/11/chartex" xmlns:cx6="http://schemas.microsoft.com/office/drawing/2016/5/12/chartex" xmlns:cx7="http://schemas.microsoft.com/office/drawing/2016/5/13/chartex" xmlns:cx8="http://schemas.microsoft.com/office/drawing/2016/5/14/chartex" xmlns:mc="http://schemas.openxmlformats.org/markup-compatibility/2006" xmlns:aink="http://schemas.microsoft.com/office/drawing/2016/ink" xmlns:am3d="http://schemas.microsoft.com/office/drawing/2017/model3d" xmlns:o="urn:schemas-microsoft-com:office:office" xmlns:oel="http://schemas.microsoft.com/office/2019/extlst" xmlns:r="http://schemas.openxmlformats.org/officeDocument/2006/relationships" xmlns:m="http://schemas.openxmlformats.org/officeDocument/2006/math" xmlns:v="urn:schemas-microsoft-com:vml" xmlns:wp14="http://schemas.microsoft.com/office/word/2010/wordprocessingDrawing" xmlns:wp="http://schemas.openxmlformats.org/drawingml/2006/wordprocessingDrawing" xmlns:w10="urn:schemas-microsoft-com:office:word" xmlns:w="http://schemas.openxmlformats.org/wordprocessingml/2006/main" xmlns:w14="http://schemas.microsoft.com/office/word/2010/wordml" xmlns:w15="http://schemas.microsoft.com/office/word/2012/wordml" xmlns:w16cex="http://schemas.microsoft.com/office/word/2018/wordml/cex" xmlns:w16cid="http://schemas.microsoft.com/office/word/2016/wordml/cid" xmlns:w16="http://schemas.microsoft.com/office/word/2018/wordml" xmlns:w16du="http://schemas.microsoft.com/office/word/2023/wordml/word16du" xmlns:w16sdtdh="http://schemas.microsoft.com/office/word/2020/wordml/sdtdatahash" xmlns:w16sdtfl="http://schemas.microsoft.com/office/word/2024/wordml/sdtformatlock" xmlns:w16se="http://schemas.microsoft.com/office/word/2015/wordml/symex" xmlns:wpg="http://schemas.microsoft.com/office/word/2010/wordprocessingGroup" xmlns:wpi="http://schemas.microsoft.com/office/word/2010/wordprocessingInk" xmlns:wne="http://schemas.microsoft.com/office/word/2006/wordml" xmlns:wps="http://schemas.microsoft.com/office/word/2010/wordprocessingShape" mc:Ignorable="w14 w15 w16se w16cid w16 w16cex w16sdtdh w16sdtfl w16du wp14">
+<w:document xmlns:wpc="http://schemas.microsoft.com/office/word/2010/wordprocessingCanvas" xmlns:cx="http://schemas.microsoft.com/office/drawing/2014/chartex" xmlns:cx1="http://schemas.microsoft.com/office/drawing/2015/9/8/chartex" xmlns:cx2="http://schemas.microsoft.com/office/drawing/2015/10/21/chartex" xmlns:cx3="http://schemas.microsoft.com/office/drawing/2016/5/9/chartex" xmlns:cx4="http://schemas.microsoft.com/office/drawing/2016/5/10/chartex" xmlns:cx5="http://schemas.microsoft.com/office/drawing/2016/5/11/chartex" xmlns:cx6="http://schemas.microsoft.com/office/drawing/2016/5/12/chartex" xmlns:cx7="http://schemas.microsoft.com/office/drawing/2016/5/13/chartex" xmlns:cx8="http://schemas.microsoft.com/office/drawing/2016/5/14/chartex" xmlns:mc="http://schemas.openxmlformats.org/markup-compatibility/2006" xmlns:m="http://schemas.openxmlformats.org/officeDocument/2006/math" xmlns:aink="http://schemas.microsoft.com/office/drawing/2016/ink" xmlns:am3d="http://schemas.microsoft.com/office/drawing/2017/model3d" xmlns:oel="http://schemas.microsoft.com/office/2019/extlst" xmlns:r="http://schemas.openxmlformats.org/officeDocument/2006/relationships" xmlns:wp14="http://schemas.microsoft.com/office/word/2010/wordprocessingDrawing" xmlns:wp="http://schemas.openxmlformats.org/drawingml/2006/wordprocessingDrawing" xmlns:wpg="http://schemas.microsoft.com/office/word/2010/wordprocessingGroup" xmlns:wpi="http://schemas.microsoft.com/office/word/2010/wordprocessingInk" xmlns:wps="http://schemas.microsoft.com/office/word/2010/wordprocessingShape" xmlns:o="urn:schemas-microsoft-com:office:office" xmlns:v="urn:schemas-microsoft-com:vml" xmlns:w10="urn:schemas-microsoft-com:office:word" xmlns:w="http://schemas.openxmlformats.org/wordprocessingml/2006/main" xmlns:w14="http://schemas.microsoft.com/office/word/2010/wordml" xmlns:w15="http://schemas.microsoft.com/office/word/2012/wordml" xmlns:w16cei="http://schemas.microsoft.com/office/word/2026/wordml/cei" xmlns:w16cex="http://schemas.microsoft.com/office/word/2018/wordml/cex" xmlns:w16cid="http://schemas.microsoft.com/office/word/2016/wordml/cid" xmlns:w16="http://schemas.microsoft.com/office/word/2018/wordml" xmlns:w16sdtdh="http://schemas.microsoft.com/office/word/2020/wordml/sdtdatahash" xmlns:w16sdtfl="http://schemas.microsoft.com/office/word/2024/wordml/sdtformatlock" xmlns:w16se="http://schemas.microsoft.com/office/word/2015/wordml/symex" xmlns:w16du="http://schemas.microsoft.com/office/word/2023/wordml/word16du" xmlns:wne="http://schemas.microsoft.com/office/word/2006/wordml" mc:Ignorable="w14 w15 w16se w16cid w16 w16cex w16sdtdh w16sdtfl w16du wp14">
   <w:body>
     <w:p>
       <w:pPr>
@@ -458,25 +458,7 @@
           <w:sz w:val="22"/>
           <w:lang w:val="en-GB"/>
         </w:rPr>
-        <w:t xml:space="preserve">identify the command used, the output produced, the interpretation </w:t>
-      </w:r>
-      <w:proofErr w:type="gramStart"/>
-      <w:r>
-        <w:rPr>
-          <w:rFonts w:asciiTheme="minorBidi" w:eastAsia="Calibri" w:hAnsiTheme="minorBidi"/>
-          <w:sz w:val="22"/>
-          <w:lang w:val="en-GB"/>
-        </w:rPr>
-        <w:t>made</w:t>
-      </w:r>
-      <w:proofErr w:type="gramEnd"/>
-      <w:r>
-        <w:rPr>
-          <w:rFonts w:asciiTheme="minorBidi" w:eastAsia="Calibri" w:hAnsiTheme="minorBidi"/>
-          <w:sz w:val="22"/>
-          <w:lang w:val="en-GB"/>
-        </w:rPr>
-        <w:t xml:space="preserve"> and the limitation recognised</w:t>
+        <w:t>identify the command used, the output produced, the interpretation made and the limitation recognised</w:t>
       </w:r>
     </w:p>
     <w:p>
@@ -3654,7 +3636,7 @@
       <w:pPr>
         <w:spacing w:after="20"/>
         <w:rPr>
-          <w:rFonts w:ascii="Arial" w:eastAsia="Arial" w:hAnsi="Arial"/>
+          <w:rFonts w:asciiTheme="majorHAnsi" w:eastAsia="Arial" w:hAnsiTheme="majorHAnsi" w:cstheme="majorHAnsi"/>
           <w:color w:val="1F2933"/>
           <w:sz w:val="21"/>
           <w:lang w:val="en-GB"/>
@@ -3662,12 +3644,18 @@
       </w:pPr>
       <w:r>
         <w:rPr>
-          <w:rFonts w:ascii="Arial" w:eastAsia="Arial" w:hAnsi="Arial"/>
+          <w:rFonts w:asciiTheme="majorHAnsi" w:eastAsia="Arial" w:hAnsiTheme="majorHAnsi" w:cstheme="majorHAnsi"/>
           <w:color w:val="1F2933"/>
           <w:sz w:val="21"/>
           <w:lang w:val="en-GB"/>
         </w:rPr>
-        <w:t>Answer: _____________________________________________________________________________</w:t>
+        <w:t xml:space="preserve">Answer: </w:t>
+      </w:r>
+      <w:r>
+        <w:rPr>
+          <w:rFonts w:asciiTheme="majorHAnsi" w:hAnsiTheme="majorHAnsi" w:cstheme="majorHAnsi"/>
+        </w:rPr>
+        <w:t>REPORT_TITLE="System Snapshot"</w:t>
       </w:r>
     </w:p>
     <w:p>
@@ -3694,25 +3682,42 @@
       <w:pPr>
         <w:spacing w:after="20"/>
         <w:rPr>
-          <w:rFonts w:ascii="Arial" w:eastAsia="Arial" w:hAnsi="Arial"/>
+          <w:rFonts w:asciiTheme="majorHAnsi" w:eastAsia="Arial" w:hAnsiTheme="majorHAnsi" w:cstheme="majorHAnsi"/>
+          <w:b/>
+          <w:sz w:val="22"/>
+          <w:lang w:val="en-GB"/>
+        </w:rPr>
+      </w:pPr>
+      <w:r>
+        <w:rPr>
+          <w:rFonts w:asciiTheme="majorHAnsi" w:eastAsia="Arial" w:hAnsiTheme="majorHAnsi" w:cstheme="majorHAnsi"/>
           <w:color w:val="1F2933"/>
           <w:sz w:val="21"/>
           <w:lang w:val="en-GB"/>
         </w:rPr>
-      </w:pPr>
-      <w:r>
-        <w:rPr>
-          <w:rFonts w:ascii="Arial" w:eastAsia="Arial" w:hAnsi="Arial"/>
-          <w:color w:val="1F2933"/>
-          <w:sz w:val="21"/>
-          <w:lang w:val="en-GB"/>
-        </w:rPr>
-        <w:t>Answer: _____________________________________________________________________________</w:t>
+        <w:t xml:space="preserve">Answer: </w:t>
+      </w:r>
+      <w:proofErr w:type="spellStart"/>
+      <w:r>
+        <w:rPr>
+          <w:rFonts w:asciiTheme="majorHAnsi" w:hAnsiTheme="majorHAnsi" w:cstheme="majorHAnsi"/>
+        </w:rPr>
+        <w:t>whoami</w:t>
+      </w:r>
+      <w:proofErr w:type="spellEnd"/>
+      <w:r>
+        <w:rPr>
+          <w:rFonts w:asciiTheme="majorHAnsi" w:eastAsia="Arial" w:hAnsiTheme="majorHAnsi" w:cstheme="majorHAnsi"/>
+          <w:b/>
+          <w:sz w:val="22"/>
+          <w:lang w:val="en-GB"/>
+        </w:rPr>
+        <w:t xml:space="preserve"> </w:t>
       </w:r>
     </w:p>
     <w:p>
       <w:pPr>
-        <w:spacing w:before="200" w:after="120"/>
+        <w:spacing w:after="20"/>
         <w:rPr>
           <w:rFonts w:asciiTheme="minorBidi" w:eastAsia="Arial" w:hAnsiTheme="minorBidi"/>
           <w:b/>
@@ -3720,13 +3725,24 @@
           <w:lang w:val="en-GB"/>
         </w:rPr>
       </w:pPr>
-      <w:r>
+    </w:p>
+    <w:p>
+      <w:pPr>
+        <w:spacing w:after="20"/>
         <w:rPr>
           <w:rFonts w:asciiTheme="minorBidi" w:eastAsia="Arial" w:hAnsiTheme="minorBidi"/>
           <w:b/>
           <w:sz w:val="22"/>
           <w:lang w:val="en-GB"/>
         </w:rPr>
+      </w:pPr>
+      <w:r>
+        <w:rPr>
+          <w:rFonts w:asciiTheme="minorBidi" w:eastAsia="Arial" w:hAnsiTheme="minorBidi"/>
+          <w:b/>
+          <w:sz w:val="22"/>
+          <w:lang w:val="en-GB"/>
+        </w:rPr>
         <w:t>Why do we use bash system_snapshot.sh instead of only typing the file name?</w:t>
       </w:r>
     </w:p>
@@ -3734,7 +3750,7 @@
       <w:pPr>
         <w:spacing w:after="20"/>
         <w:rPr>
-          <w:rFonts w:ascii="Arial" w:eastAsia="Arial" w:hAnsi="Arial"/>
+          <w:rFonts w:asciiTheme="majorHAnsi" w:eastAsia="Arial" w:hAnsiTheme="majorHAnsi" w:cstheme="majorHAnsi"/>
           <w:color w:val="1F2933"/>
           <w:sz w:val="21"/>
           <w:lang w:val="en-GB"/>
@@ -3742,12 +3758,46 @@
       </w:pPr>
       <w:r>
         <w:rPr>
-          <w:rFonts w:ascii="Arial" w:eastAsia="Arial" w:hAnsi="Arial"/>
+          <w:rFonts w:asciiTheme="majorHAnsi" w:eastAsia="Arial" w:hAnsiTheme="majorHAnsi" w:cstheme="majorHAnsi"/>
           <w:color w:val="1F2933"/>
           <w:sz w:val="21"/>
           <w:lang w:val="en-GB"/>
         </w:rPr>
-        <w:t>Answer: _____________________________________________________________________________</w:t>
+        <w:t xml:space="preserve">Answer: </w:t>
+      </w:r>
+      <w:r>
+        <w:rPr>
+          <w:rFonts w:asciiTheme="majorHAnsi" w:hAnsiTheme="majorHAnsi" w:cstheme="majorHAnsi"/>
+        </w:rPr>
+        <w:t xml:space="preserve">Because </w:t>
+      </w:r>
+      <w:r>
+        <w:rPr>
+          <w:rStyle w:val="HTMLCode"/>
+          <w:rFonts w:asciiTheme="majorHAnsi" w:eastAsiaTheme="minorEastAsia" w:hAnsiTheme="majorHAnsi" w:cstheme="majorHAnsi"/>
+        </w:rPr>
+        <w:t>bash</w:t>
+      </w:r>
+      <w:r>
+        <w:rPr>
+          <w:rFonts w:asciiTheme="majorHAnsi" w:hAnsiTheme="majorHAnsi" w:cstheme="majorHAnsi"/>
+        </w:rPr>
+        <w:t xml:space="preserve"> runs the script through the Bash interpreter, even if the file has not been given executable permission with </w:t>
+      </w:r>
+      <w:proofErr w:type="spellStart"/>
+      <w:r>
+        <w:rPr>
+          <w:rStyle w:val="HTMLCode"/>
+          <w:rFonts w:asciiTheme="majorHAnsi" w:eastAsiaTheme="minorEastAsia" w:hAnsiTheme="majorHAnsi" w:cstheme="majorHAnsi"/>
+        </w:rPr>
+        <w:t>chmod</w:t>
+      </w:r>
+      <w:proofErr w:type="spellEnd"/>
+      <w:r>
+        <w:rPr>
+          <w:rFonts w:asciiTheme="majorHAnsi" w:hAnsiTheme="majorHAnsi" w:cstheme="majorHAnsi"/>
+        </w:rPr>
+        <w:t>.</w:t>
       </w:r>
     </w:p>
     <w:p>
@@ -3769,6 +3819,7 @@
           <w:szCs w:val="24"/>
           <w:lang w:val="en-GB"/>
         </w:rPr>
+        <w:lastRenderedPageBreak/>
         <w:br w:type="page"/>
       </w:r>
     </w:p>
@@ -4606,7 +4657,7 @@
       <w:pPr>
         <w:spacing w:before="240"/>
         <w:rPr>
-          <w:rFonts w:asciiTheme="minorBidi" w:eastAsia="Calibri" w:hAnsiTheme="minorBidi"/>
+          <w:rFonts w:ascii="Arial" w:eastAsia="Calibri" w:hAnsi="Arial" w:cs="Arial"/>
           <w:b/>
           <w:color w:val="1F2933"/>
           <w:sz w:val="22"/>
@@ -4615,7 +4666,7 @@
       </w:pPr>
       <w:r>
         <w:rPr>
-          <w:rFonts w:asciiTheme="minorBidi" w:eastAsia="Calibri" w:hAnsiTheme="minorBidi"/>
+          <w:rFonts w:ascii="Arial" w:eastAsia="Calibri" w:hAnsi="Arial" w:cs="Arial"/>
           <w:b/>
           <w:color w:val="1F2933"/>
           <w:sz w:val="22"/>
@@ -4628,7 +4679,7 @@
       <w:pPr>
         <w:spacing w:before="200" w:after="120"/>
         <w:rPr>
-          <w:rFonts w:asciiTheme="minorBidi" w:eastAsia="Arial" w:hAnsiTheme="minorBidi"/>
+          <w:rFonts w:ascii="Arial" w:eastAsia="Arial" w:hAnsi="Arial" w:cs="Arial"/>
           <w:b/>
           <w:sz w:val="22"/>
           <w:lang w:val="en-GB"/>
@@ -4636,7 +4687,7 @@
       </w:pPr>
       <w:r>
         <w:rPr>
-          <w:rFonts w:asciiTheme="minorBidi" w:eastAsia="Arial" w:hAnsiTheme="minorBidi"/>
+          <w:rFonts w:ascii="Arial" w:eastAsia="Arial" w:hAnsi="Arial" w:cs="Arial"/>
           <w:b/>
           <w:sz w:val="22"/>
           <w:lang w:val="en-GB"/>
@@ -4648,7 +4699,7 @@
       <w:pPr>
         <w:spacing w:after="20"/>
         <w:rPr>
-          <w:rFonts w:ascii="Arial" w:eastAsia="Arial" w:hAnsi="Arial"/>
+          <w:rFonts w:ascii="Arial" w:eastAsia="Arial" w:hAnsi="Arial" w:cs="Arial"/>
           <w:color w:val="1F2933"/>
           <w:sz w:val="21"/>
           <w:lang w:val="en-GB"/>
@@ -4656,19 +4707,68 @@
       </w:pPr>
       <w:r>
         <w:rPr>
-          <w:rFonts w:ascii="Arial" w:eastAsia="Arial" w:hAnsi="Arial"/>
+          <w:rFonts w:ascii="Arial" w:eastAsia="Arial" w:hAnsi="Arial" w:cs="Arial"/>
           <w:color w:val="1F2933"/>
           <w:sz w:val="21"/>
           <w:lang w:val="en-GB"/>
         </w:rPr>
-        <w:t>Answer: _____________________________________________________________________________</w:t>
+        <w:t xml:space="preserve">Answer: </w:t>
+      </w:r>
+      <w:proofErr w:type="spellStart"/>
+      <w:r>
+        <w:rPr>
+          <w:rFonts w:ascii="Arial" w:eastAsia="Arial" w:hAnsi="Arial" w:cs="Arial"/>
+          <w:color w:val="1F2933"/>
+          <w:sz w:val="21"/>
+          <w:lang w:val="en-GB"/>
+        </w:rPr>
+        <w:t>print_</w:t>
+      </w:r>
+      <w:proofErr w:type="gramStart"/>
+      <w:r>
+        <w:rPr>
+          <w:rFonts w:ascii="Arial" w:eastAsia="Arial" w:hAnsi="Arial" w:cs="Arial"/>
+          <w:color w:val="1F2933"/>
+          <w:sz w:val="21"/>
+          <w:lang w:val="en-GB"/>
+        </w:rPr>
+        <w:t>section</w:t>
+      </w:r>
+      <w:proofErr w:type="spellEnd"/>
+      <w:r>
+        <w:rPr>
+          <w:rFonts w:ascii="Arial" w:eastAsia="Arial" w:hAnsi="Arial" w:cs="Arial"/>
+          <w:color w:val="1F2933"/>
+          <w:sz w:val="21"/>
+          <w:lang w:val="en-GB"/>
+        </w:rPr>
+        <w:t>(</w:t>
+      </w:r>
+      <w:proofErr w:type="gramEnd"/>
+      <w:r>
+        <w:rPr>
+          <w:rFonts w:ascii="Arial" w:eastAsia="Arial" w:hAnsi="Arial" w:cs="Arial"/>
+          <w:color w:val="1F2933"/>
+          <w:sz w:val="21"/>
+          <w:lang w:val="en-GB"/>
+        </w:rPr>
+        <w:t>) {</w:t>
+      </w:r>
+      <w:r>
+        <w:rPr>
+          <w:rFonts w:ascii="Arial" w:eastAsia="Arial" w:hAnsi="Arial" w:cs="Arial"/>
+          <w:color w:val="1F2933"/>
+          <w:sz w:val="21"/>
+          <w:lang w:val="en-GB"/>
+        </w:rPr>
+        <w:t>}</w:t>
       </w:r>
     </w:p>
     <w:p>
       <w:pPr>
         <w:spacing w:before="200" w:after="120"/>
         <w:rPr>
-          <w:rFonts w:asciiTheme="minorBidi" w:eastAsia="Arial" w:hAnsiTheme="minorBidi"/>
+          <w:rFonts w:ascii="Arial" w:eastAsia="Arial" w:hAnsi="Arial" w:cs="Arial"/>
           <w:b/>
           <w:sz w:val="22"/>
           <w:lang w:val="en-GB"/>
@@ -4676,7 +4776,7 @@
       </w:pPr>
       <w:r>
         <w:rPr>
-          <w:rFonts w:asciiTheme="minorBidi" w:eastAsia="Arial" w:hAnsiTheme="minorBidi"/>
+          <w:rFonts w:ascii="Arial" w:eastAsia="Arial" w:hAnsi="Arial" w:cs="Arial"/>
           <w:b/>
           <w:sz w:val="22"/>
           <w:lang w:val="en-GB"/>
@@ -4688,7 +4788,7 @@
       <w:pPr>
         <w:spacing w:after="20"/>
         <w:rPr>
-          <w:rFonts w:ascii="Arial" w:eastAsia="Arial" w:hAnsi="Arial"/>
+          <w:rFonts w:ascii="Arial" w:eastAsia="Arial" w:hAnsi="Arial" w:cs="Arial"/>
           <w:color w:val="1F2933"/>
           <w:sz w:val="21"/>
           <w:lang w:val="en-GB"/>
@@ -4696,19 +4796,81 @@
       </w:pPr>
       <w:r>
         <w:rPr>
-          <w:rFonts w:ascii="Arial" w:eastAsia="Arial" w:hAnsi="Arial"/>
+          <w:rFonts w:ascii="Arial" w:eastAsia="Arial" w:hAnsi="Arial" w:cs="Arial"/>
           <w:color w:val="1F2933"/>
           <w:sz w:val="21"/>
           <w:lang w:val="en-GB"/>
         </w:rPr>
-        <w:t>Answer: _____________________________________________________________________________</w:t>
+        <w:t xml:space="preserve">Answer: </w:t>
+      </w:r>
+      <w:proofErr w:type="spellStart"/>
+      <w:r>
+        <w:rPr>
+          <w:rFonts w:ascii="Arial" w:hAnsi="Arial" w:cs="Arial"/>
+        </w:rPr>
+        <w:t>print_section</w:t>
+      </w:r>
+      <w:proofErr w:type="spellEnd"/>
+      <w:r>
+        <w:rPr>
+          <w:rFonts w:ascii="Arial" w:hAnsi="Arial" w:cs="Arial"/>
+        </w:rPr>
+        <w:t xml:space="preserve"> </w:t>
+      </w:r>
+      <w:r>
+        <w:rPr>
+          <w:rStyle w:val="k"/>
+          <w:rFonts w:ascii="Arial" w:hAnsi="Arial" w:cs="Arial"/>
+        </w:rPr>
+        <w:t>"</w:t>
+      </w:r>
+      <w:r>
+        <w:rPr>
+          <w:rStyle w:val="m"/>
+          <w:rFonts w:ascii="Arial" w:hAnsi="Arial" w:cs="Arial"/>
+        </w:rPr>
+        <w:t>$REPORT_TITLE</w:t>
+      </w:r>
+      <w:r>
+        <w:rPr>
+          <w:rStyle w:val="k"/>
+          <w:rFonts w:ascii="Arial" w:hAnsi="Arial" w:cs="Arial"/>
+        </w:rPr>
+        <w:t>"</w:t>
+      </w:r>
+      <w:r>
+        <w:rPr>
+          <w:rFonts w:ascii="Arial" w:hAnsi="Arial" w:cs="Arial"/>
+        </w:rPr>
+        <w:t xml:space="preserve"> </w:t>
+      </w:r>
+      <w:proofErr w:type="spellStart"/>
+      <w:r>
+        <w:rPr>
+          <w:rFonts w:ascii="Arial" w:hAnsi="Arial" w:cs="Arial"/>
+        </w:rPr>
+        <w:t>print_section</w:t>
+      </w:r>
+      <w:proofErr w:type="spellEnd"/>
+      <w:r>
+        <w:rPr>
+          <w:rFonts w:ascii="Arial" w:hAnsi="Arial" w:cs="Arial"/>
+        </w:rPr>
+        <w:t xml:space="preserve"> </w:t>
+      </w:r>
+      <w:r>
+        <w:rPr>
+          <w:rStyle w:val="k"/>
+          <w:rFonts w:ascii="Arial" w:hAnsi="Arial" w:cs="Arial"/>
+        </w:rPr>
+        <w:t>"Current user"</w:t>
       </w:r>
     </w:p>
     <w:p>
       <w:pPr>
         <w:spacing w:before="200" w:after="120"/>
         <w:rPr>
-          <w:rFonts w:asciiTheme="minorBidi" w:eastAsia="Arial" w:hAnsiTheme="minorBidi"/>
+          <w:rFonts w:ascii="Arial" w:eastAsia="Arial" w:hAnsi="Arial" w:cs="Arial"/>
           <w:b/>
           <w:sz w:val="22"/>
           <w:lang w:val="en-GB"/>
@@ -4716,7 +4878,7 @@
       </w:pPr>
       <w:r>
         <w:rPr>
-          <w:rFonts w:asciiTheme="minorBidi" w:eastAsia="Arial" w:hAnsiTheme="minorBidi"/>
+          <w:rFonts w:ascii="Arial" w:eastAsia="Arial" w:hAnsi="Arial" w:cs="Arial"/>
           <w:b/>
           <w:sz w:val="22"/>
           <w:lang w:val="en-GB"/>
@@ -4729,7 +4891,7 @@
       <w:pPr>
         <w:spacing w:after="20"/>
         <w:rPr>
-          <w:rFonts w:ascii="Arial" w:eastAsia="Arial" w:hAnsi="Arial"/>
+          <w:rFonts w:ascii="Arial" w:eastAsia="Arial" w:hAnsi="Arial" w:cs="Arial"/>
           <w:color w:val="1F2933"/>
           <w:sz w:val="21"/>
           <w:lang w:val="en-GB"/>
@@ -4737,19 +4899,25 @@
       </w:pPr>
       <w:r>
         <w:rPr>
-          <w:rFonts w:ascii="Arial" w:eastAsia="Arial" w:hAnsi="Arial"/>
+          <w:rFonts w:ascii="Arial" w:eastAsia="Arial" w:hAnsi="Arial" w:cs="Arial"/>
           <w:color w:val="1F2933"/>
           <w:sz w:val="21"/>
           <w:lang w:val="en-GB"/>
         </w:rPr>
-        <w:t>Answer: _____________________________________________________________________________</w:t>
+        <w:t xml:space="preserve">Answer: </w:t>
+      </w:r>
+      <w:r>
+        <w:rPr>
+          <w:rFonts w:ascii="Arial" w:hAnsi="Arial" w:cs="Arial"/>
+        </w:rPr>
+        <w:t>A function keeps the formatting consistent and avoids repeating the same commands. This makes the script and its output clearer and easier to understand.</w:t>
       </w:r>
     </w:p>
     <w:p>
       <w:pPr>
         <w:spacing w:before="360" w:line="240" w:lineRule="auto"/>
         <w:rPr>
-          <w:rFonts w:asciiTheme="minorBidi" w:eastAsia="Calibri" w:hAnsiTheme="minorBidi"/>
+          <w:rFonts w:ascii="Arial" w:eastAsia="Calibri" w:hAnsi="Arial" w:cs="Arial"/>
           <w:b/>
           <w:sz w:val="24"/>
           <w:szCs w:val="24"/>
@@ -4758,7 +4926,7 @@
       </w:pPr>
       <w:r>
         <w:rPr>
-          <w:rFonts w:asciiTheme="minorBidi" w:eastAsia="Calibri" w:hAnsiTheme="minorBidi"/>
+          <w:rFonts w:ascii="Arial" w:eastAsia="Calibri" w:hAnsi="Arial" w:cs="Arial"/>
           <w:b/>
           <w:sz w:val="24"/>
           <w:szCs w:val="24"/>
@@ -4771,13 +4939,13 @@
       <w:pPr>
         <w:spacing w:after="120"/>
         <w:rPr>
-          <w:rFonts w:asciiTheme="minorBidi" w:hAnsiTheme="minorBidi"/>
+          <w:rFonts w:ascii="Arial" w:hAnsi="Arial" w:cs="Arial"/>
           <w:sz w:val="22"/>
         </w:rPr>
       </w:pPr>
       <w:r>
         <w:rPr>
-          <w:rFonts w:asciiTheme="minorBidi" w:hAnsiTheme="minorBidi"/>
+          <w:rFonts w:ascii="Arial" w:hAnsi="Arial" w:cs="Arial"/>
           <w:sz w:val="22"/>
         </w:rPr>
         <w:t>A conditional lets a script report different messages depending on what it finds. This lab uses a safe directory-existence check. The script is not changing system settings.</w:t>
@@ -4787,23 +4955,16 @@
       <w:pPr>
         <w:spacing w:after="120"/>
         <w:rPr>
-          <w:rFonts w:asciiTheme="minorBidi" w:hAnsiTheme="minorBidi"/>
+          <w:rFonts w:ascii="Arial" w:hAnsi="Arial" w:cs="Arial"/>
           <w:sz w:val="22"/>
         </w:rPr>
       </w:pPr>
       <w:r>
         <w:rPr>
-          <w:rFonts w:asciiTheme="minorBidi" w:hAnsiTheme="minorBidi"/>
+          <w:rFonts w:ascii="Arial" w:hAnsi="Arial" w:cs="Arial"/>
           <w:sz w:val="22"/>
         </w:rPr>
-        <w:t xml:space="preserve">Add this variable near the top of your script, below </w:t>
-      </w:r>
-      <w:r>
-        <w:rPr>
-          <w:rFonts w:ascii="Consolas" w:hAnsi="Consolas" w:cs="Consolas"/>
-          <w:sz w:val="22"/>
-        </w:rPr>
-        <w:t>REPORT_TITLE:</w:t>
+        <w:t>Add this variable near the top of your script, below REPORT_TITLE:</w:t>
       </w:r>
     </w:p>
     <w:tbl>
@@ -4839,7 +5000,7 @@
               <w:spacing w:before="80" w:after="80"/>
               <w:ind w:left="215" w:right="108"/>
               <w:rPr>
-                <w:rFonts w:ascii="Consolas" w:eastAsia="Consolas" w:hAnsi="Consolas"/>
+                <w:rFonts w:ascii="Arial" w:eastAsia="Consolas" w:hAnsi="Arial" w:cs="Arial"/>
                 <w:color w:val="1F2933"/>
                 <w:szCs w:val="20"/>
                 <w:lang w:val="en-GB"/>
@@ -4847,7 +5008,7 @@
             </w:pPr>
             <w:r>
               <w:rPr>
-                <w:rFonts w:ascii="Consolas" w:eastAsia="Consolas" w:hAnsi="Consolas"/>
+                <w:rFonts w:ascii="Arial" w:eastAsia="Consolas" w:hAnsi="Arial" w:cs="Arial"/>
                 <w:color w:val="1F2933"/>
                 <w:szCs w:val="20"/>
                 <w:lang w:val="en-GB"/>
@@ -4862,7 +5023,7 @@
       <w:pPr>
         <w:spacing w:after="40"/>
         <w:rPr>
-          <w:rFonts w:asciiTheme="minorBidi" w:hAnsiTheme="minorBidi"/>
+          <w:rFonts w:ascii="Arial" w:hAnsi="Arial" w:cs="Arial"/>
         </w:rPr>
       </w:pPr>
     </w:p>
@@ -4870,13 +5031,13 @@
       <w:pPr>
         <w:spacing w:after="120"/>
         <w:rPr>
-          <w:rFonts w:asciiTheme="minorBidi" w:hAnsiTheme="minorBidi"/>
+          <w:rFonts w:ascii="Arial" w:hAnsi="Arial" w:cs="Arial"/>
           <w:sz w:val="22"/>
         </w:rPr>
       </w:pPr>
       <w:r>
         <w:rPr>
-          <w:rFonts w:asciiTheme="minorBidi" w:hAnsiTheme="minorBidi"/>
+          <w:rFonts w:ascii="Arial" w:hAnsi="Arial" w:cs="Arial"/>
           <w:sz w:val="22"/>
         </w:rPr>
         <w:t>Then add this section after the Date and time section:</w:t>
@@ -4915,7 +5076,7 @@
               <w:spacing w:before="80" w:after="160"/>
               <w:ind w:left="216" w:right="109"/>
               <w:rPr>
-                <w:rFonts w:ascii="Consolas" w:eastAsia="Consolas" w:hAnsi="Consolas"/>
+                <w:rFonts w:ascii="Arial" w:eastAsia="Consolas" w:hAnsi="Arial" w:cs="Arial"/>
                 <w:color w:val="1F2933"/>
                 <w:szCs w:val="20"/>
                 <w:lang w:val="en-GB"/>
@@ -4923,7 +5084,7 @@
             </w:pPr>
             <w:r>
               <w:rPr>
-                <w:rFonts w:ascii="Consolas" w:eastAsia="Consolas" w:hAnsi="Consolas"/>
+                <w:rFonts w:ascii="Arial" w:eastAsia="Consolas" w:hAnsi="Arial" w:cs="Arial"/>
                 <w:color w:val="1F2933"/>
                 <w:szCs w:val="20"/>
                 <w:lang w:val="en-GB"/>
@@ -4932,7 +5093,7 @@
             </w:r>
             <w:r>
               <w:rPr>
-                <w:rFonts w:ascii="Consolas" w:eastAsia="Consolas" w:hAnsi="Consolas"/>
+                <w:rFonts w:ascii="Arial" w:eastAsia="Consolas" w:hAnsi="Arial" w:cs="Arial"/>
                 <w:color w:val="1F2933"/>
                 <w:szCs w:val="20"/>
                 <w:lang w:val="en-GB"/>
@@ -4941,7 +5102,7 @@
             </w:r>
             <w:r>
               <w:rPr>
-                <w:rFonts w:ascii="Consolas" w:eastAsia="Consolas" w:hAnsi="Consolas"/>
+                <w:rFonts w:ascii="Arial" w:eastAsia="Consolas" w:hAnsi="Arial" w:cs="Arial"/>
                 <w:color w:val="1F2933"/>
                 <w:szCs w:val="20"/>
                 <w:lang w:val="en-GB"/>
@@ -4952,7 +5113,7 @@
             <w:proofErr w:type="gramStart"/>
             <w:r>
               <w:rPr>
-                <w:rFonts w:ascii="Consolas" w:eastAsia="Consolas" w:hAnsi="Consolas"/>
+                <w:rFonts w:ascii="Arial" w:eastAsia="Consolas" w:hAnsi="Arial" w:cs="Arial"/>
                 <w:color w:val="1F2933"/>
                 <w:szCs w:val="20"/>
                 <w:lang w:val="en-GB"/>
@@ -4962,7 +5123,7 @@
             <w:proofErr w:type="gramEnd"/>
             <w:r>
               <w:rPr>
-                <w:rFonts w:ascii="Consolas" w:eastAsia="Consolas" w:hAnsi="Consolas"/>
+                <w:rFonts w:ascii="Arial" w:eastAsia="Consolas" w:hAnsi="Arial" w:cs="Arial"/>
                 <w:color w:val="1F2933"/>
                 <w:szCs w:val="20"/>
                 <w:lang w:val="en-GB"/>
@@ -4971,7 +5132,7 @@
             </w:r>
             <w:r>
               <w:rPr>
-                <w:rFonts w:ascii="Consolas" w:eastAsia="Consolas" w:hAnsi="Consolas"/>
+                <w:rFonts w:ascii="Arial" w:eastAsia="Consolas" w:hAnsi="Arial" w:cs="Arial"/>
                 <w:color w:val="1F2933"/>
                 <w:szCs w:val="20"/>
                 <w:lang w:val="en-GB"/>
@@ -4981,7 +5142,7 @@
             </w:r>
             <w:r>
               <w:rPr>
-                <w:rFonts w:ascii="Consolas" w:eastAsia="Consolas" w:hAnsi="Consolas"/>
+                <w:rFonts w:ascii="Arial" w:eastAsia="Consolas" w:hAnsi="Arial" w:cs="Arial"/>
                 <w:color w:val="1F2933"/>
                 <w:szCs w:val="20"/>
                 <w:lang w:val="en-GB"/>
@@ -4991,7 +5152,7 @@
             </w:r>
             <w:r>
               <w:rPr>
-                <w:rFonts w:ascii="Consolas" w:eastAsia="Consolas" w:hAnsi="Consolas"/>
+                <w:rFonts w:ascii="Arial" w:eastAsia="Consolas" w:hAnsi="Arial" w:cs="Arial"/>
                 <w:color w:val="1F2933"/>
                 <w:szCs w:val="20"/>
                 <w:lang w:val="en-GB"/>
@@ -5001,7 +5162,7 @@
             </w:r>
             <w:r>
               <w:rPr>
-                <w:rFonts w:ascii="Consolas" w:eastAsia="Consolas" w:hAnsi="Consolas"/>
+                <w:rFonts w:ascii="Arial" w:eastAsia="Consolas" w:hAnsi="Arial" w:cs="Arial"/>
                 <w:color w:val="1F2933"/>
                 <w:szCs w:val="20"/>
                 <w:lang w:val="en-GB"/>
@@ -5017,7 +5178,7 @@
       <w:pPr>
         <w:spacing w:after="40"/>
         <w:rPr>
-          <w:rFonts w:asciiTheme="minorBidi" w:hAnsiTheme="minorBidi"/>
+          <w:rFonts w:ascii="Arial" w:hAnsi="Arial" w:cs="Arial"/>
         </w:rPr>
       </w:pPr>
     </w:p>
@@ -5025,13 +5186,13 @@
       <w:pPr>
         <w:spacing w:after="120"/>
         <w:rPr>
-          <w:rFonts w:asciiTheme="minorBidi" w:hAnsiTheme="minorBidi"/>
+          <w:rFonts w:ascii="Arial" w:hAnsi="Arial" w:cs="Arial"/>
           <w:sz w:val="22"/>
         </w:rPr>
       </w:pPr>
       <w:r>
         <w:rPr>
-          <w:rFonts w:asciiTheme="minorBidi" w:hAnsiTheme="minorBidi"/>
+          <w:rFonts w:ascii="Arial" w:hAnsi="Arial" w:cs="Arial"/>
           <w:sz w:val="22"/>
         </w:rPr>
         <w:t>Run the script before creating the evidence folder:</w:t>
@@ -5070,7 +5231,7 @@
               <w:spacing w:before="80" w:after="80"/>
               <w:ind w:left="215" w:right="108"/>
               <w:rPr>
-                <w:rFonts w:ascii="Consolas" w:eastAsia="Consolas" w:hAnsi="Consolas"/>
+                <w:rFonts w:ascii="Arial" w:eastAsia="Consolas" w:hAnsi="Arial" w:cs="Arial"/>
                 <w:color w:val="1F2933"/>
                 <w:szCs w:val="20"/>
                 <w:lang w:val="en-GB"/>
@@ -5078,7 +5239,7 @@
             </w:pPr>
             <w:r>
               <w:rPr>
-                <w:rFonts w:ascii="Consolas" w:eastAsia="Consolas" w:hAnsi="Consolas"/>
+                <w:rFonts w:ascii="Arial" w:eastAsia="Consolas" w:hAnsi="Arial" w:cs="Arial"/>
                 <w:color w:val="1F2933"/>
                 <w:szCs w:val="20"/>
                 <w:lang w:val="en-GB"/>
@@ -5093,7 +5254,7 @@
       <w:pPr>
         <w:spacing w:after="40"/>
         <w:rPr>
-          <w:rFonts w:asciiTheme="minorBidi" w:hAnsiTheme="minorBidi"/>
+          <w:rFonts w:ascii="Arial" w:hAnsi="Arial" w:cs="Arial"/>
         </w:rPr>
       </w:pPr>
     </w:p>
@@ -5101,13 +5262,13 @@
       <w:pPr>
         <w:spacing w:after="120"/>
         <w:rPr>
-          <w:rFonts w:asciiTheme="minorBidi" w:hAnsiTheme="minorBidi"/>
+          <w:rFonts w:ascii="Arial" w:hAnsi="Arial" w:cs="Arial"/>
           <w:sz w:val="22"/>
         </w:rPr>
       </w:pPr>
       <w:r>
         <w:rPr>
-          <w:rFonts w:asciiTheme="minorBidi" w:hAnsiTheme="minorBidi"/>
+          <w:rFonts w:ascii="Arial" w:hAnsi="Arial" w:cs="Arial"/>
           <w:sz w:val="22"/>
         </w:rPr>
         <w:t>Now create the evidence folder and run the script again:</w:t>
@@ -5146,7 +5307,7 @@
               <w:spacing w:before="80" w:after="80"/>
               <w:ind w:left="215" w:right="108"/>
               <w:rPr>
-                <w:rFonts w:ascii="Consolas" w:eastAsia="Consolas" w:hAnsi="Consolas"/>
+                <w:rFonts w:ascii="Arial" w:eastAsia="Consolas" w:hAnsi="Arial" w:cs="Arial"/>
                 <w:color w:val="1F2933"/>
                 <w:szCs w:val="20"/>
                 <w:lang w:val="en-GB"/>
@@ -5154,7 +5315,7 @@
             </w:pPr>
             <w:r>
               <w:rPr>
-                <w:rFonts w:ascii="Consolas" w:eastAsia="Consolas" w:hAnsi="Consolas"/>
+                <w:rFonts w:ascii="Arial" w:eastAsia="Consolas" w:hAnsi="Arial" w:cs="Arial"/>
                 <w:color w:val="1F2933"/>
                 <w:szCs w:val="20"/>
                 <w:lang w:val="en-GB"/>
@@ -5163,7 +5324,7 @@
             </w:r>
             <w:r>
               <w:rPr>
-                <w:rFonts w:ascii="Consolas" w:eastAsia="Consolas" w:hAnsi="Consolas"/>
+                <w:rFonts w:ascii="Arial" w:eastAsia="Consolas" w:hAnsi="Arial" w:cs="Arial"/>
                 <w:color w:val="1F2933"/>
                 <w:szCs w:val="20"/>
                 <w:lang w:val="en-GB"/>
@@ -5179,7 +5340,7 @@
       <w:pPr>
         <w:spacing w:after="40"/>
         <w:rPr>
-          <w:rFonts w:asciiTheme="minorBidi" w:hAnsiTheme="minorBidi"/>
+          <w:rFonts w:ascii="Arial" w:hAnsi="Arial" w:cs="Arial"/>
         </w:rPr>
       </w:pPr>
     </w:p>
@@ -5187,13 +5348,13 @@
       <w:pPr>
         <w:spacing w:after="120"/>
         <w:rPr>
-          <w:rFonts w:asciiTheme="minorBidi" w:hAnsiTheme="minorBidi"/>
+          <w:rFonts w:ascii="Arial" w:hAnsi="Arial" w:cs="Arial"/>
           <w:sz w:val="22"/>
         </w:rPr>
       </w:pPr>
       <w:r>
         <w:rPr>
-          <w:rFonts w:asciiTheme="minorBidi" w:hAnsiTheme="minorBidi"/>
+          <w:rFonts w:ascii="Arial" w:hAnsi="Arial" w:cs="Arial"/>
           <w:sz w:val="22"/>
         </w:rPr>
         <w:t>Expected behaviour: before the folder exists, the script should report that the evidence directory is not found. After you create the folder, the script should report that the evidence directory is found.</w:t>
@@ -5203,7 +5364,7 @@
       <w:pPr>
         <w:spacing w:before="240"/>
         <w:rPr>
-          <w:rFonts w:asciiTheme="minorBidi" w:eastAsia="Calibri" w:hAnsiTheme="minorBidi"/>
+          <w:rFonts w:ascii="Arial" w:eastAsia="Calibri" w:hAnsi="Arial" w:cs="Arial"/>
           <w:b/>
           <w:sz w:val="22"/>
           <w:lang w:val="en-GB"/>
@@ -5211,7 +5372,7 @@
       </w:pPr>
       <w:r>
         <w:rPr>
-          <w:rFonts w:asciiTheme="minorBidi" w:eastAsia="Calibri" w:hAnsiTheme="minorBidi"/>
+          <w:rFonts w:ascii="Arial" w:eastAsia="Calibri" w:hAnsi="Arial" w:cs="Arial"/>
           <w:b/>
           <w:sz w:val="22"/>
           <w:lang w:val="en-GB"/>
@@ -5234,9 +5395,9 @@
         <w:tblLook w:val="04A0" w:firstRow="1" w:lastRow="0" w:firstColumn="1" w:lastColumn="0" w:noHBand="0" w:noVBand="1"/>
       </w:tblPr>
       <w:tblGrid>
-        <w:gridCol w:w="3354"/>
-        <w:gridCol w:w="3020"/>
-        <w:gridCol w:w="3498"/>
+        <w:gridCol w:w="3356"/>
+        <w:gridCol w:w="3019"/>
+        <w:gridCol w:w="3497"/>
       </w:tblGrid>
       <w:tr>
         <w:trPr>
@@ -5253,7 +5414,7 @@
             <w:pPr>
               <w:spacing w:after="0" w:line="240" w:lineRule="auto"/>
               <w:rPr>
-                <w:rFonts w:asciiTheme="minorBidi" w:eastAsia="Calibri" w:hAnsiTheme="minorBidi"/>
+                <w:rFonts w:ascii="Arial" w:eastAsia="Calibri" w:hAnsi="Arial" w:cs="Arial"/>
                 <w:b/>
                 <w:szCs w:val="20"/>
                 <w:lang w:val="en-GB"/>
@@ -5261,7 +5422,7 @@
             </w:pPr>
             <w:r>
               <w:rPr>
-                <w:rFonts w:asciiTheme="minorBidi" w:eastAsia="Calibri" w:hAnsiTheme="minorBidi"/>
+                <w:rFonts w:ascii="Arial" w:eastAsia="Calibri" w:hAnsi="Arial" w:cs="Arial"/>
                 <w:b/>
                 <w:szCs w:val="20"/>
                 <w:lang w:val="en-GB"/>
@@ -5279,7 +5440,7 @@
             <w:pPr>
               <w:spacing w:after="0" w:line="240" w:lineRule="auto"/>
               <w:rPr>
-                <w:rFonts w:asciiTheme="minorBidi" w:eastAsia="Calibri" w:hAnsiTheme="minorBidi"/>
+                <w:rFonts w:ascii="Arial" w:eastAsia="Calibri" w:hAnsi="Arial" w:cs="Arial"/>
                 <w:b/>
                 <w:szCs w:val="20"/>
                 <w:lang w:val="en-GB"/>
@@ -5287,7 +5448,7 @@
             </w:pPr>
             <w:r>
               <w:rPr>
-                <w:rFonts w:asciiTheme="minorBidi" w:eastAsia="Calibri" w:hAnsiTheme="minorBidi"/>
+                <w:rFonts w:ascii="Arial" w:eastAsia="Calibri" w:hAnsi="Arial" w:cs="Arial"/>
                 <w:b/>
                 <w:szCs w:val="20"/>
                 <w:lang w:val="en-GB"/>
@@ -5305,7 +5466,7 @@
             <w:pPr>
               <w:spacing w:after="0" w:line="240" w:lineRule="auto"/>
               <w:rPr>
-                <w:rFonts w:asciiTheme="minorBidi" w:eastAsia="Calibri" w:hAnsiTheme="minorBidi"/>
+                <w:rFonts w:ascii="Arial" w:eastAsia="Calibri" w:hAnsi="Arial" w:cs="Arial"/>
                 <w:b/>
                 <w:szCs w:val="20"/>
                 <w:lang w:val="en-GB"/>
@@ -5313,7 +5474,7 @@
             </w:pPr>
             <w:r>
               <w:rPr>
-                <w:rFonts w:asciiTheme="minorBidi" w:eastAsia="Calibri" w:hAnsiTheme="minorBidi"/>
+                <w:rFonts w:ascii="Arial" w:eastAsia="Calibri" w:hAnsi="Arial" w:cs="Arial"/>
                 <w:b/>
                 <w:szCs w:val="20"/>
                 <w:lang w:val="en-GB"/>
@@ -5323,7 +5484,7 @@
             <w:proofErr w:type="gramStart"/>
             <w:r>
               <w:rPr>
-                <w:rFonts w:asciiTheme="minorBidi" w:eastAsia="Calibri" w:hAnsiTheme="minorBidi"/>
+                <w:rFonts w:ascii="Arial" w:eastAsia="Calibri" w:hAnsi="Arial" w:cs="Arial"/>
                 <w:b/>
                 <w:szCs w:val="20"/>
                 <w:lang w:val="en-GB"/>
@@ -5347,13 +5508,13 @@
             <w:pPr>
               <w:spacing w:after="0"/>
               <w:rPr>
-                <w:rFonts w:ascii="Consolas" w:hAnsi="Consolas" w:cs="Consolas"/>
+                <w:rFonts w:ascii="Arial" w:hAnsi="Arial" w:cs="Arial"/>
                 <w:szCs w:val="20"/>
               </w:rPr>
             </w:pPr>
             <w:r>
               <w:rPr>
-                <w:rFonts w:ascii="Consolas" w:hAnsi="Consolas" w:cs="Consolas"/>
+                <w:rFonts w:ascii="Arial" w:hAnsi="Arial" w:cs="Arial"/>
                 <w:szCs w:val="20"/>
               </w:rPr>
               <w:t>CHECK_DIR="week9_evidence"</w:t>
@@ -5368,13 +5529,13 @@
             <w:pPr>
               <w:spacing w:after="0"/>
               <w:rPr>
-                <w:rFonts w:asciiTheme="minorBidi" w:hAnsiTheme="minorBidi"/>
+                <w:rFonts w:ascii="Arial" w:hAnsi="Arial" w:cs="Arial"/>
                 <w:szCs w:val="20"/>
               </w:rPr>
             </w:pPr>
             <w:r>
               <w:rPr>
-                <w:rFonts w:asciiTheme="minorBidi" w:hAnsiTheme="minorBidi"/>
+                <w:rFonts w:ascii="Arial" w:hAnsi="Arial" w:cs="Arial"/>
                 <w:szCs w:val="20"/>
               </w:rPr>
               <w:t>Stores the directory name in a variable.</w:t>
@@ -5389,13 +5550,13 @@
             <w:pPr>
               <w:spacing w:after="0"/>
               <w:rPr>
-                <w:rFonts w:asciiTheme="minorBidi" w:hAnsiTheme="minorBidi"/>
+                <w:rFonts w:ascii="Arial" w:hAnsi="Arial" w:cs="Arial"/>
                 <w:szCs w:val="20"/>
               </w:rPr>
             </w:pPr>
             <w:r>
               <w:rPr>
-                <w:rFonts w:asciiTheme="minorBidi" w:hAnsiTheme="minorBidi"/>
+                <w:rFonts w:ascii="Arial" w:hAnsi="Arial" w:cs="Arial"/>
                 <w:szCs w:val="20"/>
               </w:rPr>
               <w:t>Makes the value easier to reuse and change later.</w:t>
@@ -5416,13 +5577,13 @@
             <w:pPr>
               <w:spacing w:after="0"/>
               <w:rPr>
-                <w:rFonts w:ascii="Consolas" w:hAnsi="Consolas" w:cs="Consolas"/>
+                <w:rFonts w:ascii="Arial" w:hAnsi="Arial" w:cs="Arial"/>
                 <w:szCs w:val="20"/>
               </w:rPr>
             </w:pPr>
             <w:r>
               <w:rPr>
-                <w:rFonts w:ascii="Consolas" w:hAnsi="Consolas" w:cs="Consolas"/>
+                <w:rFonts w:ascii="Arial" w:hAnsi="Arial" w:cs="Arial"/>
                 <w:szCs w:val="20"/>
               </w:rPr>
               <w:t>if [ -d "$CHECK_DIR</w:t>
@@ -5430,7 +5591,7 @@
             <w:proofErr w:type="gramStart"/>
             <w:r>
               <w:rPr>
-                <w:rFonts w:ascii="Consolas" w:hAnsi="Consolas" w:cs="Consolas"/>
+                <w:rFonts w:ascii="Arial" w:hAnsi="Arial" w:cs="Arial"/>
                 <w:szCs w:val="20"/>
               </w:rPr>
               <w:t>" ]</w:t>
@@ -5438,7 +5599,7 @@
             <w:proofErr w:type="gramEnd"/>
             <w:r>
               <w:rPr>
-                <w:rFonts w:ascii="Consolas" w:hAnsi="Consolas" w:cs="Consolas"/>
+                <w:rFonts w:ascii="Arial" w:hAnsi="Arial" w:cs="Arial"/>
                 <w:szCs w:val="20"/>
               </w:rPr>
               <w:t>; then</w:t>
@@ -5453,13 +5614,13 @@
             <w:pPr>
               <w:spacing w:after="0"/>
               <w:rPr>
-                <w:rFonts w:asciiTheme="minorBidi" w:hAnsiTheme="minorBidi"/>
+                <w:rFonts w:ascii="Arial" w:hAnsi="Arial" w:cs="Arial"/>
                 <w:szCs w:val="20"/>
               </w:rPr>
             </w:pPr>
             <w:r>
               <w:rPr>
-                <w:rFonts w:asciiTheme="minorBidi" w:hAnsiTheme="minorBidi"/>
+                <w:rFonts w:ascii="Arial" w:hAnsi="Arial" w:cs="Arial"/>
                 <w:szCs w:val="20"/>
               </w:rPr>
               <w:t>Tests whether the directory exists.</w:t>
@@ -5474,13 +5635,13 @@
             <w:pPr>
               <w:spacing w:after="0"/>
               <w:rPr>
-                <w:rFonts w:asciiTheme="minorBidi" w:hAnsiTheme="minorBidi"/>
+                <w:rFonts w:ascii="Arial" w:hAnsi="Arial" w:cs="Arial"/>
                 <w:szCs w:val="20"/>
               </w:rPr>
             </w:pPr>
             <w:r>
               <w:rPr>
-                <w:rFonts w:asciiTheme="minorBidi" w:hAnsiTheme="minorBidi"/>
+                <w:rFonts w:ascii="Arial" w:hAnsi="Arial" w:cs="Arial"/>
                 <w:szCs w:val="20"/>
               </w:rPr>
               <w:t>Supports a claim about what the script found at that time.</w:t>
@@ -5501,13 +5662,13 @@
             <w:pPr>
               <w:spacing w:after="0"/>
               <w:rPr>
-                <w:rFonts w:ascii="Consolas" w:hAnsi="Consolas" w:cs="Consolas"/>
+                <w:rFonts w:ascii="Arial" w:hAnsi="Arial" w:cs="Arial"/>
                 <w:szCs w:val="20"/>
               </w:rPr>
             </w:pPr>
             <w:r>
               <w:rPr>
-                <w:rFonts w:ascii="Consolas" w:hAnsi="Consolas" w:cs="Consolas"/>
+                <w:rFonts w:ascii="Arial" w:hAnsi="Arial" w:cs="Arial"/>
                 <w:szCs w:val="20"/>
               </w:rPr>
               <w:t>-d</w:t>
@@ -5522,13 +5683,13 @@
             <w:pPr>
               <w:spacing w:after="0"/>
               <w:rPr>
-                <w:rFonts w:asciiTheme="minorBidi" w:hAnsiTheme="minorBidi"/>
+                <w:rFonts w:ascii="Arial" w:hAnsi="Arial" w:cs="Arial"/>
                 <w:szCs w:val="20"/>
               </w:rPr>
             </w:pPr>
             <w:r>
               <w:rPr>
-                <w:rFonts w:asciiTheme="minorBidi" w:hAnsiTheme="minorBidi"/>
+                <w:rFonts w:ascii="Arial" w:hAnsi="Arial" w:cs="Arial"/>
                 <w:szCs w:val="20"/>
               </w:rPr>
               <w:t>Checks for a directory.</w:t>
@@ -5543,13 +5704,13 @@
             <w:pPr>
               <w:spacing w:after="0"/>
               <w:rPr>
-                <w:rFonts w:asciiTheme="minorBidi" w:hAnsiTheme="minorBidi"/>
+                <w:rFonts w:ascii="Arial" w:hAnsi="Arial" w:cs="Arial"/>
                 <w:szCs w:val="20"/>
               </w:rPr>
             </w:pPr>
             <w:r>
               <w:rPr>
-                <w:rFonts w:asciiTheme="minorBidi" w:hAnsiTheme="minorBidi"/>
+                <w:rFonts w:ascii="Arial" w:hAnsi="Arial" w:cs="Arial"/>
                 <w:szCs w:val="20"/>
               </w:rPr>
               <w:t>This is a safe check; it does not create or delete anything.</w:t>
@@ -5570,13 +5731,13 @@
             <w:pPr>
               <w:spacing w:after="0"/>
               <w:rPr>
-                <w:rFonts w:ascii="Consolas" w:hAnsi="Consolas" w:cs="Consolas"/>
+                <w:rFonts w:ascii="Arial" w:hAnsi="Arial" w:cs="Arial"/>
                 <w:szCs w:val="20"/>
               </w:rPr>
             </w:pPr>
             <w:r>
               <w:rPr>
-                <w:rFonts w:ascii="Consolas" w:hAnsi="Consolas" w:cs="Consolas"/>
+                <w:rFonts w:ascii="Arial" w:hAnsi="Arial" w:cs="Arial"/>
                 <w:szCs w:val="20"/>
               </w:rPr>
               <w:t>else</w:t>
@@ -5591,13 +5752,13 @@
             <w:pPr>
               <w:spacing w:after="0"/>
               <w:rPr>
-                <w:rFonts w:asciiTheme="minorBidi" w:hAnsiTheme="minorBidi"/>
+                <w:rFonts w:ascii="Arial" w:hAnsi="Arial" w:cs="Arial"/>
                 <w:szCs w:val="20"/>
               </w:rPr>
             </w:pPr>
             <w:r>
               <w:rPr>
-                <w:rFonts w:asciiTheme="minorBidi" w:hAnsiTheme="minorBidi"/>
+                <w:rFonts w:ascii="Arial" w:hAnsi="Arial" w:cs="Arial"/>
                 <w:szCs w:val="20"/>
               </w:rPr>
               <w:t>Provides the alternative message if the test is not true.</w:t>
@@ -5612,13 +5773,13 @@
             <w:pPr>
               <w:spacing w:after="0"/>
               <w:rPr>
-                <w:rFonts w:asciiTheme="minorBidi" w:hAnsiTheme="minorBidi"/>
+                <w:rFonts w:ascii="Arial" w:hAnsi="Arial" w:cs="Arial"/>
                 <w:szCs w:val="20"/>
               </w:rPr>
             </w:pPr>
             <w:r>
               <w:rPr>
-                <w:rFonts w:asciiTheme="minorBidi" w:hAnsiTheme="minorBidi"/>
+                <w:rFonts w:ascii="Arial" w:hAnsi="Arial" w:cs="Arial"/>
                 <w:szCs w:val="20"/>
               </w:rPr>
               <w:t>Helps the script report both outcomes.</w:t>
@@ -5639,13 +5800,13 @@
             <w:pPr>
               <w:spacing w:after="0"/>
               <w:rPr>
-                <w:rFonts w:ascii="Consolas" w:hAnsi="Consolas" w:cs="Consolas"/>
+                <w:rFonts w:ascii="Arial" w:hAnsi="Arial" w:cs="Arial"/>
                 <w:szCs w:val="20"/>
               </w:rPr>
             </w:pPr>
             <w:r>
               <w:rPr>
-                <w:rFonts w:ascii="Consolas" w:hAnsi="Consolas" w:cs="Consolas"/>
+                <w:rFonts w:ascii="Arial" w:hAnsi="Arial" w:cs="Arial"/>
                 <w:szCs w:val="20"/>
               </w:rPr>
               <w:t>fi</w:t>
@@ -5660,13 +5821,13 @@
             <w:pPr>
               <w:spacing w:after="0"/>
               <w:rPr>
-                <w:rFonts w:asciiTheme="minorBidi" w:hAnsiTheme="minorBidi"/>
+                <w:rFonts w:ascii="Arial" w:hAnsi="Arial" w:cs="Arial"/>
                 <w:szCs w:val="20"/>
               </w:rPr>
             </w:pPr>
             <w:r>
               <w:rPr>
-                <w:rFonts w:asciiTheme="minorBidi" w:hAnsiTheme="minorBidi"/>
+                <w:rFonts w:ascii="Arial" w:hAnsi="Arial" w:cs="Arial"/>
                 <w:szCs w:val="20"/>
               </w:rPr>
               <w:t>Closes the if statement.</w:t>
@@ -5681,13 +5842,13 @@
             <w:pPr>
               <w:spacing w:after="0"/>
               <w:rPr>
-                <w:rFonts w:asciiTheme="minorBidi" w:hAnsiTheme="minorBidi"/>
+                <w:rFonts w:ascii="Arial" w:hAnsi="Arial" w:cs="Arial"/>
                 <w:szCs w:val="20"/>
               </w:rPr>
             </w:pPr>
             <w:r>
               <w:rPr>
-                <w:rFonts w:asciiTheme="minorBidi" w:hAnsiTheme="minorBidi"/>
+                <w:rFonts w:ascii="Arial" w:hAnsi="Arial" w:cs="Arial"/>
                 <w:szCs w:val="20"/>
               </w:rPr>
               <w:t>Without fi, the conditional block is incomplete.</w:t>
@@ -5708,13 +5869,13 @@
             <w:pPr>
               <w:spacing w:after="0"/>
               <w:rPr>
-                <w:rFonts w:ascii="Consolas" w:hAnsi="Consolas" w:cs="Consolas"/>
+                <w:rFonts w:ascii="Arial" w:hAnsi="Arial" w:cs="Arial"/>
                 <w:szCs w:val="20"/>
               </w:rPr>
             </w:pPr>
             <w:r>
               <w:rPr>
-                <w:rFonts w:ascii="Consolas" w:hAnsi="Consolas" w:cs="Consolas"/>
+                <w:rFonts w:ascii="Arial" w:hAnsi="Arial" w:cs="Arial"/>
                 <w:szCs w:val="20"/>
               </w:rPr>
               <w:t>mkdir -p week9_evidence</w:t>
@@ -5729,13 +5890,13 @@
             <w:pPr>
               <w:spacing w:after="0"/>
               <w:rPr>
-                <w:rFonts w:asciiTheme="minorBidi" w:hAnsiTheme="minorBidi"/>
+                <w:rFonts w:ascii="Arial" w:hAnsi="Arial" w:cs="Arial"/>
                 <w:szCs w:val="20"/>
               </w:rPr>
             </w:pPr>
             <w:r>
               <w:rPr>
-                <w:rFonts w:asciiTheme="minorBidi" w:hAnsiTheme="minorBidi"/>
+                <w:rFonts w:ascii="Arial" w:hAnsi="Arial" w:cs="Arial"/>
                 <w:szCs w:val="20"/>
               </w:rPr>
               <w:t>Creates the evidence folder if it does not already exist.</w:t>
@@ -5750,13 +5911,13 @@
             <w:pPr>
               <w:spacing w:after="0"/>
               <w:rPr>
-                <w:rFonts w:asciiTheme="minorBidi" w:hAnsiTheme="minorBidi"/>
+                <w:rFonts w:ascii="Arial" w:hAnsi="Arial" w:cs="Arial"/>
                 <w:szCs w:val="20"/>
               </w:rPr>
             </w:pPr>
             <w:r>
               <w:rPr>
-                <w:rFonts w:asciiTheme="minorBidi" w:hAnsiTheme="minorBidi"/>
+                <w:rFonts w:ascii="Arial" w:hAnsi="Arial" w:cs="Arial"/>
                 <w:szCs w:val="20"/>
               </w:rPr>
               <w:t>Used here to show the conditional producing a different result.</w:t>
@@ -5769,7 +5930,7 @@
       <w:pPr>
         <w:spacing w:before="240"/>
         <w:rPr>
-          <w:rFonts w:asciiTheme="minorBidi" w:eastAsia="Calibri" w:hAnsiTheme="minorBidi"/>
+          <w:rFonts w:ascii="Arial" w:eastAsia="Calibri" w:hAnsi="Arial" w:cs="Arial"/>
           <w:b/>
           <w:color w:val="1F2933"/>
           <w:sz w:val="22"/>
@@ -5781,7 +5942,7 @@
       <w:pPr>
         <w:spacing w:before="240"/>
         <w:rPr>
-          <w:rFonts w:asciiTheme="minorBidi" w:eastAsia="Calibri" w:hAnsiTheme="minorBidi"/>
+          <w:rFonts w:ascii="Arial" w:eastAsia="Calibri" w:hAnsi="Arial" w:cs="Arial"/>
           <w:b/>
           <w:color w:val="1F2933"/>
           <w:sz w:val="22"/>
@@ -5790,7 +5951,7 @@
       </w:pPr>
       <w:r>
         <w:rPr>
-          <w:rFonts w:asciiTheme="minorBidi" w:eastAsia="Calibri" w:hAnsiTheme="minorBidi"/>
+          <w:rFonts w:ascii="Arial" w:eastAsia="Calibri" w:hAnsi="Arial" w:cs="Arial"/>
           <w:b/>
           <w:color w:val="1F2933"/>
           <w:sz w:val="22"/>
@@ -5804,7 +5965,7 @@
       <w:pPr>
         <w:spacing w:before="200" w:after="120"/>
         <w:rPr>
-          <w:rFonts w:asciiTheme="minorBidi" w:eastAsia="Arial" w:hAnsiTheme="minorBidi"/>
+          <w:rFonts w:ascii="Arial" w:eastAsia="Arial" w:hAnsi="Arial" w:cs="Arial"/>
           <w:b/>
           <w:sz w:val="22"/>
           <w:lang w:val="en-GB"/>
@@ -5812,7 +5973,7 @@
       </w:pPr>
       <w:r>
         <w:rPr>
-          <w:rFonts w:asciiTheme="minorBidi" w:eastAsia="Arial" w:hAnsiTheme="minorBidi"/>
+          <w:rFonts w:ascii="Arial" w:eastAsia="Arial" w:hAnsi="Arial" w:cs="Arial"/>
           <w:b/>
           <w:sz w:val="22"/>
           <w:lang w:val="en-GB"/>
@@ -5824,7 +5985,7 @@
       <w:pPr>
         <w:spacing w:after="20"/>
         <w:rPr>
-          <w:rFonts w:ascii="Arial" w:eastAsia="Arial" w:hAnsi="Arial"/>
+          <w:rFonts w:ascii="Arial" w:eastAsia="Arial" w:hAnsi="Arial" w:cs="Arial"/>
           <w:color w:val="1F2933"/>
           <w:sz w:val="21"/>
           <w:lang w:val="en-GB"/>
@@ -5832,19 +5993,25 @@
       </w:pPr>
       <w:r>
         <w:rPr>
-          <w:rFonts w:ascii="Arial" w:eastAsia="Arial" w:hAnsi="Arial"/>
+          <w:rFonts w:ascii="Arial" w:eastAsia="Arial" w:hAnsi="Arial" w:cs="Arial"/>
           <w:color w:val="1F2933"/>
           <w:sz w:val="21"/>
           <w:lang w:val="en-GB"/>
         </w:rPr>
-        <w:t>Answer: _____________________________________________________________________________</w:t>
+        <w:t xml:space="preserve">Answer: </w:t>
+      </w:r>
+      <w:r>
+        <w:rPr>
+          <w:rFonts w:ascii="Arial" w:hAnsi="Arial" w:cs="Arial"/>
+        </w:rPr>
+        <w:t>It checks whether the specified path exists and is a directory.</w:t>
       </w:r>
     </w:p>
     <w:p>
       <w:pPr>
         <w:spacing w:before="200" w:after="120"/>
         <w:rPr>
-          <w:rFonts w:asciiTheme="minorBidi" w:eastAsia="Arial" w:hAnsiTheme="minorBidi"/>
+          <w:rFonts w:ascii="Arial" w:eastAsia="Arial" w:hAnsi="Arial" w:cs="Arial"/>
           <w:b/>
           <w:sz w:val="22"/>
           <w:lang w:val="en-GB"/>
@@ -5852,7 +6019,7 @@
       </w:pPr>
       <w:r>
         <w:rPr>
-          <w:rFonts w:asciiTheme="minorBidi" w:eastAsia="Arial" w:hAnsiTheme="minorBidi"/>
+          <w:rFonts w:ascii="Arial" w:eastAsia="Arial" w:hAnsi="Arial" w:cs="Arial"/>
           <w:b/>
           <w:sz w:val="22"/>
           <w:lang w:val="en-GB"/>
@@ -5864,7 +6031,7 @@
       <w:pPr>
         <w:spacing w:after="20"/>
         <w:rPr>
-          <w:rFonts w:ascii="Arial" w:eastAsia="Arial" w:hAnsi="Arial"/>
+          <w:rFonts w:ascii="Arial" w:eastAsia="Arial" w:hAnsi="Arial" w:cs="Arial"/>
           <w:color w:val="1F2933"/>
           <w:sz w:val="21"/>
           <w:lang w:val="en-GB"/>
@@ -5872,19 +6039,25 @@
       </w:pPr>
       <w:r>
         <w:rPr>
-          <w:rFonts w:ascii="Arial" w:eastAsia="Arial" w:hAnsi="Arial"/>
+          <w:rFonts w:ascii="Arial" w:eastAsia="Arial" w:hAnsi="Arial" w:cs="Arial"/>
           <w:color w:val="1F2933"/>
           <w:sz w:val="21"/>
           <w:lang w:val="en-GB"/>
         </w:rPr>
-        <w:t>Answer: _____________________________________________________________________________</w:t>
+        <w:t xml:space="preserve">Answer: </w:t>
+      </w:r>
+      <w:r>
+        <w:rPr>
+          <w:rFonts w:ascii="Arial" w:hAnsi="Arial" w:cs="Arial"/>
+        </w:rPr>
+        <w:t>It makes the result clear, so the user knows whether the directory exists or is missing.</w:t>
       </w:r>
     </w:p>
     <w:p>
       <w:pPr>
         <w:spacing w:before="200" w:after="120"/>
         <w:rPr>
-          <w:rFonts w:asciiTheme="minorBidi" w:eastAsia="Arial" w:hAnsiTheme="minorBidi"/>
+          <w:rFonts w:ascii="Arial" w:eastAsia="Arial" w:hAnsi="Arial" w:cs="Arial"/>
           <w:b/>
           <w:sz w:val="22"/>
           <w:lang w:val="en-GB"/>
@@ -5892,7 +6065,7 @@
       </w:pPr>
       <w:r>
         <w:rPr>
-          <w:rFonts w:asciiTheme="minorBidi" w:eastAsia="Arial" w:hAnsiTheme="minorBidi"/>
+          <w:rFonts w:ascii="Arial" w:eastAsia="Arial" w:hAnsi="Arial" w:cs="Arial"/>
           <w:b/>
           <w:sz w:val="22"/>
           <w:lang w:val="en-GB"/>
@@ -5904,7 +6077,7 @@
       <w:pPr>
         <w:spacing w:after="20"/>
         <w:rPr>
-          <w:rFonts w:ascii="Arial" w:eastAsia="Arial" w:hAnsi="Arial"/>
+          <w:rFonts w:ascii="Arial" w:eastAsia="Arial" w:hAnsi="Arial" w:cs="Arial"/>
           <w:color w:val="1F2933"/>
           <w:sz w:val="21"/>
           <w:lang w:val="en-GB"/>
@@ -5912,19 +6085,45 @@
       </w:pPr>
       <w:r>
         <w:rPr>
-          <w:rFonts w:ascii="Arial" w:eastAsia="Arial" w:hAnsi="Arial"/>
+          <w:rFonts w:ascii="Arial" w:eastAsia="Arial" w:hAnsi="Arial" w:cs="Arial"/>
           <w:color w:val="1F2933"/>
           <w:sz w:val="21"/>
           <w:lang w:val="en-GB"/>
         </w:rPr>
-        <w:t>Answer: _____________________________________________________________________________</w:t>
+        <w:t xml:space="preserve">Answer: </w:t>
+      </w:r>
+      <w:r>
+        <w:rPr>
+          <w:rStyle w:val="HTMLCode"/>
+          <w:rFonts w:ascii="Arial" w:eastAsiaTheme="minorEastAsia" w:hAnsi="Arial" w:cs="Arial"/>
+        </w:rPr>
+        <w:t>fi</w:t>
+      </w:r>
+      <w:r>
+        <w:rPr>
+          <w:rFonts w:ascii="Arial" w:hAnsi="Arial" w:cs="Arial"/>
+        </w:rPr>
+        <w:t xml:space="preserve"> marks the end of the </w:t>
+      </w:r>
+      <w:r>
+        <w:rPr>
+          <w:rStyle w:val="HTMLCode"/>
+          <w:rFonts w:ascii="Arial" w:eastAsiaTheme="minorEastAsia" w:hAnsi="Arial" w:cs="Arial"/>
+        </w:rPr>
+        <w:t>if</w:t>
+      </w:r>
+      <w:r>
+        <w:rPr>
+          <w:rFonts w:ascii="Arial" w:hAnsi="Arial" w:cs="Arial"/>
+        </w:rPr>
+        <w:t xml:space="preserve"> conditional block.</w:t>
       </w:r>
     </w:p>
     <w:p>
       <w:pPr>
         <w:spacing w:before="360"/>
         <w:rPr>
-          <w:rFonts w:asciiTheme="minorBidi" w:eastAsia="Calibri" w:hAnsiTheme="minorBidi"/>
+          <w:rFonts w:ascii="Arial" w:eastAsia="Calibri" w:hAnsi="Arial" w:cs="Arial"/>
           <w:b/>
           <w:sz w:val="24"/>
           <w:szCs w:val="24"/>
@@ -5933,7 +6132,7 @@
       </w:pPr>
       <w:r>
         <w:rPr>
-          <w:rFonts w:asciiTheme="minorBidi" w:eastAsia="Calibri" w:hAnsiTheme="minorBidi"/>
+          <w:rFonts w:ascii="Arial" w:eastAsia="Calibri" w:hAnsi="Arial" w:cs="Arial"/>
           <w:b/>
           <w:sz w:val="24"/>
           <w:szCs w:val="24"/>
@@ -5946,13 +6145,13 @@
       <w:pPr>
         <w:spacing w:after="120"/>
         <w:rPr>
-          <w:rFonts w:asciiTheme="minorBidi" w:hAnsiTheme="minorBidi"/>
+          <w:rFonts w:ascii="Arial" w:hAnsi="Arial" w:cs="Arial"/>
           <w:sz w:val="22"/>
         </w:rPr>
       </w:pPr>
       <w:r>
         <w:rPr>
-          <w:rFonts w:asciiTheme="minorBidi" w:hAnsiTheme="minorBidi"/>
+          <w:rFonts w:ascii="Arial" w:hAnsi="Arial" w:cs="Arial"/>
           <w:sz w:val="22"/>
         </w:rPr>
         <w:t>A loop repeats a section of script. In this lab, the loop is deliberately small and fixed so that you can explain exactly when it stops.</w:t>
@@ -5962,13 +6161,13 @@
       <w:pPr>
         <w:spacing w:after="120"/>
         <w:rPr>
-          <w:rFonts w:asciiTheme="minorBidi" w:hAnsiTheme="minorBidi"/>
+          <w:rFonts w:ascii="Arial" w:hAnsi="Arial" w:cs="Arial"/>
           <w:sz w:val="22"/>
         </w:rPr>
       </w:pPr>
       <w:r>
         <w:rPr>
-          <w:rFonts w:asciiTheme="minorBidi" w:hAnsiTheme="minorBidi"/>
+          <w:rFonts w:ascii="Arial" w:hAnsi="Arial" w:cs="Arial"/>
           <w:sz w:val="22"/>
         </w:rPr>
         <w:t>Add the following section to the end of your script, then save the file.</w:t>
@@ -6007,7 +6206,7 @@
               <w:spacing w:before="80" w:after="160"/>
               <w:ind w:left="216" w:right="109"/>
               <w:rPr>
-                <w:rFonts w:ascii="Consolas" w:eastAsia="Consolas" w:hAnsi="Consolas"/>
+                <w:rFonts w:ascii="Arial" w:eastAsia="Consolas" w:hAnsi="Arial" w:cs="Arial"/>
                 <w:color w:val="1F2933"/>
                 <w:szCs w:val="20"/>
                 <w:lang w:val="en-GB"/>
@@ -6015,7 +6214,7 @@
             </w:pPr>
             <w:r>
               <w:rPr>
-                <w:rFonts w:ascii="Consolas" w:eastAsia="Consolas" w:hAnsi="Consolas"/>
+                <w:rFonts w:ascii="Arial" w:eastAsia="Consolas" w:hAnsi="Arial" w:cs="Arial"/>
                 <w:color w:val="1F2933"/>
                 <w:szCs w:val="20"/>
                 <w:lang w:val="en-GB"/>
@@ -6024,7 +6223,7 @@
             </w:r>
             <w:r>
               <w:rPr>
-                <w:rFonts w:ascii="Consolas" w:eastAsia="Consolas" w:hAnsi="Consolas"/>
+                <w:rFonts w:ascii="Arial" w:eastAsia="Consolas" w:hAnsi="Arial" w:cs="Arial"/>
                 <w:color w:val="1F2933"/>
                 <w:szCs w:val="20"/>
                 <w:lang w:val="en-GB"/>
@@ -6033,7 +6232,7 @@
             </w:r>
             <w:r>
               <w:rPr>
-                <w:rFonts w:ascii="Consolas" w:eastAsia="Consolas" w:hAnsi="Consolas"/>
+                <w:rFonts w:ascii="Arial" w:eastAsia="Consolas" w:hAnsi="Arial" w:cs="Arial"/>
                 <w:color w:val="1F2933"/>
                 <w:szCs w:val="20"/>
                 <w:lang w:val="en-GB"/>
@@ -6043,7 +6242,7 @@
             </w:r>
             <w:r>
               <w:rPr>
-                <w:rFonts w:ascii="Consolas" w:eastAsia="Consolas" w:hAnsi="Consolas"/>
+                <w:rFonts w:ascii="Arial" w:eastAsia="Consolas" w:hAnsi="Arial" w:cs="Arial"/>
                 <w:color w:val="1F2933"/>
                 <w:szCs w:val="20"/>
                 <w:lang w:val="en-GB"/>
@@ -6053,7 +6252,7 @@
             </w:r>
             <w:r>
               <w:rPr>
-                <w:rFonts w:ascii="Consolas" w:eastAsia="Consolas" w:hAnsi="Consolas"/>
+                <w:rFonts w:ascii="Arial" w:eastAsia="Consolas" w:hAnsi="Arial" w:cs="Arial"/>
                 <w:color w:val="1F2933"/>
                 <w:szCs w:val="20"/>
                 <w:lang w:val="en-GB"/>
@@ -6063,7 +6262,7 @@
             </w:r>
             <w:r>
               <w:rPr>
-                <w:rFonts w:ascii="Consolas" w:eastAsia="Consolas" w:hAnsi="Consolas"/>
+                <w:rFonts w:ascii="Arial" w:eastAsia="Consolas" w:hAnsi="Arial" w:cs="Arial"/>
                 <w:color w:val="1F2933"/>
                 <w:szCs w:val="20"/>
                 <w:lang w:val="en-GB"/>
@@ -6073,7 +6272,7 @@
             </w:r>
             <w:r>
               <w:rPr>
-                <w:rFonts w:ascii="Consolas" w:eastAsia="Consolas" w:hAnsi="Consolas"/>
+                <w:rFonts w:ascii="Arial" w:eastAsia="Consolas" w:hAnsi="Arial" w:cs="Arial"/>
                 <w:color w:val="1F2933"/>
                 <w:szCs w:val="20"/>
                 <w:lang w:val="en-GB"/>
@@ -6089,7 +6288,7 @@
       <w:pPr>
         <w:spacing w:after="40"/>
         <w:rPr>
-          <w:rFonts w:asciiTheme="minorBidi" w:hAnsiTheme="minorBidi"/>
+          <w:rFonts w:ascii="Arial" w:hAnsi="Arial" w:cs="Arial"/>
         </w:rPr>
       </w:pPr>
     </w:p>
@@ -6097,13 +6296,13 @@
       <w:pPr>
         <w:spacing w:after="120"/>
         <w:rPr>
-          <w:rFonts w:asciiTheme="minorBidi" w:hAnsiTheme="minorBidi"/>
+          <w:rFonts w:ascii="Arial" w:hAnsi="Arial" w:cs="Arial"/>
           <w:sz w:val="22"/>
         </w:rPr>
       </w:pPr>
       <w:r>
         <w:rPr>
-          <w:rFonts w:asciiTheme="minorBidi" w:hAnsiTheme="minorBidi"/>
+          <w:rFonts w:ascii="Arial" w:hAnsi="Arial" w:cs="Arial"/>
           <w:sz w:val="22"/>
         </w:rPr>
         <w:t>Run the script again:</w:t>
@@ -6142,7 +6341,7 @@
               <w:spacing w:before="80" w:after="160"/>
               <w:ind w:left="216" w:right="109"/>
               <w:rPr>
-                <w:rFonts w:ascii="Consolas" w:eastAsia="Consolas" w:hAnsi="Consolas"/>
+                <w:rFonts w:ascii="Arial" w:eastAsia="Consolas" w:hAnsi="Arial" w:cs="Arial"/>
                 <w:color w:val="1F2933"/>
                 <w:szCs w:val="20"/>
                 <w:lang w:val="en-GB"/>
@@ -6150,7 +6349,7 @@
             </w:pPr>
             <w:r>
               <w:rPr>
-                <w:rFonts w:ascii="Consolas" w:eastAsia="Consolas" w:hAnsi="Consolas"/>
+                <w:rFonts w:ascii="Arial" w:eastAsia="Consolas" w:hAnsi="Arial" w:cs="Arial"/>
                 <w:color w:val="1F2933"/>
                 <w:szCs w:val="20"/>
                 <w:lang w:val="en-GB"/>
@@ -6165,7 +6364,7 @@
       <w:pPr>
         <w:spacing w:after="40"/>
         <w:rPr>
-          <w:rFonts w:asciiTheme="minorBidi" w:hAnsiTheme="minorBidi"/>
+          <w:rFonts w:ascii="Arial" w:hAnsi="Arial" w:cs="Arial"/>
         </w:rPr>
       </w:pPr>
     </w:p>
@@ -6173,13 +6372,13 @@
       <w:pPr>
         <w:spacing w:after="120"/>
         <w:rPr>
-          <w:rFonts w:asciiTheme="minorBidi" w:hAnsiTheme="minorBidi"/>
+          <w:rFonts w:ascii="Arial" w:hAnsi="Arial" w:cs="Arial"/>
           <w:sz w:val="22"/>
         </w:rPr>
       </w:pPr>
       <w:r>
         <w:rPr>
-          <w:rFonts w:asciiTheme="minorBidi" w:hAnsiTheme="minorBidi"/>
+          <w:rFonts w:ascii="Arial" w:hAnsi="Arial" w:cs="Arial"/>
           <w:sz w:val="22"/>
         </w:rPr>
         <w:t>Expected behaviour: the script should print three sample messages, one for each value in the list 1 2 3.</w:t>
@@ -6189,7 +6388,7 @@
       <w:pPr>
         <w:spacing w:before="240"/>
         <w:rPr>
-          <w:rFonts w:asciiTheme="minorBidi" w:eastAsia="Calibri" w:hAnsiTheme="minorBidi"/>
+          <w:rFonts w:ascii="Arial" w:eastAsia="Calibri" w:hAnsi="Arial" w:cs="Arial"/>
           <w:b/>
           <w:sz w:val="22"/>
           <w:lang w:val="en-GB"/>
@@ -6197,7 +6396,7 @@
       </w:pPr>
       <w:r>
         <w:rPr>
-          <w:rFonts w:asciiTheme="minorBidi" w:eastAsia="Calibri" w:hAnsiTheme="minorBidi"/>
+          <w:rFonts w:ascii="Arial" w:eastAsia="Calibri" w:hAnsi="Arial" w:cs="Arial"/>
           <w:b/>
           <w:sz w:val="22"/>
           <w:lang w:val="en-GB"/>
@@ -6239,7 +6438,7 @@
             <w:pPr>
               <w:spacing w:after="0" w:line="240" w:lineRule="auto"/>
               <w:rPr>
-                <w:rFonts w:asciiTheme="minorBidi" w:eastAsia="Calibri" w:hAnsiTheme="minorBidi"/>
+                <w:rFonts w:ascii="Arial" w:eastAsia="Calibri" w:hAnsi="Arial" w:cs="Arial"/>
                 <w:b/>
                 <w:szCs w:val="20"/>
                 <w:lang w:val="en-GB"/>
@@ -6247,7 +6446,7 @@
             </w:pPr>
             <w:r>
               <w:rPr>
-                <w:rFonts w:asciiTheme="minorBidi" w:eastAsia="Calibri" w:hAnsiTheme="minorBidi"/>
+                <w:rFonts w:ascii="Arial" w:eastAsia="Calibri" w:hAnsi="Arial" w:cs="Arial"/>
                 <w:b/>
                 <w:szCs w:val="20"/>
                 <w:lang w:val="en-GB"/>
@@ -6265,7 +6464,7 @@
             <w:pPr>
               <w:spacing w:after="0" w:line="240" w:lineRule="auto"/>
               <w:rPr>
-                <w:rFonts w:asciiTheme="minorBidi" w:eastAsia="Calibri" w:hAnsiTheme="minorBidi"/>
+                <w:rFonts w:ascii="Arial" w:eastAsia="Calibri" w:hAnsi="Arial" w:cs="Arial"/>
                 <w:b/>
                 <w:szCs w:val="20"/>
                 <w:lang w:val="en-GB"/>
@@ -6273,7 +6472,7 @@
             </w:pPr>
             <w:r>
               <w:rPr>
-                <w:rFonts w:asciiTheme="minorBidi" w:eastAsia="Calibri" w:hAnsiTheme="minorBidi"/>
+                <w:rFonts w:ascii="Arial" w:eastAsia="Calibri" w:hAnsi="Arial" w:cs="Arial"/>
                 <w:b/>
                 <w:szCs w:val="20"/>
                 <w:lang w:val="en-GB"/>
@@ -6291,7 +6490,7 @@
             <w:pPr>
               <w:spacing w:after="0" w:line="240" w:lineRule="auto"/>
               <w:rPr>
-                <w:rFonts w:asciiTheme="minorBidi" w:eastAsia="Calibri" w:hAnsiTheme="minorBidi"/>
+                <w:rFonts w:ascii="Arial" w:eastAsia="Calibri" w:hAnsi="Arial" w:cs="Arial"/>
                 <w:b/>
                 <w:szCs w:val="20"/>
                 <w:lang w:val="en-GB"/>
@@ -6299,7 +6498,7 @@
             </w:pPr>
             <w:r>
               <w:rPr>
-                <w:rFonts w:asciiTheme="minorBidi" w:eastAsia="Calibri" w:hAnsiTheme="minorBidi"/>
+                <w:rFonts w:ascii="Arial" w:eastAsia="Calibri" w:hAnsi="Arial" w:cs="Arial"/>
                 <w:b/>
                 <w:szCs w:val="20"/>
                 <w:lang w:val="en-GB"/>
@@ -6309,7 +6508,7 @@
             <w:proofErr w:type="gramStart"/>
             <w:r>
               <w:rPr>
-                <w:rFonts w:asciiTheme="minorBidi" w:eastAsia="Calibri" w:hAnsiTheme="minorBidi"/>
+                <w:rFonts w:ascii="Arial" w:eastAsia="Calibri" w:hAnsi="Arial" w:cs="Arial"/>
                 <w:b/>
                 <w:szCs w:val="20"/>
                 <w:lang w:val="en-GB"/>
@@ -6333,13 +6532,13 @@
             <w:pPr>
               <w:spacing w:after="0"/>
               <w:rPr>
-                <w:rFonts w:ascii="Consolas" w:hAnsi="Consolas" w:cs="Consolas"/>
+                <w:rFonts w:ascii="Arial" w:hAnsi="Arial" w:cs="Arial"/>
                 <w:szCs w:val="20"/>
               </w:rPr>
             </w:pPr>
             <w:r>
               <w:rPr>
-                <w:rFonts w:ascii="Consolas" w:hAnsi="Consolas" w:cs="Consolas"/>
+                <w:rFonts w:ascii="Arial" w:hAnsi="Arial" w:cs="Arial"/>
                 <w:szCs w:val="20"/>
               </w:rPr>
               <w:t>for sample in 1 2 3</w:t>
@@ -6354,13 +6553,13 @@
             <w:pPr>
               <w:spacing w:after="0"/>
               <w:rPr>
-                <w:rFonts w:asciiTheme="minorBidi" w:hAnsiTheme="minorBidi"/>
+                <w:rFonts w:ascii="Arial" w:hAnsi="Arial" w:cs="Arial"/>
                 <w:szCs w:val="20"/>
               </w:rPr>
             </w:pPr>
             <w:r>
               <w:rPr>
-                <w:rFonts w:asciiTheme="minorBidi" w:hAnsiTheme="minorBidi"/>
+                <w:rFonts w:ascii="Arial" w:hAnsi="Arial" w:cs="Arial"/>
                 <w:szCs w:val="20"/>
               </w:rPr>
               <w:t>Starts a loop and gives sample the values 1, then 2, then 3.</w:t>
@@ -6375,13 +6574,13 @@
             <w:pPr>
               <w:spacing w:after="0"/>
               <w:rPr>
-                <w:rFonts w:asciiTheme="minorBidi" w:hAnsiTheme="minorBidi"/>
+                <w:rFonts w:ascii="Arial" w:hAnsi="Arial" w:cs="Arial"/>
                 <w:szCs w:val="20"/>
               </w:rPr>
             </w:pPr>
             <w:r>
               <w:rPr>
-                <w:rFonts w:asciiTheme="minorBidi" w:hAnsiTheme="minorBidi"/>
+                <w:rFonts w:ascii="Arial" w:hAnsi="Arial" w:cs="Arial"/>
                 <w:szCs w:val="20"/>
               </w:rPr>
               <w:t>The loop count is clear and controlled.</w:t>
@@ -6402,13 +6601,13 @@
             <w:pPr>
               <w:spacing w:after="0"/>
               <w:rPr>
-                <w:rFonts w:ascii="Consolas" w:hAnsi="Consolas" w:cs="Consolas"/>
+                <w:rFonts w:ascii="Arial" w:hAnsi="Arial" w:cs="Arial"/>
                 <w:szCs w:val="20"/>
               </w:rPr>
             </w:pPr>
             <w:r>
               <w:rPr>
-                <w:rFonts w:ascii="Consolas" w:hAnsi="Consolas" w:cs="Consolas"/>
+                <w:rFonts w:ascii="Arial" w:hAnsi="Arial" w:cs="Arial"/>
                 <w:szCs w:val="20"/>
               </w:rPr>
               <w:t>do</w:t>
@@ -6423,13 +6622,13 @@
             <w:pPr>
               <w:spacing w:after="0"/>
               <w:rPr>
-                <w:rFonts w:asciiTheme="minorBidi" w:hAnsiTheme="minorBidi"/>
+                <w:rFonts w:ascii="Arial" w:hAnsi="Arial" w:cs="Arial"/>
                 <w:szCs w:val="20"/>
               </w:rPr>
             </w:pPr>
             <w:r>
               <w:rPr>
-                <w:rFonts w:asciiTheme="minorBidi" w:hAnsiTheme="minorBidi"/>
+                <w:rFonts w:ascii="Arial" w:hAnsi="Arial" w:cs="Arial"/>
                 <w:szCs w:val="20"/>
               </w:rPr>
               <w:t>Starts the commands that will be repeated.</w:t>
@@ -6444,13 +6643,13 @@
             <w:pPr>
               <w:spacing w:after="0"/>
               <w:rPr>
-                <w:rFonts w:asciiTheme="minorBidi" w:hAnsiTheme="minorBidi"/>
+                <w:rFonts w:ascii="Arial" w:hAnsi="Arial" w:cs="Arial"/>
                 <w:szCs w:val="20"/>
               </w:rPr>
             </w:pPr>
             <w:r>
               <w:rPr>
-                <w:rFonts w:asciiTheme="minorBidi" w:hAnsiTheme="minorBidi"/>
+                <w:rFonts w:ascii="Arial" w:hAnsi="Arial" w:cs="Arial"/>
                 <w:szCs w:val="20"/>
               </w:rPr>
               <w:t>The repeated section begins here.</w:t>
@@ -6471,13 +6670,13 @@
             <w:pPr>
               <w:spacing w:after="0"/>
               <w:rPr>
-                <w:rFonts w:ascii="Consolas" w:hAnsi="Consolas" w:cs="Consolas"/>
+                <w:rFonts w:ascii="Arial" w:hAnsi="Arial" w:cs="Arial"/>
                 <w:szCs w:val="20"/>
               </w:rPr>
             </w:pPr>
             <w:r>
               <w:rPr>
-                <w:rFonts w:ascii="Consolas" w:hAnsi="Consolas" w:cs="Consolas"/>
+                <w:rFonts w:ascii="Arial" w:hAnsi="Arial" w:cs="Arial"/>
                 <w:szCs w:val="20"/>
               </w:rPr>
               <w:t>echo "Sample $sample captured"</w:t>
@@ -6492,13 +6691,13 @@
             <w:pPr>
               <w:spacing w:after="0"/>
               <w:rPr>
-                <w:rFonts w:asciiTheme="minorBidi" w:hAnsiTheme="minorBidi"/>
+                <w:rFonts w:ascii="Arial" w:hAnsi="Arial" w:cs="Arial"/>
                 <w:szCs w:val="20"/>
               </w:rPr>
             </w:pPr>
             <w:r>
               <w:rPr>
-                <w:rFonts w:asciiTheme="minorBidi" w:hAnsiTheme="minorBidi"/>
+                <w:rFonts w:ascii="Arial" w:hAnsi="Arial" w:cs="Arial"/>
                 <w:szCs w:val="20"/>
               </w:rPr>
               <w:t>Prints a message using the current loop value.</w:t>
@@ -6513,13 +6712,13 @@
             <w:pPr>
               <w:spacing w:after="0"/>
               <w:rPr>
-                <w:rFonts w:asciiTheme="minorBidi" w:hAnsiTheme="minorBidi"/>
+                <w:rFonts w:ascii="Arial" w:hAnsi="Arial" w:cs="Arial"/>
                 <w:szCs w:val="20"/>
               </w:rPr>
             </w:pPr>
             <w:r>
               <w:rPr>
-                <w:rFonts w:asciiTheme="minorBidi" w:hAnsiTheme="minorBidi"/>
+                <w:rFonts w:ascii="Arial" w:hAnsi="Arial" w:cs="Arial"/>
                 <w:szCs w:val="20"/>
               </w:rPr>
               <w:t>Shows which repetition is being reported.</w:t>
@@ -6540,13 +6739,13 @@
             <w:pPr>
               <w:spacing w:after="0"/>
               <w:rPr>
-                <w:rFonts w:ascii="Consolas" w:hAnsi="Consolas" w:cs="Consolas"/>
+                <w:rFonts w:ascii="Arial" w:hAnsi="Arial" w:cs="Arial"/>
                 <w:szCs w:val="20"/>
               </w:rPr>
             </w:pPr>
             <w:r>
               <w:rPr>
-                <w:rFonts w:ascii="Consolas" w:hAnsi="Consolas" w:cs="Consolas"/>
+                <w:rFonts w:ascii="Arial" w:hAnsi="Arial" w:cs="Arial"/>
                 <w:szCs w:val="20"/>
               </w:rPr>
               <w:t>date</w:t>
@@ -6561,13 +6760,13 @@
             <w:pPr>
               <w:spacing w:after="0"/>
               <w:rPr>
-                <w:rFonts w:asciiTheme="minorBidi" w:hAnsiTheme="minorBidi"/>
+                <w:rFonts w:ascii="Arial" w:hAnsi="Arial" w:cs="Arial"/>
                 <w:szCs w:val="20"/>
               </w:rPr>
             </w:pPr>
             <w:r>
               <w:rPr>
-                <w:rFonts w:asciiTheme="minorBidi" w:hAnsiTheme="minorBidi"/>
+                <w:rFonts w:ascii="Arial" w:hAnsi="Arial" w:cs="Arial"/>
                 <w:szCs w:val="20"/>
               </w:rPr>
               <w:t>Prints a timestamp during each loop pass.</w:t>
@@ -6582,13 +6781,13 @@
             <w:pPr>
               <w:spacing w:after="0"/>
               <w:rPr>
-                <w:rFonts w:asciiTheme="minorBidi" w:hAnsiTheme="minorBidi"/>
+                <w:rFonts w:ascii="Arial" w:hAnsi="Arial" w:cs="Arial"/>
                 <w:szCs w:val="20"/>
               </w:rPr>
             </w:pPr>
             <w:r>
               <w:rPr>
-                <w:rFonts w:asciiTheme="minorBidi" w:hAnsiTheme="minorBidi"/>
+                <w:rFonts w:ascii="Arial" w:hAnsi="Arial" w:cs="Arial"/>
                 <w:szCs w:val="20"/>
               </w:rPr>
               <w:t>Useful evidence of repeated output, but not proof of scheduling.</w:t>
@@ -6609,13 +6808,13 @@
             <w:pPr>
               <w:spacing w:after="0"/>
               <w:rPr>
-                <w:rFonts w:ascii="Consolas" w:hAnsi="Consolas" w:cs="Consolas"/>
+                <w:rFonts w:ascii="Arial" w:hAnsi="Arial" w:cs="Arial"/>
                 <w:szCs w:val="20"/>
               </w:rPr>
             </w:pPr>
             <w:r>
               <w:rPr>
-                <w:rFonts w:ascii="Consolas" w:hAnsi="Consolas" w:cs="Consolas"/>
+                <w:rFonts w:ascii="Arial" w:hAnsi="Arial" w:cs="Arial"/>
                 <w:szCs w:val="20"/>
               </w:rPr>
               <w:t>done</w:t>
@@ -6630,13 +6829,13 @@
             <w:pPr>
               <w:spacing w:after="0"/>
               <w:rPr>
-                <w:rFonts w:asciiTheme="minorBidi" w:hAnsiTheme="minorBidi"/>
+                <w:rFonts w:ascii="Arial" w:hAnsi="Arial" w:cs="Arial"/>
                 <w:szCs w:val="20"/>
               </w:rPr>
             </w:pPr>
             <w:r>
               <w:rPr>
-                <w:rFonts w:asciiTheme="minorBidi" w:hAnsiTheme="minorBidi"/>
+                <w:rFonts w:ascii="Arial" w:hAnsi="Arial" w:cs="Arial"/>
                 <w:szCs w:val="20"/>
               </w:rPr>
               <w:t>Ends the loop.</w:t>
@@ -6651,13 +6850,13 @@
             <w:pPr>
               <w:spacing w:after="0"/>
               <w:rPr>
-                <w:rFonts w:asciiTheme="minorBidi" w:hAnsiTheme="minorBidi"/>
+                <w:rFonts w:ascii="Arial" w:hAnsi="Arial" w:cs="Arial"/>
                 <w:szCs w:val="20"/>
               </w:rPr>
             </w:pPr>
             <w:r>
               <w:rPr>
-                <w:rFonts w:asciiTheme="minorBidi" w:hAnsiTheme="minorBidi"/>
+                <w:rFonts w:ascii="Arial" w:hAnsi="Arial" w:cs="Arial"/>
                 <w:szCs w:val="20"/>
               </w:rPr>
               <w:t>The loop stops after the listed values have been used.</w:t>
@@ -6670,7 +6869,7 @@
       <w:pPr>
         <w:spacing w:before="240"/>
         <w:rPr>
-          <w:rFonts w:asciiTheme="minorBidi" w:eastAsia="Calibri" w:hAnsiTheme="minorBidi"/>
+          <w:rFonts w:ascii="Arial" w:eastAsia="Calibri" w:hAnsi="Arial" w:cs="Arial"/>
           <w:b/>
           <w:color w:val="1F2933"/>
           <w:sz w:val="22"/>
@@ -6679,7 +6878,7 @@
       </w:pPr>
       <w:r>
         <w:rPr>
-          <w:rFonts w:asciiTheme="minorBidi" w:eastAsia="Calibri" w:hAnsiTheme="minorBidi"/>
+          <w:rFonts w:ascii="Arial" w:eastAsia="Calibri" w:hAnsi="Arial" w:cs="Arial"/>
           <w:b/>
           <w:color w:val="1F2933"/>
           <w:sz w:val="22"/>
@@ -6692,7 +6891,7 @@
       <w:pPr>
         <w:spacing w:before="200" w:after="120"/>
         <w:rPr>
-          <w:rFonts w:asciiTheme="minorBidi" w:eastAsia="Arial" w:hAnsiTheme="minorBidi"/>
+          <w:rFonts w:ascii="Arial" w:eastAsia="Arial" w:hAnsi="Arial" w:cs="Arial"/>
           <w:b/>
           <w:sz w:val="22"/>
           <w:lang w:val="en-GB"/>
@@ -6700,7 +6899,7 @@
       </w:pPr>
       <w:r>
         <w:rPr>
-          <w:rFonts w:asciiTheme="minorBidi" w:eastAsia="Arial" w:hAnsiTheme="minorBidi"/>
+          <w:rFonts w:ascii="Arial" w:eastAsia="Arial" w:hAnsi="Arial" w:cs="Arial"/>
           <w:b/>
           <w:sz w:val="22"/>
           <w:lang w:val="en-GB"/>
@@ -6712,7 +6911,7 @@
       <w:pPr>
         <w:spacing w:after="20"/>
         <w:rPr>
-          <w:rFonts w:ascii="Arial" w:eastAsia="Arial" w:hAnsi="Arial"/>
+          <w:rFonts w:ascii="Arial" w:eastAsia="Arial" w:hAnsi="Arial" w:cs="Arial"/>
           <w:color w:val="1F2933"/>
           <w:sz w:val="21"/>
           <w:lang w:val="en-GB"/>
@@ -6720,19 +6919,64 @@
       </w:pPr>
       <w:r>
         <w:rPr>
-          <w:rFonts w:ascii="Arial" w:eastAsia="Arial" w:hAnsi="Arial"/>
+          <w:rFonts w:ascii="Arial" w:eastAsia="Arial" w:hAnsi="Arial" w:cs="Arial"/>
           <w:color w:val="1F2933"/>
           <w:sz w:val="21"/>
           <w:lang w:val="en-GB"/>
         </w:rPr>
-        <w:t>Answer: _____________________________________________________________________________</w:t>
+        <w:t xml:space="preserve">Answer: </w:t>
+      </w:r>
+      <w:r>
+        <w:rPr>
+          <w:rFonts w:ascii="Arial" w:hAnsi="Arial" w:cs="Arial"/>
+        </w:rPr>
+        <w:t xml:space="preserve">Three times, once for each value: </w:t>
+      </w:r>
+      <w:r>
+        <w:rPr>
+          <w:rStyle w:val="HTMLCode"/>
+          <w:rFonts w:ascii="Arial" w:eastAsiaTheme="minorEastAsia" w:hAnsi="Arial" w:cs="Arial"/>
+        </w:rPr>
+        <w:t>1</w:t>
+      </w:r>
+      <w:r>
+        <w:rPr>
+          <w:rFonts w:ascii="Arial" w:hAnsi="Arial" w:cs="Arial"/>
+        </w:rPr>
+        <w:t xml:space="preserve">, </w:t>
+      </w:r>
+      <w:r>
+        <w:rPr>
+          <w:rStyle w:val="HTMLCode"/>
+          <w:rFonts w:ascii="Arial" w:eastAsiaTheme="minorEastAsia" w:hAnsi="Arial" w:cs="Arial"/>
+        </w:rPr>
+        <w:t>2</w:t>
+      </w:r>
+      <w:r>
+        <w:rPr>
+          <w:rFonts w:ascii="Arial" w:hAnsi="Arial" w:cs="Arial"/>
+        </w:rPr>
+        <w:t xml:space="preserve">, and </w:t>
+      </w:r>
+      <w:r>
+        <w:rPr>
+          <w:rStyle w:val="HTMLCode"/>
+          <w:rFonts w:ascii="Arial" w:eastAsiaTheme="minorEastAsia" w:hAnsi="Arial" w:cs="Arial"/>
+        </w:rPr>
+        <w:t>3</w:t>
+      </w:r>
+      <w:r>
+        <w:rPr>
+          <w:rFonts w:ascii="Arial" w:hAnsi="Arial" w:cs="Arial"/>
+        </w:rPr>
+        <w:t>.</w:t>
       </w:r>
     </w:p>
     <w:p>
       <w:pPr>
         <w:spacing w:before="200" w:after="120"/>
         <w:rPr>
-          <w:rFonts w:asciiTheme="minorBidi" w:eastAsia="Arial" w:hAnsiTheme="minorBidi"/>
+          <w:rFonts w:ascii="Arial" w:eastAsia="Arial" w:hAnsi="Arial" w:cs="Arial"/>
           <w:b/>
           <w:sz w:val="22"/>
           <w:lang w:val="en-GB"/>
@@ -6740,7 +6984,7 @@
       </w:pPr>
       <w:r>
         <w:rPr>
-          <w:rFonts w:asciiTheme="minorBidi" w:eastAsia="Arial" w:hAnsiTheme="minorBidi"/>
+          <w:rFonts w:ascii="Arial" w:eastAsia="Arial" w:hAnsi="Arial" w:cs="Arial"/>
           <w:b/>
           <w:sz w:val="22"/>
           <w:lang w:val="en-GB"/>
@@ -6753,7 +6997,7 @@
       <w:pPr>
         <w:spacing w:after="20"/>
         <w:rPr>
-          <w:rFonts w:ascii="Arial" w:eastAsia="Arial" w:hAnsi="Arial"/>
+          <w:rFonts w:ascii="Arial" w:eastAsia="Arial" w:hAnsi="Arial" w:cs="Arial"/>
           <w:color w:val="1F2933"/>
           <w:sz w:val="21"/>
           <w:lang w:val="en-GB"/>
@@ -6761,19 +7005,25 @@
       </w:pPr>
       <w:r>
         <w:rPr>
-          <w:rFonts w:ascii="Arial" w:eastAsia="Arial" w:hAnsi="Arial"/>
+          <w:rFonts w:ascii="Arial" w:eastAsia="Arial" w:hAnsi="Arial" w:cs="Arial"/>
           <w:color w:val="1F2933"/>
           <w:sz w:val="21"/>
           <w:lang w:val="en-GB"/>
         </w:rPr>
-        <w:t>Answer: _____________________________________________________________________________</w:t>
+        <w:t xml:space="preserve">Answer: </w:t>
+      </w:r>
+      <w:r>
+        <w:rPr>
+          <w:rFonts w:ascii="Arial" w:hAnsi="Arial" w:cs="Arial"/>
+        </w:rPr>
+        <w:t>do</w:t>
       </w:r>
     </w:p>
     <w:p>
       <w:pPr>
         <w:spacing w:before="200" w:after="120"/>
         <w:rPr>
-          <w:rFonts w:asciiTheme="minorBidi" w:eastAsia="Arial" w:hAnsiTheme="minorBidi"/>
+          <w:rFonts w:ascii="Arial" w:eastAsia="Arial" w:hAnsi="Arial" w:cs="Arial"/>
           <w:b/>
           <w:sz w:val="22"/>
           <w:lang w:val="en-GB"/>
@@ -6781,7 +7031,7 @@
       </w:pPr>
       <w:r>
         <w:rPr>
-          <w:rFonts w:asciiTheme="minorBidi" w:eastAsia="Arial" w:hAnsiTheme="minorBidi"/>
+          <w:rFonts w:ascii="Arial" w:eastAsia="Arial" w:hAnsi="Arial" w:cs="Arial"/>
           <w:b/>
           <w:sz w:val="22"/>
           <w:lang w:val="en-GB"/>
@@ -6793,7 +7043,7 @@
       <w:pPr>
         <w:spacing w:after="20"/>
         <w:rPr>
-          <w:rFonts w:ascii="Arial" w:eastAsia="Arial" w:hAnsi="Arial"/>
+          <w:rFonts w:ascii="Arial" w:eastAsia="Arial" w:hAnsi="Arial" w:cs="Arial"/>
           <w:color w:val="1F2933"/>
           <w:sz w:val="21"/>
           <w:lang w:val="en-GB"/>
@@ -6801,19 +7051,38 @@
       </w:pPr>
       <w:r>
         <w:rPr>
-          <w:rFonts w:ascii="Arial" w:eastAsia="Arial" w:hAnsi="Arial"/>
+          <w:rFonts w:ascii="Arial" w:eastAsia="Arial" w:hAnsi="Arial" w:cs="Arial"/>
           <w:color w:val="1F2933"/>
           <w:sz w:val="21"/>
           <w:lang w:val="en-GB"/>
         </w:rPr>
-        <w:t>Answer: _____________________________________________________________________________</w:t>
+        <w:t xml:space="preserve">Answer: </w:t>
+      </w:r>
+      <w:r>
+        <w:rPr>
+          <w:rFonts w:ascii="Arial" w:hAnsi="Arial" w:cs="Arial"/>
+        </w:rPr>
+        <w:t xml:space="preserve">Because it only uses the fixed values </w:t>
+      </w:r>
+      <w:r>
+        <w:rPr>
+          <w:rStyle w:val="HTMLCode"/>
+          <w:rFonts w:ascii="Arial" w:eastAsiaTheme="minorEastAsia" w:hAnsi="Arial" w:cs="Arial"/>
+        </w:rPr>
+        <w:t>1 2 3</w:t>
+      </w:r>
+      <w:r>
+        <w:rPr>
+          <w:rFonts w:ascii="Arial" w:hAnsi="Arial" w:cs="Arial"/>
+        </w:rPr>
+        <w:t>, so it runs exactly three times and then stops.</w:t>
       </w:r>
     </w:p>
     <w:p>
       <w:pPr>
         <w:spacing w:before="360"/>
         <w:rPr>
-          <w:rFonts w:asciiTheme="minorBidi" w:eastAsia="Calibri" w:hAnsiTheme="minorBidi"/>
+          <w:rFonts w:ascii="Arial" w:eastAsia="Calibri" w:hAnsi="Arial" w:cs="Arial"/>
           <w:b/>
           <w:sz w:val="24"/>
           <w:szCs w:val="24"/>
@@ -6822,7 +7091,7 @@
       </w:pPr>
       <w:r>
         <w:rPr>
-          <w:rFonts w:asciiTheme="minorBidi" w:eastAsia="Calibri" w:hAnsiTheme="minorBidi"/>
+          <w:rFonts w:ascii="Arial" w:eastAsia="Calibri" w:hAnsi="Arial" w:cs="Arial"/>
           <w:b/>
           <w:sz w:val="24"/>
           <w:szCs w:val="24"/>
@@ -6835,13 +7104,13 @@
       <w:pPr>
         <w:spacing w:after="120"/>
         <w:rPr>
-          <w:rFonts w:asciiTheme="minorBidi" w:hAnsiTheme="minorBidi"/>
+          <w:rFonts w:ascii="Arial" w:hAnsi="Arial" w:cs="Arial"/>
           <w:sz w:val="22"/>
         </w:rPr>
       </w:pPr>
       <w:r>
         <w:rPr>
-          <w:rFonts w:asciiTheme="minorBidi" w:hAnsiTheme="minorBidi"/>
+          <w:rFonts w:ascii="Arial" w:hAnsi="Arial" w:cs="Arial"/>
           <w:sz w:val="22"/>
         </w:rPr>
         <w:t>So far, the script output has appeared in the terminal. In this part, you will redirect the output into a text file so that it can be reviewed later.</w:t>
@@ -6880,7 +7149,7 @@
               <w:spacing w:before="80" w:after="160"/>
               <w:ind w:left="216" w:right="109"/>
               <w:rPr>
-                <w:rFonts w:ascii="Consolas" w:eastAsia="Consolas" w:hAnsi="Consolas"/>
+                <w:rFonts w:ascii="Arial" w:eastAsia="Consolas" w:hAnsi="Arial" w:cs="Arial"/>
                 <w:color w:val="1F2933"/>
                 <w:szCs w:val="20"/>
                 <w:lang w:val="en-GB"/>
@@ -6888,7 +7157,7 @@
             </w:pPr>
             <w:r>
               <w:rPr>
-                <w:rFonts w:ascii="Consolas" w:eastAsia="Consolas" w:hAnsi="Consolas"/>
+                <w:rFonts w:ascii="Arial" w:eastAsia="Consolas" w:hAnsi="Arial" w:cs="Arial"/>
                 <w:color w:val="1F2933"/>
                 <w:szCs w:val="20"/>
                 <w:lang w:val="en-GB"/>
@@ -6897,7 +7166,7 @@
             </w:r>
             <w:r>
               <w:rPr>
-                <w:rFonts w:ascii="Consolas" w:eastAsia="Consolas" w:hAnsi="Consolas"/>
+                <w:rFonts w:ascii="Arial" w:eastAsia="Consolas" w:hAnsi="Arial" w:cs="Arial"/>
                 <w:color w:val="1F2933"/>
                 <w:szCs w:val="20"/>
                 <w:lang w:val="en-GB"/>
@@ -6913,7 +7182,7 @@
       <w:pPr>
         <w:spacing w:before="240"/>
         <w:rPr>
-          <w:rFonts w:asciiTheme="minorBidi" w:eastAsia="Calibri" w:hAnsiTheme="minorBidi"/>
+          <w:rFonts w:ascii="Arial" w:eastAsia="Calibri" w:hAnsi="Arial" w:cs="Arial"/>
           <w:b/>
           <w:sz w:val="22"/>
           <w:lang w:val="en-GB"/>
@@ -6921,7 +7190,7 @@
       </w:pPr>
       <w:r>
         <w:rPr>
-          <w:rFonts w:asciiTheme="minorBidi" w:eastAsia="Calibri" w:hAnsiTheme="minorBidi"/>
+          <w:rFonts w:ascii="Arial" w:eastAsia="Calibri" w:hAnsi="Arial" w:cs="Arial"/>
           <w:b/>
           <w:sz w:val="22"/>
           <w:lang w:val="en-GB"/>
@@ -6944,9 +7213,9 @@
         <w:tblLook w:val="04A0" w:firstRow="1" w:lastRow="0" w:firstColumn="1" w:lastColumn="0" w:noHBand="0" w:noVBand="1"/>
       </w:tblPr>
       <w:tblGrid>
-        <w:gridCol w:w="3356"/>
-        <w:gridCol w:w="3255"/>
-        <w:gridCol w:w="3261"/>
+        <w:gridCol w:w="3339"/>
+        <w:gridCol w:w="3264"/>
+        <w:gridCol w:w="3269"/>
       </w:tblGrid>
       <w:tr>
         <w:trPr>
@@ -6963,7 +7232,7 @@
             <w:pPr>
               <w:spacing w:after="0" w:line="240" w:lineRule="auto"/>
               <w:rPr>
-                <w:rFonts w:asciiTheme="minorBidi" w:eastAsia="Calibri" w:hAnsiTheme="minorBidi"/>
+                <w:rFonts w:ascii="Arial" w:eastAsia="Calibri" w:hAnsi="Arial" w:cs="Arial"/>
                 <w:b/>
                 <w:szCs w:val="20"/>
                 <w:lang w:val="en-GB"/>
@@ -6971,7 +7240,7 @@
             </w:pPr>
             <w:r>
               <w:rPr>
-                <w:rFonts w:asciiTheme="minorBidi" w:eastAsia="Calibri" w:hAnsiTheme="minorBidi"/>
+                <w:rFonts w:ascii="Arial" w:eastAsia="Calibri" w:hAnsi="Arial" w:cs="Arial"/>
                 <w:b/>
                 <w:szCs w:val="20"/>
                 <w:lang w:val="en-GB"/>
@@ -6989,7 +7258,7 @@
             <w:pPr>
               <w:spacing w:after="0" w:line="240" w:lineRule="auto"/>
               <w:rPr>
-                <w:rFonts w:asciiTheme="minorBidi" w:eastAsia="Calibri" w:hAnsiTheme="minorBidi"/>
+                <w:rFonts w:ascii="Arial" w:eastAsia="Calibri" w:hAnsi="Arial" w:cs="Arial"/>
                 <w:b/>
                 <w:szCs w:val="20"/>
                 <w:lang w:val="en-GB"/>
@@ -6997,7 +7266,7 @@
             </w:pPr>
             <w:r>
               <w:rPr>
-                <w:rFonts w:asciiTheme="minorBidi" w:eastAsia="Calibri" w:hAnsiTheme="minorBidi"/>
+                <w:rFonts w:ascii="Arial" w:eastAsia="Calibri" w:hAnsi="Arial" w:cs="Arial"/>
                 <w:b/>
                 <w:szCs w:val="20"/>
                 <w:lang w:val="en-GB"/>
@@ -7015,7 +7284,7 @@
             <w:pPr>
               <w:spacing w:after="0" w:line="240" w:lineRule="auto"/>
               <w:rPr>
-                <w:rFonts w:asciiTheme="minorBidi" w:eastAsia="Calibri" w:hAnsiTheme="minorBidi"/>
+                <w:rFonts w:ascii="Arial" w:eastAsia="Calibri" w:hAnsi="Arial" w:cs="Arial"/>
                 <w:b/>
                 <w:szCs w:val="20"/>
                 <w:lang w:val="en-GB"/>
@@ -7023,7 +7292,7 @@
             </w:pPr>
             <w:r>
               <w:rPr>
-                <w:rFonts w:asciiTheme="minorBidi" w:eastAsia="Calibri" w:hAnsiTheme="minorBidi"/>
+                <w:rFonts w:ascii="Arial" w:eastAsia="Calibri" w:hAnsi="Arial" w:cs="Arial"/>
                 <w:b/>
                 <w:szCs w:val="20"/>
                 <w:lang w:val="en-GB"/>
@@ -7033,7 +7302,7 @@
             <w:proofErr w:type="gramStart"/>
             <w:r>
               <w:rPr>
-                <w:rFonts w:asciiTheme="minorBidi" w:eastAsia="Calibri" w:hAnsiTheme="minorBidi"/>
+                <w:rFonts w:ascii="Arial" w:eastAsia="Calibri" w:hAnsi="Arial" w:cs="Arial"/>
                 <w:b/>
                 <w:szCs w:val="20"/>
                 <w:lang w:val="en-GB"/>
@@ -7057,13 +7326,13 @@
             <w:pPr>
               <w:spacing w:after="0"/>
               <w:rPr>
-                <w:rFonts w:ascii="Consolas" w:hAnsi="Consolas" w:cs="Consolas"/>
+                <w:rFonts w:ascii="Arial" w:hAnsi="Arial" w:cs="Arial"/>
                 <w:szCs w:val="20"/>
               </w:rPr>
             </w:pPr>
             <w:r>
               <w:rPr>
-                <w:rFonts w:ascii="Consolas" w:hAnsi="Consolas" w:cs="Consolas"/>
+                <w:rFonts w:ascii="Arial" w:hAnsi="Arial" w:cs="Arial"/>
                 <w:szCs w:val="20"/>
               </w:rPr>
               <w:t>bash system_snapshot.sh</w:t>
@@ -7078,13 +7347,13 @@
             <w:pPr>
               <w:spacing w:after="0"/>
               <w:rPr>
-                <w:rFonts w:asciiTheme="minorBidi" w:hAnsiTheme="minorBidi"/>
+                <w:rFonts w:ascii="Arial" w:hAnsi="Arial" w:cs="Arial"/>
                 <w:szCs w:val="20"/>
               </w:rPr>
             </w:pPr>
             <w:r>
               <w:rPr>
-                <w:rFonts w:asciiTheme="minorBidi" w:hAnsiTheme="minorBidi"/>
+                <w:rFonts w:ascii="Arial" w:hAnsi="Arial" w:cs="Arial"/>
                 <w:szCs w:val="20"/>
               </w:rPr>
               <w:t>Runs the completed teaching script with Bash.</w:t>
@@ -7099,13 +7368,13 @@
             <w:pPr>
               <w:spacing w:after="0"/>
               <w:rPr>
-                <w:rFonts w:asciiTheme="minorBidi" w:hAnsiTheme="minorBidi"/>
+                <w:rFonts w:ascii="Arial" w:hAnsi="Arial" w:cs="Arial"/>
                 <w:szCs w:val="20"/>
               </w:rPr>
             </w:pPr>
             <w:r>
               <w:rPr>
-                <w:rFonts w:asciiTheme="minorBidi" w:hAnsiTheme="minorBidi"/>
+                <w:rFonts w:ascii="Arial" w:hAnsi="Arial" w:cs="Arial"/>
                 <w:szCs w:val="20"/>
               </w:rPr>
               <w:t>Shows the command used to execute the script.</w:t>
@@ -7126,13 +7395,13 @@
             <w:pPr>
               <w:spacing w:after="0"/>
               <w:rPr>
-                <w:rFonts w:ascii="Consolas" w:hAnsi="Consolas" w:cs="Consolas"/>
+                <w:rFonts w:ascii="Arial" w:hAnsi="Arial" w:cs="Arial"/>
                 <w:szCs w:val="20"/>
               </w:rPr>
             </w:pPr>
             <w:r>
               <w:rPr>
-                <w:rFonts w:ascii="Consolas" w:hAnsi="Consolas" w:cs="Consolas"/>
+                <w:rFonts w:ascii="Arial" w:hAnsi="Arial" w:cs="Arial"/>
                 <w:szCs w:val="20"/>
               </w:rPr>
               <w:t>&gt;</w:t>
@@ -7147,13 +7416,13 @@
             <w:pPr>
               <w:spacing w:after="0"/>
               <w:rPr>
-                <w:rFonts w:asciiTheme="minorBidi" w:hAnsiTheme="minorBidi"/>
+                <w:rFonts w:ascii="Arial" w:hAnsi="Arial" w:cs="Arial"/>
                 <w:szCs w:val="20"/>
               </w:rPr>
             </w:pPr>
             <w:r>
               <w:rPr>
-                <w:rFonts w:asciiTheme="minorBidi" w:hAnsiTheme="minorBidi"/>
+                <w:rFonts w:ascii="Arial" w:hAnsi="Arial" w:cs="Arial"/>
                 <w:szCs w:val="20"/>
               </w:rPr>
               <w:t>Redirects the script output into a file.</w:t>
@@ -7168,13 +7437,13 @@
             <w:pPr>
               <w:spacing w:after="0"/>
               <w:rPr>
-                <w:rFonts w:asciiTheme="minorBidi" w:hAnsiTheme="minorBidi"/>
+                <w:rFonts w:ascii="Arial" w:hAnsi="Arial" w:cs="Arial"/>
                 <w:szCs w:val="20"/>
               </w:rPr>
             </w:pPr>
             <w:r>
               <w:rPr>
-                <w:rFonts w:asciiTheme="minorBidi" w:hAnsiTheme="minorBidi"/>
+                <w:rFonts w:ascii="Arial" w:hAnsi="Arial" w:cs="Arial"/>
                 <w:szCs w:val="20"/>
               </w:rPr>
               <w:t>Be careful: &gt; creates or overwrites the file.</w:t>
@@ -7195,13 +7464,13 @@
             <w:pPr>
               <w:spacing w:after="0"/>
               <w:rPr>
-                <w:rFonts w:ascii="Consolas" w:hAnsi="Consolas" w:cs="Consolas"/>
+                <w:rFonts w:ascii="Arial" w:hAnsi="Arial" w:cs="Arial"/>
                 <w:szCs w:val="20"/>
               </w:rPr>
             </w:pPr>
             <w:r>
               <w:rPr>
-                <w:rFonts w:ascii="Consolas" w:hAnsi="Consolas" w:cs="Consolas"/>
+                <w:rFonts w:ascii="Arial" w:hAnsi="Arial" w:cs="Arial"/>
                 <w:szCs w:val="20"/>
               </w:rPr>
               <w:t>snapshot_output.txt</w:t>
@@ -7216,13 +7485,13 @@
             <w:pPr>
               <w:spacing w:after="0"/>
               <w:rPr>
-                <w:rFonts w:asciiTheme="minorBidi" w:hAnsiTheme="minorBidi"/>
+                <w:rFonts w:ascii="Arial" w:hAnsi="Arial" w:cs="Arial"/>
                 <w:szCs w:val="20"/>
               </w:rPr>
             </w:pPr>
             <w:r>
               <w:rPr>
-                <w:rFonts w:asciiTheme="minorBidi" w:hAnsiTheme="minorBidi"/>
+                <w:rFonts w:ascii="Arial" w:hAnsi="Arial" w:cs="Arial"/>
                 <w:szCs w:val="20"/>
               </w:rPr>
               <w:t>The text file that stores the script output.</w:t>
@@ -7237,13 +7506,13 @@
             <w:pPr>
               <w:spacing w:after="0"/>
               <w:rPr>
-                <w:rFonts w:asciiTheme="minorBidi" w:hAnsiTheme="minorBidi"/>
+                <w:rFonts w:ascii="Arial" w:hAnsi="Arial" w:cs="Arial"/>
                 <w:szCs w:val="20"/>
               </w:rPr>
             </w:pPr>
             <w:r>
               <w:rPr>
-                <w:rFonts w:asciiTheme="minorBidi" w:hAnsiTheme="minorBidi"/>
+                <w:rFonts w:ascii="Arial" w:hAnsi="Arial" w:cs="Arial"/>
                 <w:szCs w:val="20"/>
               </w:rPr>
               <w:t>Useful evidence file, but not proof of full automation quality.</w:t>
@@ -7264,13 +7533,13 @@
             <w:pPr>
               <w:spacing w:after="0"/>
               <w:rPr>
-                <w:rFonts w:ascii="Consolas" w:hAnsi="Consolas" w:cs="Consolas"/>
+                <w:rFonts w:ascii="Arial" w:hAnsi="Arial" w:cs="Arial"/>
                 <w:szCs w:val="20"/>
               </w:rPr>
             </w:pPr>
             <w:r>
               <w:rPr>
-                <w:rFonts w:ascii="Consolas" w:hAnsi="Consolas" w:cs="Consolas"/>
+                <w:rFonts w:ascii="Arial" w:hAnsi="Arial" w:cs="Arial"/>
                 <w:szCs w:val="20"/>
               </w:rPr>
               <w:t>cat snapshot_output.txt</w:t>
@@ -7285,13 +7554,13 @@
             <w:pPr>
               <w:spacing w:after="0"/>
               <w:rPr>
-                <w:rFonts w:asciiTheme="minorBidi" w:hAnsiTheme="minorBidi"/>
+                <w:rFonts w:ascii="Arial" w:hAnsi="Arial" w:cs="Arial"/>
                 <w:szCs w:val="20"/>
               </w:rPr>
             </w:pPr>
             <w:r>
               <w:rPr>
-                <w:rFonts w:asciiTheme="minorBidi" w:hAnsiTheme="minorBidi"/>
+                <w:rFonts w:ascii="Arial" w:hAnsi="Arial" w:cs="Arial"/>
                 <w:szCs w:val="20"/>
               </w:rPr>
               <w:t>Displays the saved output file in the terminal.</w:t>
@@ -7306,14 +7575,14 @@
             <w:pPr>
               <w:spacing w:after="0"/>
               <w:rPr>
-                <w:rFonts w:asciiTheme="minorBidi" w:hAnsiTheme="minorBidi"/>
+                <w:rFonts w:ascii="Arial" w:hAnsi="Arial" w:cs="Arial"/>
                 <w:szCs w:val="20"/>
               </w:rPr>
             </w:pPr>
             <w:proofErr w:type="gramStart"/>
             <w:r>
               <w:rPr>
-                <w:rFonts w:asciiTheme="minorBidi" w:hAnsiTheme="minorBidi"/>
+                <w:rFonts w:ascii="Arial" w:hAnsi="Arial" w:cs="Arial"/>
                 <w:szCs w:val="20"/>
               </w:rPr>
               <w:t>Lets</w:t>
@@ -7321,7 +7590,7 @@
             <w:proofErr w:type="gramEnd"/>
             <w:r>
               <w:rPr>
-                <w:rFonts w:asciiTheme="minorBidi" w:hAnsiTheme="minorBidi"/>
+                <w:rFonts w:ascii="Arial" w:hAnsi="Arial" w:cs="Arial"/>
                 <w:szCs w:val="20"/>
               </w:rPr>
               <w:t xml:space="preserve"> you check that the output was captured and is readable.</w:t>
@@ -7732,7 +8001,7 @@
       <w:pPr>
         <w:spacing w:after="20"/>
         <w:rPr>
-          <w:rFonts w:ascii="Arial" w:eastAsia="Arial" w:hAnsi="Arial"/>
+          <w:rFonts w:ascii="Arial" w:eastAsia="Arial" w:hAnsi="Arial" w:cs="Arial"/>
           <w:color w:val="1F2933"/>
           <w:sz w:val="21"/>
           <w:lang w:val="en-GB"/>
@@ -7740,12 +8009,31 @@
       </w:pPr>
       <w:r>
         <w:rPr>
-          <w:rFonts w:ascii="Arial" w:eastAsia="Arial" w:hAnsi="Arial"/>
+          <w:rFonts w:ascii="Arial" w:eastAsia="Arial" w:hAnsi="Arial" w:cs="Arial"/>
           <w:color w:val="1F2933"/>
           <w:sz w:val="21"/>
           <w:lang w:val="en-GB"/>
         </w:rPr>
-        <w:t>Answer: _____________________________________________________________________________</w:t>
+        <w:t xml:space="preserve">Answer: </w:t>
+      </w:r>
+      <w:r>
+        <w:rPr>
+          <w:rFonts w:ascii="Arial" w:hAnsi="Arial" w:cs="Arial"/>
+        </w:rPr>
+        <w:t xml:space="preserve">It redirects the script’s output into </w:t>
+      </w:r>
+      <w:r>
+        <w:rPr>
+          <w:rStyle w:val="HTMLCode"/>
+          <w:rFonts w:ascii="Arial" w:eastAsiaTheme="minorEastAsia" w:hAnsi="Arial" w:cs="Arial"/>
+        </w:rPr>
+        <w:t>snapshot_output.txt</w:t>
+      </w:r>
+      <w:r>
+        <w:rPr>
+          <w:rFonts w:ascii="Arial" w:hAnsi="Arial" w:cs="Arial"/>
+        </w:rPr>
+        <w:t>. It creates the file or overwrites it if it already exists.</w:t>
       </w:r>
     </w:p>
     <w:p>
@@ -7772,7 +8060,7 @@
       <w:pPr>
         <w:spacing w:after="20"/>
         <w:rPr>
-          <w:rFonts w:ascii="Arial" w:eastAsia="Arial" w:hAnsi="Arial"/>
+          <w:rFonts w:ascii="Arial" w:eastAsia="Arial" w:hAnsi="Arial" w:cs="Arial"/>
           <w:color w:val="1F2933"/>
           <w:sz w:val="21"/>
           <w:lang w:val="en-GB"/>
@@ -7780,12 +8068,25 @@
       </w:pPr>
       <w:r>
         <w:rPr>
-          <w:rFonts w:ascii="Arial" w:eastAsia="Arial" w:hAnsi="Arial"/>
+          <w:rFonts w:ascii="Arial" w:eastAsia="Arial" w:hAnsi="Arial" w:cs="Arial"/>
           <w:color w:val="1F2933"/>
           <w:sz w:val="21"/>
           <w:lang w:val="en-GB"/>
         </w:rPr>
-        <w:t>Answer: _____________________________________________________________________________</w:t>
+        <w:t xml:space="preserve">Answer: </w:t>
+      </w:r>
+      <w:r>
+        <w:rPr>
+          <w:rStyle w:val="HTMLCode"/>
+          <w:rFonts w:ascii="Arial" w:eastAsiaTheme="minorEastAsia" w:hAnsi="Arial" w:cs="Arial"/>
+        </w:rPr>
+        <w:t>cat</w:t>
+      </w:r>
+      <w:r>
+        <w:rPr>
+          <w:rFonts w:ascii="Arial" w:hAnsi="Arial" w:cs="Arial"/>
+        </w:rPr>
+        <w:t xml:space="preserve"> displays the contents of the file in the terminal so the saved output can be checked.</w:t>
       </w:r>
     </w:p>
     <w:p>
@@ -7812,7 +8113,7 @@
       <w:pPr>
         <w:spacing w:after="20"/>
         <w:rPr>
-          <w:rFonts w:ascii="Arial" w:eastAsia="Arial" w:hAnsi="Arial"/>
+          <w:rFonts w:ascii="Arial" w:eastAsia="Arial" w:hAnsi="Arial" w:cs="Arial"/>
           <w:color w:val="1F2933"/>
           <w:sz w:val="21"/>
           <w:lang w:val="en-GB"/>
@@ -7820,12 +8121,18 @@
       </w:pPr>
       <w:r>
         <w:rPr>
-          <w:rFonts w:ascii="Arial" w:eastAsia="Arial" w:hAnsi="Arial"/>
+          <w:rFonts w:ascii="Arial" w:eastAsia="Arial" w:hAnsi="Arial" w:cs="Arial"/>
           <w:color w:val="1F2933"/>
           <w:sz w:val="21"/>
           <w:lang w:val="en-GB"/>
         </w:rPr>
-        <w:t>Answer: _____________________________________________________________________________</w:t>
+        <w:t xml:space="preserve">Answer: </w:t>
+      </w:r>
+      <w:r>
+        <w:rPr>
+          <w:rFonts w:ascii="Arial" w:hAnsi="Arial" w:cs="Arial"/>
+        </w:rPr>
+        <w:t>It only proves that output was saved once. It does not prove that the script runs automatically, handles errors, or works reliably every time.</w:t>
       </w:r>
     </w:p>
     <w:p>
@@ -8464,9 +8771,9 @@
         <w:tblLook w:val="04A0" w:firstRow="1" w:lastRow="0" w:firstColumn="1" w:lastColumn="0" w:noHBand="0" w:noVBand="1"/>
       </w:tblPr>
       <w:tblGrid>
-        <w:gridCol w:w="3368"/>
-        <w:gridCol w:w="3255"/>
-        <w:gridCol w:w="3249"/>
+        <w:gridCol w:w="3322"/>
+        <w:gridCol w:w="3290"/>
+        <w:gridCol w:w="3260"/>
       </w:tblGrid>
       <w:tr>
         <w:trPr>
@@ -8566,13 +8873,13 @@
             <w:pPr>
               <w:spacing w:after="0"/>
               <w:rPr>
-                <w:rFonts w:ascii="Consolas" w:hAnsi="Consolas" w:cs="Consolas"/>
+                <w:rFonts w:ascii="Arial" w:hAnsi="Arial" w:cs="Arial"/>
                 <w:szCs w:val="20"/>
               </w:rPr>
             </w:pPr>
             <w:r>
               <w:rPr>
-                <w:rFonts w:ascii="Consolas" w:hAnsi="Consolas" w:cs="Consolas"/>
+                <w:rFonts w:ascii="Arial" w:hAnsi="Arial" w:cs="Arial"/>
                 <w:szCs w:val="20"/>
               </w:rPr>
               <w:t>system_snapshot.sh</w:t>
@@ -8587,10 +8894,16 @@
             <w:pPr>
               <w:spacing w:after="0"/>
               <w:rPr>
-                <w:rFonts w:asciiTheme="minorBidi" w:hAnsiTheme="minorBidi"/>
+                <w:rFonts w:ascii="Arial" w:hAnsi="Arial" w:cs="Arial"/>
                 <w:szCs w:val="20"/>
               </w:rPr>
             </w:pPr>
+            <w:r>
+              <w:rPr>
+                <w:rFonts w:ascii="Arial" w:hAnsi="Arial" w:cs="Arial"/>
+              </w:rPr>
+              <w:t>Shows that the Bash script was created and contains variables, a function, a condition and a loop.</w:t>
+            </w:r>
           </w:p>
         </w:tc>
         <w:tc>
@@ -8601,10 +8914,16 @@
             <w:pPr>
               <w:spacing w:after="0"/>
               <w:rPr>
-                <w:rFonts w:asciiTheme="minorBidi" w:hAnsiTheme="minorBidi"/>
+                <w:rFonts w:ascii="Arial" w:hAnsi="Arial" w:cs="Arial"/>
                 <w:szCs w:val="20"/>
               </w:rPr>
             </w:pPr>
+            <w:r>
+              <w:rPr>
+                <w:rFonts w:ascii="Arial" w:hAnsi="Arial" w:cs="Arial"/>
+              </w:rPr>
+              <w:t>It does not prove that the script runs successfully.</w:t>
+            </w:r>
           </w:p>
         </w:tc>
       </w:tr>
@@ -8621,23 +8940,16 @@
             <w:pPr>
               <w:spacing w:after="0"/>
               <w:rPr>
-                <w:rFonts w:asciiTheme="minorBidi" w:hAnsiTheme="minorBidi"/>
+                <w:rFonts w:ascii="Arial" w:hAnsi="Arial" w:cs="Arial"/>
                 <w:szCs w:val="20"/>
               </w:rPr>
             </w:pPr>
             <w:r>
               <w:rPr>
-                <w:rFonts w:ascii="Consolas" w:hAnsi="Consolas" w:cs="Consolas"/>
-                <w:szCs w:val="20"/>
-              </w:rPr>
-              <w:t>bash system_snapshot.sh</w:t>
-            </w:r>
-            <w:r>
-              <w:rPr>
-                <w:rFonts w:asciiTheme="minorBidi" w:hAnsiTheme="minorBidi"/>
-                <w:szCs w:val="20"/>
-              </w:rPr>
-              <w:t xml:space="preserve"> command</w:t>
+                <w:rFonts w:ascii="Arial" w:hAnsi="Arial" w:cs="Arial"/>
+                <w:szCs w:val="20"/>
+              </w:rPr>
+              <w:t>bash system_snapshot.sh command</w:t>
             </w:r>
           </w:p>
         </w:tc>
@@ -8645,11 +8957,97 @@
           <w:tcPr>
             <w:tcW w:w="3456" w:type="dxa"/>
           </w:tcPr>
+          <w:tbl>
+            <w:tblPr>
+              <w:tblW w:w="0" w:type="auto"/>
+              <w:tblCellSpacing w:w="15" w:type="dxa"/>
+              <w:tblCellMar>
+                <w:top w:w="15" w:type="dxa"/>
+                <w:left w:w="15" w:type="dxa"/>
+                <w:bottom w:w="15" w:type="dxa"/>
+                <w:right w:w="15" w:type="dxa"/>
+              </w:tblCellMar>
+              <w:tblLook w:val="04A0" w:firstRow="1" w:lastRow="0" w:firstColumn="1" w:lastColumn="0" w:noHBand="0" w:noVBand="1"/>
+            </w:tblPr>
+            <w:tblGrid>
+              <w:gridCol w:w="96"/>
+            </w:tblGrid>
+            <w:tr>
+              <w:trPr>
+                <w:tblCellSpacing w:w="15" w:type="dxa"/>
+              </w:trPr>
+              <w:tc>
+                <w:tcPr>
+                  <w:tcW w:w="0" w:type="auto"/>
+                  <w:vAlign w:val="center"/>
+                  <w:hideMark/>
+                </w:tcPr>
+                <w:p>
+                  <w:pPr>
+                    <w:rPr>
+                      <w:rFonts w:ascii="Arial" w:hAnsi="Arial" w:cs="Arial"/>
+                    </w:rPr>
+                  </w:pPr>
+                </w:p>
+              </w:tc>
+            </w:tr>
+          </w:tbl>
+          <w:p>
+            <w:pPr>
+              <w:rPr>
+                <w:rFonts w:ascii="Arial" w:hAnsi="Arial" w:cs="Arial"/>
+                <w:vanish/>
+              </w:rPr>
+            </w:pPr>
+          </w:p>
+          <w:tbl>
+            <w:tblPr>
+              <w:tblW w:w="0" w:type="auto"/>
+              <w:tblCellSpacing w:w="15" w:type="dxa"/>
+              <w:tblCellMar>
+                <w:top w:w="15" w:type="dxa"/>
+                <w:left w:w="15" w:type="dxa"/>
+                <w:bottom w:w="15" w:type="dxa"/>
+                <w:right w:w="15" w:type="dxa"/>
+              </w:tblCellMar>
+              <w:tblLook w:val="04A0" w:firstRow="1" w:lastRow="0" w:firstColumn="1" w:lastColumn="0" w:noHBand="0" w:noVBand="1"/>
+            </w:tblPr>
+            <w:tblGrid>
+              <w:gridCol w:w="3074"/>
+            </w:tblGrid>
+            <w:tr>
+              <w:trPr>
+                <w:tblCellSpacing w:w="15" w:type="dxa"/>
+              </w:trPr>
+              <w:tc>
+                <w:tcPr>
+                  <w:tcW w:w="0" w:type="auto"/>
+                  <w:vAlign w:val="center"/>
+                  <w:hideMark/>
+                </w:tcPr>
+                <w:p>
+                  <w:pPr>
+                    <w:rPr>
+                      <w:rFonts w:ascii="Arial" w:hAnsi="Arial" w:cs="Arial"/>
+                      <w:sz w:val="24"/>
+                      <w:szCs w:val="24"/>
+                    </w:rPr>
+                  </w:pPr>
+                  <w:r>
+                    <w:rPr>
+                      <w:rFonts w:ascii="Arial" w:hAnsi="Arial" w:cs="Arial"/>
+                    </w:rPr>
+                    <w:t>Shows the command used to run the script with Bash.</w:t>
+                  </w:r>
+                </w:p>
+              </w:tc>
+            </w:tr>
+          </w:tbl>
           <w:p>
             <w:pPr>
               <w:spacing w:after="0"/>
               <w:rPr>
-                <w:rFonts w:asciiTheme="minorBidi" w:hAnsiTheme="minorBidi"/>
+                <w:rFonts w:ascii="Arial" w:hAnsi="Arial" w:cs="Arial"/>
                 <w:szCs w:val="20"/>
               </w:rPr>
             </w:pPr>
@@ -8663,10 +9061,16 @@
             <w:pPr>
               <w:spacing w:after="0"/>
               <w:rPr>
-                <w:rFonts w:asciiTheme="minorBidi" w:hAnsiTheme="minorBidi"/>
+                <w:rFonts w:ascii="Arial" w:hAnsi="Arial" w:cs="Arial"/>
                 <w:szCs w:val="20"/>
               </w:rPr>
             </w:pPr>
+            <w:r>
+              <w:rPr>
+                <w:rFonts w:ascii="Arial" w:hAnsi="Arial" w:cs="Arial"/>
+              </w:rPr>
+              <w:t>It does not prove that the script can run automatically or without errors every time.</w:t>
+            </w:r>
           </w:p>
         </w:tc>
       </w:tr>
@@ -8683,13 +9087,13 @@
             <w:pPr>
               <w:spacing w:after="0"/>
               <w:rPr>
-                <w:rFonts w:asciiTheme="minorBidi" w:hAnsiTheme="minorBidi"/>
+                <w:rFonts w:ascii="Arial" w:hAnsi="Arial" w:cs="Arial"/>
                 <w:szCs w:val="20"/>
               </w:rPr>
             </w:pPr>
             <w:r>
               <w:rPr>
-                <w:rFonts w:asciiTheme="minorBidi" w:hAnsiTheme="minorBidi"/>
+                <w:rFonts w:ascii="Arial" w:hAnsi="Arial" w:cs="Arial"/>
                 <w:szCs w:val="20"/>
               </w:rPr>
               <w:t>Terminal output</w:t>
@@ -8704,10 +9108,16 @@
             <w:pPr>
               <w:spacing w:after="0"/>
               <w:rPr>
-                <w:rFonts w:asciiTheme="minorBidi" w:hAnsiTheme="minorBidi"/>
+                <w:rFonts w:ascii="Arial" w:hAnsi="Arial" w:cs="Arial"/>
                 <w:szCs w:val="20"/>
               </w:rPr>
             </w:pPr>
+            <w:r>
+              <w:rPr>
+                <w:rFonts w:ascii="Arial" w:hAnsi="Arial" w:cs="Arial"/>
+              </w:rPr>
+              <w:t>Shows that the script produced readable information such as the user, directory, date and time.</w:t>
+            </w:r>
           </w:p>
         </w:tc>
         <w:tc>
@@ -8718,10 +9128,16 @@
             <w:pPr>
               <w:spacing w:after="0"/>
               <w:rPr>
-                <w:rFonts w:asciiTheme="minorBidi" w:hAnsiTheme="minorBidi"/>
+                <w:rFonts w:ascii="Arial" w:hAnsi="Arial" w:cs="Arial"/>
                 <w:szCs w:val="20"/>
               </w:rPr>
             </w:pPr>
+            <w:r>
+              <w:rPr>
+                <w:rFonts w:ascii="Arial" w:hAnsi="Arial" w:cs="Arial"/>
+              </w:rPr>
+              <w:t>It does not prove long-term reliability or scheduled automation.</w:t>
+            </w:r>
           </w:p>
         </w:tc>
       </w:tr>
@@ -8738,13 +9154,13 @@
             <w:pPr>
               <w:spacing w:after="0"/>
               <w:rPr>
-                <w:rFonts w:asciiTheme="minorBidi" w:hAnsiTheme="minorBidi"/>
+                <w:rFonts w:ascii="Arial" w:hAnsi="Arial" w:cs="Arial"/>
                 <w:szCs w:val="20"/>
               </w:rPr>
             </w:pPr>
             <w:r>
               <w:rPr>
-                <w:rFonts w:asciiTheme="minorBidi" w:hAnsiTheme="minorBidi"/>
+                <w:rFonts w:ascii="Arial" w:hAnsi="Arial" w:cs="Arial"/>
                 <w:szCs w:val="20"/>
               </w:rPr>
               <w:t>Evidence directory check output</w:t>
@@ -8759,10 +9175,29 @@
             <w:pPr>
               <w:spacing w:after="0"/>
               <w:rPr>
-                <w:rFonts w:asciiTheme="minorBidi" w:hAnsiTheme="minorBidi"/>
+                <w:rFonts w:ascii="Arial" w:hAnsi="Arial" w:cs="Arial"/>
                 <w:szCs w:val="20"/>
               </w:rPr>
             </w:pPr>
+            <w:r>
+              <w:rPr>
+                <w:rFonts w:ascii="Arial" w:hAnsi="Arial" w:cs="Arial"/>
+              </w:rPr>
+              <w:t xml:space="preserve">Shows whether the </w:t>
+            </w:r>
+            <w:r>
+              <w:rPr>
+                <w:rStyle w:val="HTMLCode"/>
+                <w:rFonts w:ascii="Arial" w:eastAsiaTheme="minorEastAsia" w:hAnsi="Arial" w:cs="Arial"/>
+              </w:rPr>
+              <w:t>week9_evidence</w:t>
+            </w:r>
+            <w:r>
+              <w:rPr>
+                <w:rFonts w:ascii="Arial" w:hAnsi="Arial" w:cs="Arial"/>
+              </w:rPr>
+              <w:t xml:space="preserve"> directory existed when the script was run.</w:t>
+            </w:r>
           </w:p>
         </w:tc>
         <w:tc>
@@ -8773,10 +9208,16 @@
             <w:pPr>
               <w:spacing w:after="0"/>
               <w:rPr>
-                <w:rFonts w:asciiTheme="minorBidi" w:hAnsiTheme="minorBidi"/>
+                <w:rFonts w:ascii="Arial" w:hAnsi="Arial" w:cs="Arial"/>
                 <w:szCs w:val="20"/>
               </w:rPr>
             </w:pPr>
+            <w:r>
+              <w:rPr>
+                <w:rFonts w:ascii="Arial" w:hAnsi="Arial" w:cs="Arial"/>
+              </w:rPr>
+              <w:t>It does not prove that the directory will always exist or that its contents are correct.</w:t>
+            </w:r>
           </w:p>
         </w:tc>
       </w:tr>
@@ -8793,13 +9234,13 @@
             <w:pPr>
               <w:spacing w:after="0"/>
               <w:rPr>
-                <w:rFonts w:asciiTheme="minorBidi" w:hAnsiTheme="minorBidi"/>
+                <w:rFonts w:ascii="Arial" w:hAnsi="Arial" w:cs="Arial"/>
                 <w:szCs w:val="20"/>
               </w:rPr>
             </w:pPr>
             <w:r>
               <w:rPr>
-                <w:rFonts w:asciiTheme="minorBidi" w:hAnsiTheme="minorBidi"/>
+                <w:rFonts w:ascii="Arial" w:hAnsi="Arial" w:cs="Arial"/>
                 <w:szCs w:val="20"/>
               </w:rPr>
               <w:t>Repeated sample output</w:t>
@@ -8814,10 +9255,16 @@
             <w:pPr>
               <w:spacing w:after="0"/>
               <w:rPr>
-                <w:rFonts w:asciiTheme="minorBidi" w:hAnsiTheme="minorBidi"/>
+                <w:rFonts w:ascii="Arial" w:hAnsi="Arial" w:cs="Arial"/>
                 <w:szCs w:val="20"/>
               </w:rPr>
             </w:pPr>
+            <w:r>
+              <w:rPr>
+                <w:rFonts w:ascii="Arial" w:hAnsi="Arial" w:cs="Arial"/>
+              </w:rPr>
+              <w:t>Shows that the loop ran three times and displayed a timestamp during each repetition.</w:t>
+            </w:r>
           </w:p>
         </w:tc>
         <w:tc>
@@ -8828,10 +9275,16 @@
             <w:pPr>
               <w:spacing w:after="0"/>
               <w:rPr>
-                <w:rFonts w:asciiTheme="minorBidi" w:hAnsiTheme="minorBidi"/>
+                <w:rFonts w:ascii="Arial" w:hAnsi="Arial" w:cs="Arial"/>
                 <w:szCs w:val="20"/>
               </w:rPr>
             </w:pPr>
+            <w:r>
+              <w:rPr>
+                <w:rFonts w:ascii="Arial" w:hAnsi="Arial" w:cs="Arial"/>
+              </w:rPr>
+              <w:t>It does not prove that the script is scheduled or continuously monitoring the system.</w:t>
+            </w:r>
           </w:p>
         </w:tc>
       </w:tr>
@@ -8848,13 +9301,13 @@
             <w:pPr>
               <w:spacing w:after="0"/>
               <w:rPr>
-                <w:rFonts w:ascii="Consolas" w:hAnsi="Consolas" w:cs="Consolas"/>
+                <w:rFonts w:ascii="Arial" w:hAnsi="Arial" w:cs="Arial"/>
                 <w:szCs w:val="20"/>
               </w:rPr>
             </w:pPr>
             <w:r>
               <w:rPr>
-                <w:rFonts w:ascii="Consolas" w:hAnsi="Consolas" w:cs="Consolas"/>
+                <w:rFonts w:ascii="Arial" w:hAnsi="Arial" w:cs="Arial"/>
                 <w:szCs w:val="20"/>
               </w:rPr>
               <w:t>snapshot_output.txt</w:t>
@@ -8869,10 +9322,16 @@
             <w:pPr>
               <w:spacing w:after="0"/>
               <w:rPr>
-                <w:rFonts w:asciiTheme="minorBidi" w:hAnsiTheme="minorBidi"/>
+                <w:rFonts w:ascii="Arial" w:hAnsi="Arial" w:cs="Arial"/>
                 <w:szCs w:val="20"/>
               </w:rPr>
             </w:pPr>
+            <w:r>
+              <w:rPr>
+                <w:rFonts w:ascii="Arial" w:hAnsi="Arial" w:cs="Arial"/>
+              </w:rPr>
+              <w:t>Shows that the script output was redirected to and saved in a text file.</w:t>
+            </w:r>
           </w:p>
         </w:tc>
         <w:tc>
@@ -8883,10 +9342,16 @@
             <w:pPr>
               <w:spacing w:after="0"/>
               <w:rPr>
-                <w:rFonts w:asciiTheme="minorBidi" w:hAnsiTheme="minorBidi"/>
+                <w:rFonts w:ascii="Arial" w:hAnsi="Arial" w:cs="Arial"/>
                 <w:szCs w:val="20"/>
               </w:rPr>
             </w:pPr>
+            <w:r>
+              <w:rPr>
+                <w:rFonts w:ascii="Arial" w:hAnsi="Arial" w:cs="Arial"/>
+              </w:rPr>
+              <w:t>It does not prove that the output is complete, accurate or created automatically every time.</w:t>
+            </w:r>
           </w:p>
         </w:tc>
       </w:tr>
@@ -8973,7 +9438,7 @@
       <w:pPr>
         <w:spacing w:before="360"/>
         <w:rPr>
-          <w:rFonts w:asciiTheme="minorBidi" w:eastAsia="Calibri" w:hAnsiTheme="minorBidi"/>
+          <w:rFonts w:ascii="Arial" w:eastAsia="Calibri" w:hAnsi="Arial" w:cs="Arial"/>
           <w:b/>
           <w:sz w:val="24"/>
           <w:szCs w:val="24"/>
@@ -8982,7 +9447,7 @@
       </w:pPr>
       <w:r>
         <w:rPr>
-          <w:rFonts w:asciiTheme="minorBidi" w:eastAsia="Calibri" w:hAnsiTheme="minorBidi"/>
+          <w:rFonts w:ascii="Arial" w:eastAsia="Calibri" w:hAnsi="Arial" w:cs="Arial"/>
           <w:b/>
           <w:sz w:val="24"/>
           <w:szCs w:val="24"/>
@@ -8995,13 +9460,13 @@
       <w:pPr>
         <w:spacing w:after="120"/>
         <w:rPr>
-          <w:rFonts w:asciiTheme="minorBidi" w:hAnsiTheme="minorBidi"/>
+          <w:rFonts w:ascii="Arial" w:hAnsi="Arial" w:cs="Arial"/>
           <w:sz w:val="22"/>
         </w:rPr>
       </w:pPr>
       <w:r>
         <w:rPr>
-          <w:rFonts w:asciiTheme="minorBidi" w:hAnsiTheme="minorBidi"/>
+          <w:rFonts w:ascii="Arial" w:hAnsi="Arial" w:cs="Arial"/>
           <w:sz w:val="22"/>
         </w:rPr>
         <w:t>Use the review questions below to identify the main Bash scripting constructs used in this lab. This connects the practical work to the Week 9 lecture language.</w:t>
@@ -9011,7 +9476,7 @@
       <w:pPr>
         <w:spacing w:before="240"/>
         <w:rPr>
-          <w:rFonts w:asciiTheme="minorBidi" w:eastAsia="Calibri" w:hAnsiTheme="minorBidi"/>
+          <w:rFonts w:ascii="Arial" w:eastAsia="Calibri" w:hAnsi="Arial" w:cs="Arial"/>
           <w:b/>
           <w:color w:val="1F2933"/>
           <w:sz w:val="22"/>
@@ -9020,7 +9485,7 @@
       </w:pPr>
       <w:r>
         <w:rPr>
-          <w:rFonts w:asciiTheme="minorBidi" w:eastAsia="Calibri" w:hAnsiTheme="minorBidi"/>
+          <w:rFonts w:ascii="Arial" w:eastAsia="Calibri" w:hAnsi="Arial" w:cs="Arial"/>
           <w:b/>
           <w:color w:val="1F2933"/>
           <w:sz w:val="22"/>
@@ -9033,6 +9498,787 @@
       <w:pPr>
         <w:spacing w:before="200" w:after="120"/>
         <w:rPr>
+          <w:rFonts w:ascii="Arial" w:eastAsia="Arial" w:hAnsi="Arial" w:cs="Arial"/>
+          <w:b/>
+          <w:sz w:val="22"/>
+          <w:lang w:val="en-GB"/>
+        </w:rPr>
+      </w:pPr>
+      <w:r>
+        <w:rPr>
+          <w:rFonts w:ascii="Arial" w:eastAsia="Arial" w:hAnsi="Arial" w:cs="Arial"/>
+          <w:b/>
+          <w:sz w:val="22"/>
+          <w:lang w:val="en-GB"/>
+        </w:rPr>
+        <w:t>Which line in the final script defines a variable?</w:t>
+      </w:r>
+    </w:p>
+    <w:p>
+      <w:pPr>
+        <w:spacing w:after="20"/>
+        <w:rPr>
+          <w:rFonts w:ascii="Arial" w:eastAsia="Arial" w:hAnsi="Arial" w:cs="Arial"/>
+          <w:b/>
+          <w:sz w:val="22"/>
+          <w:lang w:val="en-GB"/>
+        </w:rPr>
+      </w:pPr>
+      <w:r>
+        <w:rPr>
+          <w:rFonts w:ascii="Arial" w:eastAsia="Arial" w:hAnsi="Arial" w:cs="Arial"/>
+          <w:color w:val="1F2933"/>
+          <w:sz w:val="21"/>
+          <w:lang w:val="en-GB"/>
+        </w:rPr>
+        <w:t xml:space="preserve">Answer: </w:t>
+      </w:r>
+      <w:r>
+        <w:rPr>
+          <w:rStyle w:val="HTMLCode"/>
+          <w:rFonts w:ascii="Arial" w:eastAsiaTheme="minorEastAsia" w:hAnsi="Arial" w:cs="Arial"/>
+        </w:rPr>
+        <w:t>REPORT_TITLE="System Snapshot"</w:t>
+      </w:r>
+      <w:r>
+        <w:rPr>
+          <w:rFonts w:ascii="Arial" w:hAnsi="Arial" w:cs="Arial"/>
+        </w:rPr>
+        <w:br/>
+        <w:t xml:space="preserve">Another example is: </w:t>
+      </w:r>
+      <w:r>
+        <w:rPr>
+          <w:rStyle w:val="HTMLCode"/>
+          <w:rFonts w:ascii="Arial" w:eastAsiaTheme="minorEastAsia" w:hAnsi="Arial" w:cs="Arial"/>
+        </w:rPr>
+        <w:t>CHECK_DIR="week9_evidence"</w:t>
+      </w:r>
+      <w:r>
+        <w:rPr>
+          <w:rFonts w:ascii="Arial" w:eastAsia="Arial" w:hAnsi="Arial" w:cs="Arial"/>
+          <w:b/>
+          <w:sz w:val="22"/>
+          <w:lang w:val="en-GB"/>
+        </w:rPr>
+        <w:t xml:space="preserve"> </w:t>
+      </w:r>
+    </w:p>
+    <w:p>
+      <w:pPr>
+        <w:spacing w:after="20"/>
+        <w:rPr>
+          <w:rFonts w:ascii="Arial" w:eastAsia="Arial" w:hAnsi="Arial" w:cs="Arial"/>
+          <w:b/>
+          <w:sz w:val="22"/>
+          <w:lang w:val="en-GB"/>
+        </w:rPr>
+      </w:pPr>
+    </w:p>
+    <w:p>
+      <w:pPr>
+        <w:spacing w:after="20"/>
+        <w:rPr>
+          <w:rFonts w:ascii="Arial" w:eastAsia="Arial" w:hAnsi="Arial" w:cs="Arial"/>
+          <w:b/>
+          <w:sz w:val="22"/>
+          <w:lang w:val="en-GB"/>
+        </w:rPr>
+      </w:pPr>
+      <w:r>
+        <w:rPr>
+          <w:rFonts w:ascii="Arial" w:eastAsia="Arial" w:hAnsi="Arial" w:cs="Arial"/>
+          <w:b/>
+          <w:sz w:val="22"/>
+          <w:lang w:val="en-GB"/>
+        </w:rPr>
+        <w:t>Which lines define the user-defined function?</w:t>
+      </w:r>
+    </w:p>
+    <w:p>
+      <w:pPr>
+        <w:spacing w:after="20"/>
+        <w:rPr>
+          <w:rFonts w:ascii="Arial" w:eastAsia="Arial" w:hAnsi="Arial" w:cs="Arial"/>
+          <w:color w:val="1F2933"/>
+          <w:sz w:val="21"/>
+          <w:lang w:val="en-GB"/>
+        </w:rPr>
+      </w:pPr>
+      <w:r>
+        <w:rPr>
+          <w:rFonts w:ascii="Arial" w:eastAsia="Arial" w:hAnsi="Arial" w:cs="Arial"/>
+          <w:color w:val="1F2933"/>
+          <w:sz w:val="21"/>
+          <w:lang w:val="en-GB"/>
+        </w:rPr>
+        <w:t xml:space="preserve">Answer: </w:t>
+      </w:r>
+      <w:proofErr w:type="spellStart"/>
+      <w:r>
+        <w:rPr>
+          <w:rFonts w:ascii="Arial" w:eastAsia="Arial" w:hAnsi="Arial" w:cs="Arial"/>
+          <w:color w:val="1F2933"/>
+          <w:sz w:val="21"/>
+          <w:lang w:val="en-GB"/>
+        </w:rPr>
+        <w:t>print_</w:t>
+      </w:r>
+      <w:proofErr w:type="gramStart"/>
+      <w:r>
+        <w:rPr>
+          <w:rFonts w:ascii="Arial" w:eastAsia="Arial" w:hAnsi="Arial" w:cs="Arial"/>
+          <w:color w:val="1F2933"/>
+          <w:sz w:val="21"/>
+          <w:lang w:val="en-GB"/>
+        </w:rPr>
+        <w:t>section</w:t>
+      </w:r>
+      <w:proofErr w:type="spellEnd"/>
+      <w:r>
+        <w:rPr>
+          <w:rFonts w:ascii="Arial" w:eastAsia="Arial" w:hAnsi="Arial" w:cs="Arial"/>
+          <w:color w:val="1F2933"/>
+          <w:sz w:val="21"/>
+          <w:lang w:val="en-GB"/>
+        </w:rPr>
+        <w:t>(</w:t>
+      </w:r>
+      <w:proofErr w:type="gramEnd"/>
+      <w:r>
+        <w:rPr>
+          <w:rFonts w:ascii="Arial" w:eastAsia="Arial" w:hAnsi="Arial" w:cs="Arial"/>
+          <w:color w:val="1F2933"/>
+          <w:sz w:val="21"/>
+          <w:lang w:val="en-GB"/>
+        </w:rPr>
+        <w:t>) {</w:t>
+      </w:r>
+    </w:p>
+    <w:p>
+      <w:pPr>
+        <w:spacing w:after="20"/>
+        <w:rPr>
+          <w:rFonts w:ascii="Arial" w:eastAsia="Arial" w:hAnsi="Arial" w:cs="Arial"/>
+          <w:color w:val="1F2933"/>
+          <w:sz w:val="21"/>
+          <w:lang w:val="en-GB"/>
+        </w:rPr>
+      </w:pPr>
+      <w:r>
+        <w:rPr>
+          <w:rFonts w:ascii="Arial" w:eastAsia="Arial" w:hAnsi="Arial" w:cs="Arial"/>
+          <w:color w:val="1F2933"/>
+          <w:sz w:val="21"/>
+          <w:lang w:val="en-GB"/>
+        </w:rPr>
+        <w:t xml:space="preserve">    echo "------------------------------"</w:t>
+      </w:r>
+    </w:p>
+    <w:p>
+      <w:pPr>
+        <w:spacing w:after="20"/>
+        <w:rPr>
+          <w:rFonts w:ascii="Arial" w:eastAsia="Arial" w:hAnsi="Arial" w:cs="Arial"/>
+          <w:color w:val="1F2933"/>
+          <w:sz w:val="21"/>
+          <w:lang w:val="en-GB"/>
+        </w:rPr>
+      </w:pPr>
+      <w:r>
+        <w:rPr>
+          <w:rFonts w:ascii="Arial" w:eastAsia="Arial" w:hAnsi="Arial" w:cs="Arial"/>
+          <w:color w:val="1F2933"/>
+          <w:sz w:val="21"/>
+          <w:lang w:val="en-GB"/>
+        </w:rPr>
+        <w:t xml:space="preserve">    echo "$1"</w:t>
+      </w:r>
+    </w:p>
+    <w:p>
+      <w:pPr>
+        <w:spacing w:after="20"/>
+        <w:rPr>
+          <w:rFonts w:ascii="Arial" w:eastAsia="Arial" w:hAnsi="Arial" w:cs="Arial"/>
+          <w:color w:val="1F2933"/>
+          <w:sz w:val="21"/>
+          <w:lang w:val="en-GB"/>
+        </w:rPr>
+      </w:pPr>
+      <w:r>
+        <w:rPr>
+          <w:rFonts w:ascii="Arial" w:eastAsia="Arial" w:hAnsi="Arial" w:cs="Arial"/>
+          <w:color w:val="1F2933"/>
+          <w:sz w:val="21"/>
+          <w:lang w:val="en-GB"/>
+        </w:rPr>
+        <w:t xml:space="preserve">    echo "------------------------------"</w:t>
+      </w:r>
+    </w:p>
+    <w:p>
+      <w:pPr>
+        <w:spacing w:after="20"/>
+        <w:rPr>
+          <w:rFonts w:ascii="Arial" w:eastAsia="Arial" w:hAnsi="Arial" w:cs="Arial"/>
+          <w:b/>
+          <w:color w:val="1F2933"/>
+          <w:sz w:val="21"/>
+          <w:lang w:val="en-GB"/>
+        </w:rPr>
+      </w:pPr>
+      <w:r>
+        <w:rPr>
+          <w:rFonts w:ascii="Arial" w:eastAsia="Arial" w:hAnsi="Arial" w:cs="Arial"/>
+          <w:color w:val="1F2933"/>
+          <w:sz w:val="21"/>
+          <w:lang w:val="en-GB"/>
+        </w:rPr>
+        <w:t>}</w:t>
+      </w:r>
+      <w:r>
+        <w:rPr>
+          <w:rFonts w:ascii="Arial" w:eastAsia="Arial" w:hAnsi="Arial" w:cs="Arial"/>
+          <w:b/>
+          <w:color w:val="1F2933"/>
+          <w:sz w:val="21"/>
+          <w:lang w:val="en-GB"/>
+        </w:rPr>
+        <w:t xml:space="preserve"> </w:t>
+      </w:r>
+    </w:p>
+    <w:p>
+      <w:pPr>
+        <w:spacing w:after="20"/>
+        <w:rPr>
+          <w:rFonts w:ascii="Arial" w:eastAsia="Arial" w:hAnsi="Arial" w:cs="Arial"/>
+          <w:b/>
+          <w:color w:val="1F2933"/>
+          <w:sz w:val="21"/>
+          <w:lang w:val="en-GB"/>
+        </w:rPr>
+      </w:pPr>
+    </w:p>
+    <w:p>
+      <w:pPr>
+        <w:spacing w:after="20"/>
+        <w:rPr>
+          <w:rFonts w:ascii="Arial" w:eastAsia="Arial" w:hAnsi="Arial" w:cs="Arial"/>
+          <w:b/>
+          <w:sz w:val="22"/>
+          <w:lang w:val="en-GB"/>
+        </w:rPr>
+      </w:pPr>
+      <w:r>
+        <w:rPr>
+          <w:rFonts w:ascii="Arial" w:eastAsia="Arial" w:hAnsi="Arial" w:cs="Arial"/>
+          <w:b/>
+          <w:sz w:val="22"/>
+          <w:lang w:val="en-GB"/>
+        </w:rPr>
+        <w:t>Which lines call the function?</w:t>
+      </w:r>
+    </w:p>
+    <w:p>
+      <w:pPr>
+        <w:spacing w:after="20"/>
+        <w:rPr>
+          <w:rFonts w:ascii="Arial" w:eastAsia="Arial" w:hAnsi="Arial" w:cs="Arial"/>
+          <w:color w:val="1F2933"/>
+          <w:sz w:val="21"/>
+          <w:lang w:val="en-GB"/>
+        </w:rPr>
+      </w:pPr>
+      <w:r>
+        <w:rPr>
+          <w:rFonts w:ascii="Arial" w:eastAsia="Arial" w:hAnsi="Arial" w:cs="Arial"/>
+          <w:color w:val="1F2933"/>
+          <w:sz w:val="21"/>
+          <w:lang w:val="en-GB"/>
+        </w:rPr>
+        <w:t xml:space="preserve">Answer: </w:t>
+      </w:r>
+      <w:proofErr w:type="spellStart"/>
+      <w:r>
+        <w:rPr>
+          <w:rFonts w:ascii="Arial" w:eastAsia="Arial" w:hAnsi="Arial" w:cs="Arial"/>
+          <w:color w:val="1F2933"/>
+          <w:sz w:val="21"/>
+          <w:lang w:val="en-GB"/>
+        </w:rPr>
+        <w:t>print_section</w:t>
+      </w:r>
+      <w:proofErr w:type="spellEnd"/>
+      <w:r>
+        <w:rPr>
+          <w:rFonts w:ascii="Arial" w:eastAsia="Arial" w:hAnsi="Arial" w:cs="Arial"/>
+          <w:color w:val="1F2933"/>
+          <w:sz w:val="21"/>
+          <w:lang w:val="en-GB"/>
+        </w:rPr>
+        <w:t xml:space="preserve"> "$REPORT_TITLE"</w:t>
+      </w:r>
+    </w:p>
+    <w:p>
+      <w:pPr>
+        <w:spacing w:after="20"/>
+        <w:rPr>
+          <w:rFonts w:ascii="Arial" w:eastAsia="Arial" w:hAnsi="Arial" w:cs="Arial"/>
+          <w:color w:val="1F2933"/>
+          <w:sz w:val="21"/>
+          <w:lang w:val="en-GB"/>
+        </w:rPr>
+      </w:pPr>
+      <w:proofErr w:type="spellStart"/>
+      <w:r>
+        <w:rPr>
+          <w:rFonts w:ascii="Arial" w:eastAsia="Arial" w:hAnsi="Arial" w:cs="Arial"/>
+          <w:color w:val="1F2933"/>
+          <w:sz w:val="21"/>
+          <w:lang w:val="en-GB"/>
+        </w:rPr>
+        <w:t>print_section</w:t>
+      </w:r>
+      <w:proofErr w:type="spellEnd"/>
+      <w:r>
+        <w:rPr>
+          <w:rFonts w:ascii="Arial" w:eastAsia="Arial" w:hAnsi="Arial" w:cs="Arial"/>
+          <w:color w:val="1F2933"/>
+          <w:sz w:val="21"/>
+          <w:lang w:val="en-GB"/>
+        </w:rPr>
+        <w:t xml:space="preserve"> "Current user"</w:t>
+      </w:r>
+    </w:p>
+    <w:p>
+      <w:pPr>
+        <w:spacing w:after="20"/>
+        <w:rPr>
+          <w:rFonts w:ascii="Arial" w:eastAsia="Arial" w:hAnsi="Arial" w:cs="Arial"/>
+          <w:color w:val="1F2933"/>
+          <w:sz w:val="21"/>
+          <w:lang w:val="en-GB"/>
+        </w:rPr>
+      </w:pPr>
+      <w:proofErr w:type="spellStart"/>
+      <w:r>
+        <w:rPr>
+          <w:rFonts w:ascii="Arial" w:eastAsia="Arial" w:hAnsi="Arial" w:cs="Arial"/>
+          <w:color w:val="1F2933"/>
+          <w:sz w:val="21"/>
+          <w:lang w:val="en-GB"/>
+        </w:rPr>
+        <w:t>print_section</w:t>
+      </w:r>
+      <w:proofErr w:type="spellEnd"/>
+      <w:r>
+        <w:rPr>
+          <w:rFonts w:ascii="Arial" w:eastAsia="Arial" w:hAnsi="Arial" w:cs="Arial"/>
+          <w:color w:val="1F2933"/>
+          <w:sz w:val="21"/>
+          <w:lang w:val="en-GB"/>
+        </w:rPr>
+        <w:t xml:space="preserve"> "Current directory"</w:t>
+      </w:r>
+    </w:p>
+    <w:p>
+      <w:pPr>
+        <w:spacing w:after="20"/>
+        <w:rPr>
+          <w:rFonts w:ascii="Arial" w:eastAsia="Arial" w:hAnsi="Arial" w:cs="Arial"/>
+          <w:color w:val="1F2933"/>
+          <w:sz w:val="21"/>
+          <w:lang w:val="en-GB"/>
+        </w:rPr>
+      </w:pPr>
+      <w:proofErr w:type="spellStart"/>
+      <w:r>
+        <w:rPr>
+          <w:rFonts w:ascii="Arial" w:eastAsia="Arial" w:hAnsi="Arial" w:cs="Arial"/>
+          <w:color w:val="1F2933"/>
+          <w:sz w:val="21"/>
+          <w:lang w:val="en-GB"/>
+        </w:rPr>
+        <w:lastRenderedPageBreak/>
+        <w:t>print_section</w:t>
+      </w:r>
+      <w:proofErr w:type="spellEnd"/>
+      <w:r>
+        <w:rPr>
+          <w:rFonts w:ascii="Arial" w:eastAsia="Arial" w:hAnsi="Arial" w:cs="Arial"/>
+          <w:color w:val="1F2933"/>
+          <w:sz w:val="21"/>
+          <w:lang w:val="en-GB"/>
+        </w:rPr>
+        <w:t xml:space="preserve"> "Date and time"</w:t>
+      </w:r>
+    </w:p>
+    <w:p>
+      <w:pPr>
+        <w:spacing w:after="20"/>
+        <w:rPr>
+          <w:rFonts w:ascii="Arial" w:eastAsia="Arial" w:hAnsi="Arial" w:cs="Arial"/>
+          <w:color w:val="1F2933"/>
+          <w:sz w:val="21"/>
+          <w:lang w:val="en-GB"/>
+        </w:rPr>
+      </w:pPr>
+      <w:proofErr w:type="spellStart"/>
+      <w:r>
+        <w:rPr>
+          <w:rFonts w:ascii="Arial" w:eastAsia="Arial" w:hAnsi="Arial" w:cs="Arial"/>
+          <w:color w:val="1F2933"/>
+          <w:sz w:val="21"/>
+          <w:lang w:val="en-GB"/>
+        </w:rPr>
+        <w:t>print_section</w:t>
+      </w:r>
+      <w:proofErr w:type="spellEnd"/>
+      <w:r>
+        <w:rPr>
+          <w:rFonts w:ascii="Arial" w:eastAsia="Arial" w:hAnsi="Arial" w:cs="Arial"/>
+          <w:color w:val="1F2933"/>
+          <w:sz w:val="21"/>
+          <w:lang w:val="en-GB"/>
+        </w:rPr>
+        <w:t xml:space="preserve"> "Evidence directory check"</w:t>
+      </w:r>
+    </w:p>
+    <w:p>
+      <w:pPr>
+        <w:spacing w:after="20"/>
+        <w:rPr>
+          <w:rFonts w:ascii="Arial" w:eastAsia="Arial" w:hAnsi="Arial" w:cs="Arial"/>
+          <w:b/>
+          <w:color w:val="1F2933"/>
+          <w:sz w:val="21"/>
+          <w:lang w:val="en-GB"/>
+        </w:rPr>
+      </w:pPr>
+      <w:proofErr w:type="spellStart"/>
+      <w:r>
+        <w:rPr>
+          <w:rFonts w:ascii="Arial" w:eastAsia="Arial" w:hAnsi="Arial" w:cs="Arial"/>
+          <w:color w:val="1F2933"/>
+          <w:sz w:val="21"/>
+          <w:lang w:val="en-GB"/>
+        </w:rPr>
+        <w:t>print_section</w:t>
+      </w:r>
+      <w:proofErr w:type="spellEnd"/>
+      <w:r>
+        <w:rPr>
+          <w:rFonts w:ascii="Arial" w:eastAsia="Arial" w:hAnsi="Arial" w:cs="Arial"/>
+          <w:color w:val="1F2933"/>
+          <w:sz w:val="21"/>
+          <w:lang w:val="en-GB"/>
+        </w:rPr>
+        <w:t xml:space="preserve"> "Repeated samples"</w:t>
+      </w:r>
+      <w:r>
+        <w:rPr>
+          <w:rFonts w:ascii="Arial" w:eastAsia="Arial" w:hAnsi="Arial" w:cs="Arial"/>
+          <w:b/>
+          <w:color w:val="1F2933"/>
+          <w:sz w:val="21"/>
+          <w:lang w:val="en-GB"/>
+        </w:rPr>
+        <w:t xml:space="preserve"> </w:t>
+      </w:r>
+    </w:p>
+    <w:p>
+      <w:pPr>
+        <w:spacing w:after="20"/>
+        <w:rPr>
+          <w:rFonts w:ascii="Arial" w:eastAsia="Arial" w:hAnsi="Arial" w:cs="Arial"/>
+          <w:b/>
+          <w:color w:val="1F2933"/>
+          <w:sz w:val="21"/>
+          <w:lang w:val="en-GB"/>
+        </w:rPr>
+      </w:pPr>
+    </w:p>
+    <w:p>
+      <w:pPr>
+        <w:spacing w:after="20"/>
+        <w:rPr>
+          <w:rFonts w:ascii="Arial" w:eastAsia="Arial" w:hAnsi="Arial" w:cs="Arial"/>
+          <w:b/>
+          <w:sz w:val="22"/>
+          <w:lang w:val="en-GB"/>
+        </w:rPr>
+      </w:pPr>
+      <w:r>
+        <w:rPr>
+          <w:rFonts w:ascii="Arial" w:eastAsia="Arial" w:hAnsi="Arial" w:cs="Arial"/>
+          <w:b/>
+          <w:sz w:val="22"/>
+          <w:lang w:val="en-GB"/>
+        </w:rPr>
+        <w:t>Which lines form the conditional statement?</w:t>
+      </w:r>
+    </w:p>
+    <w:p>
+      <w:pPr>
+        <w:spacing w:after="20"/>
+        <w:rPr>
+          <w:rFonts w:ascii="Arial" w:eastAsia="Arial" w:hAnsi="Arial" w:cs="Arial"/>
+          <w:color w:val="1F2933"/>
+          <w:sz w:val="21"/>
+          <w:lang w:val="en-GB"/>
+        </w:rPr>
+      </w:pPr>
+      <w:r>
+        <w:rPr>
+          <w:rFonts w:ascii="Arial" w:eastAsia="Arial" w:hAnsi="Arial" w:cs="Arial"/>
+          <w:color w:val="1F2933"/>
+          <w:sz w:val="21"/>
+          <w:lang w:val="en-GB"/>
+        </w:rPr>
+        <w:t xml:space="preserve">Answer: </w:t>
+      </w:r>
+      <w:r>
+        <w:rPr>
+          <w:rFonts w:ascii="Arial" w:eastAsia="Arial" w:hAnsi="Arial" w:cs="Arial"/>
+          <w:color w:val="1F2933"/>
+          <w:sz w:val="21"/>
+          <w:lang w:val="en-GB"/>
+        </w:rPr>
+        <w:t>if [ -d "$CHECK_DIR</w:t>
+      </w:r>
+      <w:proofErr w:type="gramStart"/>
+      <w:r>
+        <w:rPr>
+          <w:rFonts w:ascii="Arial" w:eastAsia="Arial" w:hAnsi="Arial" w:cs="Arial"/>
+          <w:color w:val="1F2933"/>
+          <w:sz w:val="21"/>
+          <w:lang w:val="en-GB"/>
+        </w:rPr>
+        <w:t>" ]</w:t>
+      </w:r>
+      <w:proofErr w:type="gramEnd"/>
+      <w:r>
+        <w:rPr>
+          <w:rFonts w:ascii="Arial" w:eastAsia="Arial" w:hAnsi="Arial" w:cs="Arial"/>
+          <w:color w:val="1F2933"/>
+          <w:sz w:val="21"/>
+          <w:lang w:val="en-GB"/>
+        </w:rPr>
+        <w:t>; then</w:t>
+      </w:r>
+    </w:p>
+    <w:p>
+      <w:pPr>
+        <w:spacing w:after="20"/>
+        <w:rPr>
+          <w:rFonts w:ascii="Arial" w:eastAsia="Arial" w:hAnsi="Arial" w:cs="Arial"/>
+          <w:color w:val="1F2933"/>
+          <w:sz w:val="21"/>
+          <w:lang w:val="en-GB"/>
+        </w:rPr>
+      </w:pPr>
+      <w:r>
+        <w:rPr>
+          <w:rFonts w:ascii="Arial" w:eastAsia="Arial" w:hAnsi="Arial" w:cs="Arial"/>
+          <w:color w:val="1F2933"/>
+          <w:sz w:val="21"/>
+          <w:lang w:val="en-GB"/>
+        </w:rPr>
+        <w:t xml:space="preserve">    echo "Evidence directory found."</w:t>
+      </w:r>
+    </w:p>
+    <w:p>
+      <w:pPr>
+        <w:spacing w:after="20"/>
+        <w:rPr>
+          <w:rFonts w:ascii="Arial" w:eastAsia="Arial" w:hAnsi="Arial" w:cs="Arial"/>
+          <w:color w:val="1F2933"/>
+          <w:sz w:val="21"/>
+          <w:lang w:val="en-GB"/>
+        </w:rPr>
+      </w:pPr>
+      <w:r>
+        <w:rPr>
+          <w:rFonts w:ascii="Arial" w:eastAsia="Arial" w:hAnsi="Arial" w:cs="Arial"/>
+          <w:color w:val="1F2933"/>
+          <w:sz w:val="21"/>
+          <w:lang w:val="en-GB"/>
+        </w:rPr>
+        <w:t>else</w:t>
+      </w:r>
+    </w:p>
+    <w:p>
+      <w:pPr>
+        <w:spacing w:after="20"/>
+        <w:rPr>
+          <w:rFonts w:ascii="Arial" w:eastAsia="Arial" w:hAnsi="Arial" w:cs="Arial"/>
+          <w:color w:val="1F2933"/>
+          <w:sz w:val="21"/>
+          <w:lang w:val="en-GB"/>
+        </w:rPr>
+      </w:pPr>
+      <w:r>
+        <w:rPr>
+          <w:rFonts w:ascii="Arial" w:eastAsia="Arial" w:hAnsi="Arial" w:cs="Arial"/>
+          <w:color w:val="1F2933"/>
+          <w:sz w:val="21"/>
+          <w:lang w:val="en-GB"/>
+        </w:rPr>
+        <w:t xml:space="preserve">    echo "Evidence directory not found."</w:t>
+      </w:r>
+    </w:p>
+    <w:p>
+      <w:pPr>
+        <w:spacing w:after="20"/>
+        <w:rPr>
+          <w:rFonts w:ascii="Arial" w:eastAsia="Arial" w:hAnsi="Arial" w:cs="Arial"/>
+          <w:color w:val="1F2933"/>
+          <w:sz w:val="21"/>
+          <w:lang w:val="en-GB"/>
+        </w:rPr>
+      </w:pPr>
+      <w:r>
+        <w:rPr>
+          <w:rFonts w:ascii="Arial" w:eastAsia="Arial" w:hAnsi="Arial" w:cs="Arial"/>
+          <w:color w:val="1F2933"/>
+          <w:sz w:val="21"/>
+          <w:lang w:val="en-GB"/>
+        </w:rPr>
+        <w:t>fi</w:t>
+      </w:r>
+    </w:p>
+    <w:p>
+      <w:pPr>
+        <w:spacing w:before="200" w:after="120"/>
+        <w:rPr>
+          <w:rFonts w:ascii="Arial" w:eastAsia="Arial" w:hAnsi="Arial" w:cs="Arial"/>
+          <w:b/>
+          <w:sz w:val="22"/>
+          <w:lang w:val="en-GB"/>
+        </w:rPr>
+      </w:pPr>
+      <w:r>
+        <w:rPr>
+          <w:rFonts w:ascii="Arial" w:eastAsia="Arial" w:hAnsi="Arial" w:cs="Arial"/>
+          <w:b/>
+          <w:sz w:val="22"/>
+          <w:lang w:val="en-GB"/>
+        </w:rPr>
+        <w:t>Which lines form the loop?</w:t>
+      </w:r>
+    </w:p>
+    <w:p>
+      <w:pPr>
+        <w:spacing w:after="20"/>
+        <w:rPr>
+          <w:rFonts w:ascii="Arial" w:eastAsia="Arial" w:hAnsi="Arial" w:cs="Arial"/>
+          <w:color w:val="1F2933"/>
+          <w:sz w:val="21"/>
+          <w:lang w:val="en-GB"/>
+        </w:rPr>
+      </w:pPr>
+      <w:r>
+        <w:rPr>
+          <w:rFonts w:ascii="Arial" w:eastAsia="Arial" w:hAnsi="Arial" w:cs="Arial"/>
+          <w:color w:val="1F2933"/>
+          <w:sz w:val="21"/>
+          <w:lang w:val="en-GB"/>
+        </w:rPr>
+        <w:t xml:space="preserve">Answer: </w:t>
+      </w:r>
+      <w:r>
+        <w:rPr>
+          <w:rFonts w:ascii="Arial" w:eastAsia="Arial" w:hAnsi="Arial" w:cs="Arial"/>
+          <w:color w:val="1F2933"/>
+          <w:sz w:val="21"/>
+          <w:lang w:val="en-GB"/>
+        </w:rPr>
+        <w:t>for sample in 1 2 3</w:t>
+      </w:r>
+    </w:p>
+    <w:p>
+      <w:pPr>
+        <w:spacing w:after="20"/>
+        <w:rPr>
+          <w:rFonts w:ascii="Arial" w:eastAsia="Arial" w:hAnsi="Arial" w:cs="Arial"/>
+          <w:color w:val="1F2933"/>
+          <w:sz w:val="21"/>
+          <w:lang w:val="en-GB"/>
+        </w:rPr>
+      </w:pPr>
+      <w:r>
+        <w:rPr>
+          <w:rFonts w:ascii="Arial" w:eastAsia="Arial" w:hAnsi="Arial" w:cs="Arial"/>
+          <w:color w:val="1F2933"/>
+          <w:sz w:val="21"/>
+          <w:lang w:val="en-GB"/>
+        </w:rPr>
+        <w:t>do</w:t>
+      </w:r>
+    </w:p>
+    <w:p>
+      <w:pPr>
+        <w:spacing w:after="20"/>
+        <w:rPr>
+          <w:rFonts w:ascii="Arial" w:eastAsia="Arial" w:hAnsi="Arial" w:cs="Arial"/>
+          <w:color w:val="1F2933"/>
+          <w:sz w:val="21"/>
+          <w:lang w:val="en-GB"/>
+        </w:rPr>
+      </w:pPr>
+      <w:r>
+        <w:rPr>
+          <w:rFonts w:ascii="Arial" w:eastAsia="Arial" w:hAnsi="Arial" w:cs="Arial"/>
+          <w:color w:val="1F2933"/>
+          <w:sz w:val="21"/>
+          <w:lang w:val="en-GB"/>
+        </w:rPr>
+        <w:t xml:space="preserve">    echo "Sample $sample captured"</w:t>
+      </w:r>
+    </w:p>
+    <w:p>
+      <w:pPr>
+        <w:spacing w:after="20"/>
+        <w:rPr>
+          <w:rFonts w:ascii="Arial" w:eastAsia="Arial" w:hAnsi="Arial" w:cs="Arial"/>
+          <w:color w:val="1F2933"/>
+          <w:sz w:val="21"/>
+          <w:lang w:val="en-GB"/>
+        </w:rPr>
+      </w:pPr>
+      <w:r>
+        <w:rPr>
+          <w:rFonts w:ascii="Arial" w:eastAsia="Arial" w:hAnsi="Arial" w:cs="Arial"/>
+          <w:color w:val="1F2933"/>
+          <w:sz w:val="21"/>
+          <w:lang w:val="en-GB"/>
+        </w:rPr>
+        <w:t xml:space="preserve">    date</w:t>
+      </w:r>
+    </w:p>
+    <w:p>
+      <w:pPr>
+        <w:spacing w:after="20"/>
+        <w:rPr>
+          <w:rFonts w:ascii="Arial" w:eastAsia="Arial" w:hAnsi="Arial" w:cs="Arial"/>
+          <w:color w:val="1F2933"/>
+          <w:sz w:val="21"/>
+          <w:lang w:val="en-GB"/>
+        </w:rPr>
+      </w:pPr>
+      <w:r>
+        <w:rPr>
+          <w:rFonts w:ascii="Arial" w:eastAsia="Arial" w:hAnsi="Arial" w:cs="Arial"/>
+          <w:color w:val="1F2933"/>
+          <w:sz w:val="21"/>
+          <w:lang w:val="en-GB"/>
+        </w:rPr>
+        <w:t>done</w:t>
+      </w:r>
+    </w:p>
+    <w:p>
+      <w:pPr>
+        <w:spacing w:before="200" w:after="120"/>
+        <w:rPr>
           <w:rFonts w:asciiTheme="minorBidi" w:eastAsia="Arial" w:hAnsiTheme="minorBidi"/>
           <w:b/>
           <w:sz w:val="22"/>
@@ -9046,14 +10292,14 @@
           <w:sz w:val="22"/>
           <w:lang w:val="en-GB"/>
         </w:rPr>
-        <w:t>Which line in the final script defines a variable?</w:t>
+        <w:t>Which command captured the script output into a text file?</w:t>
       </w:r>
     </w:p>
     <w:p>
       <w:pPr>
         <w:spacing w:after="20"/>
         <w:rPr>
-          <w:rFonts w:ascii="Arial" w:eastAsia="Arial" w:hAnsi="Arial"/>
+          <w:rFonts w:ascii="Arial" w:eastAsia="Arial" w:hAnsi="Arial" w:cs="Arial"/>
           <w:color w:val="1F2933"/>
           <w:sz w:val="21"/>
           <w:lang w:val="en-GB"/>
@@ -9061,12 +10307,21 @@
       </w:pPr>
       <w:r>
         <w:rPr>
-          <w:rFonts w:ascii="Arial" w:eastAsia="Arial" w:hAnsi="Arial"/>
+          <w:rFonts w:ascii="Arial" w:eastAsia="Arial" w:hAnsi="Arial" w:cs="Arial"/>
           <w:color w:val="1F2933"/>
           <w:sz w:val="21"/>
           <w:lang w:val="en-GB"/>
         </w:rPr>
-        <w:t>Answer: _____________________________________________________________________________</w:t>
+        <w:t xml:space="preserve">Answer: </w:t>
+      </w:r>
+      <w:r>
+        <w:rPr>
+          <w:rFonts w:ascii="Arial" w:eastAsia="Arial" w:hAnsi="Arial" w:cs="Arial"/>
+          <w:color w:val="1F2933"/>
+          <w:sz w:val="21"/>
+          <w:lang w:val="en-GB"/>
+        </w:rPr>
+        <w:t>bash system_snapshot.sh &gt; snapshot_output.txt</w:t>
       </w:r>
     </w:p>
     <w:p>
@@ -9086,14 +10341,14 @@
           <w:sz w:val="22"/>
           <w:lang w:val="en-GB"/>
         </w:rPr>
-        <w:t>Which lines define the user-defined function?</w:t>
+        <w:t>What would be unsafe to claim from this lab evidence alone?</w:t>
       </w:r>
     </w:p>
     <w:p>
       <w:pPr>
         <w:spacing w:after="20"/>
         <w:rPr>
-          <w:rFonts w:ascii="Arial" w:eastAsia="Arial" w:hAnsi="Arial"/>
+          <w:rFonts w:ascii="Arial" w:eastAsia="Arial" w:hAnsi="Arial" w:cs="Arial"/>
           <w:color w:val="1F2933"/>
           <w:sz w:val="21"/>
           <w:lang w:val="en-GB"/>
@@ -9101,212 +10356,18 @@
       </w:pPr>
       <w:r>
         <w:rPr>
-          <w:rFonts w:ascii="Arial" w:eastAsia="Arial" w:hAnsi="Arial"/>
+          <w:rFonts w:ascii="Arial" w:eastAsia="Arial" w:hAnsi="Arial" w:cs="Arial"/>
           <w:color w:val="1F2933"/>
           <w:sz w:val="21"/>
           <w:lang w:val="en-GB"/>
         </w:rPr>
-        <w:t>Answer: _____________________________________________________________________________</w:t>
-      </w:r>
-    </w:p>
-    <w:p>
-      <w:pPr>
-        <w:spacing w:before="200" w:after="120"/>
-        <w:rPr>
-          <w:rFonts w:asciiTheme="minorBidi" w:eastAsia="Arial" w:hAnsiTheme="minorBidi"/>
-          <w:b/>
-          <w:sz w:val="22"/>
-          <w:lang w:val="en-GB"/>
-        </w:rPr>
-      </w:pPr>
-      <w:r>
-        <w:rPr>
-          <w:rFonts w:asciiTheme="minorBidi" w:eastAsia="Arial" w:hAnsiTheme="minorBidi"/>
-          <w:b/>
-          <w:sz w:val="22"/>
-          <w:lang w:val="en-GB"/>
-        </w:rPr>
-        <w:t>Which lines call the function?</w:t>
-      </w:r>
-    </w:p>
-    <w:p>
-      <w:pPr>
-        <w:spacing w:after="20"/>
-        <w:rPr>
-          <w:rFonts w:ascii="Arial" w:eastAsia="Arial" w:hAnsi="Arial"/>
-          <w:color w:val="1F2933"/>
-          <w:sz w:val="21"/>
-          <w:lang w:val="en-GB"/>
-        </w:rPr>
-      </w:pPr>
-      <w:r>
-        <w:rPr>
-          <w:rFonts w:ascii="Arial" w:eastAsia="Arial" w:hAnsi="Arial"/>
-          <w:color w:val="1F2933"/>
-          <w:sz w:val="21"/>
-          <w:lang w:val="en-GB"/>
-        </w:rPr>
-        <w:t>Answer: _____________________________________________________________________________</w:t>
-      </w:r>
-    </w:p>
-    <w:p>
-      <w:pPr>
-        <w:spacing w:before="200" w:after="120"/>
-        <w:rPr>
-          <w:rFonts w:asciiTheme="minorBidi" w:eastAsia="Arial" w:hAnsiTheme="minorBidi"/>
-          <w:b/>
-          <w:sz w:val="22"/>
-          <w:lang w:val="en-GB"/>
-        </w:rPr>
-      </w:pPr>
-      <w:r>
-        <w:rPr>
-          <w:rFonts w:asciiTheme="minorBidi" w:eastAsia="Arial" w:hAnsiTheme="minorBidi"/>
-          <w:b/>
-          <w:sz w:val="22"/>
-          <w:lang w:val="en-GB"/>
-        </w:rPr>
-        <w:t>Which lines form the conditional statement?</w:t>
-      </w:r>
-    </w:p>
-    <w:p>
-      <w:pPr>
-        <w:spacing w:after="20"/>
-        <w:rPr>
-          <w:rFonts w:ascii="Arial" w:eastAsia="Arial" w:hAnsi="Arial"/>
-          <w:color w:val="1F2933"/>
-          <w:sz w:val="21"/>
-          <w:lang w:val="en-GB"/>
-        </w:rPr>
-      </w:pPr>
-      <w:r>
-        <w:rPr>
-          <w:rFonts w:ascii="Arial" w:eastAsia="Arial" w:hAnsi="Arial"/>
-          <w:color w:val="1F2933"/>
-          <w:sz w:val="21"/>
-          <w:lang w:val="en-GB"/>
-        </w:rPr>
-        <w:t>Answer: _____________________________________________________________________________</w:t>
-      </w:r>
-    </w:p>
-    <w:p>
-      <w:pPr>
-        <w:spacing w:before="200" w:after="120"/>
-        <w:rPr>
-          <w:rFonts w:asciiTheme="minorBidi" w:eastAsia="Arial" w:hAnsiTheme="minorBidi"/>
-          <w:b/>
-          <w:sz w:val="22"/>
-          <w:lang w:val="en-GB"/>
-        </w:rPr>
-      </w:pPr>
-      <w:r>
-        <w:rPr>
-          <w:rFonts w:asciiTheme="minorBidi" w:eastAsia="Arial" w:hAnsiTheme="minorBidi"/>
-          <w:b/>
-          <w:sz w:val="22"/>
-          <w:lang w:val="en-GB"/>
-        </w:rPr>
-        <w:t>Which lines form the loop?</w:t>
-      </w:r>
-    </w:p>
-    <w:p>
-      <w:pPr>
-        <w:spacing w:after="20"/>
-        <w:rPr>
-          <w:rFonts w:ascii="Arial" w:eastAsia="Arial" w:hAnsi="Arial"/>
-          <w:color w:val="1F2933"/>
-          <w:sz w:val="21"/>
-          <w:lang w:val="en-GB"/>
-        </w:rPr>
-      </w:pPr>
-      <w:r>
-        <w:rPr>
-          <w:rFonts w:ascii="Arial" w:eastAsia="Arial" w:hAnsi="Arial"/>
-          <w:color w:val="1F2933"/>
-          <w:sz w:val="21"/>
-          <w:lang w:val="en-GB"/>
-        </w:rPr>
-        <w:t>Answer: _____________________________________________________________________________</w:t>
-      </w:r>
-    </w:p>
-    <w:p>
-      <w:pPr>
-        <w:spacing w:before="200" w:after="120"/>
-        <w:rPr>
-          <w:rFonts w:asciiTheme="minorBidi" w:eastAsia="Arial" w:hAnsiTheme="minorBidi"/>
-          <w:b/>
-          <w:sz w:val="22"/>
-          <w:lang w:val="en-GB"/>
-        </w:rPr>
-      </w:pPr>
-      <w:r>
-        <w:rPr>
-          <w:rFonts w:asciiTheme="minorBidi" w:eastAsia="Arial" w:hAnsiTheme="minorBidi"/>
-          <w:b/>
-          <w:sz w:val="22"/>
-          <w:lang w:val="en-GB"/>
-        </w:rPr>
-        <w:t>Which command captured the script output into a text file?</w:t>
-      </w:r>
-    </w:p>
-    <w:p>
-      <w:pPr>
-        <w:spacing w:after="20"/>
-        <w:rPr>
-          <w:rFonts w:ascii="Arial" w:eastAsia="Arial" w:hAnsi="Arial"/>
-          <w:color w:val="1F2933"/>
-          <w:sz w:val="21"/>
-          <w:lang w:val="en-GB"/>
-        </w:rPr>
-      </w:pPr>
-      <w:r>
-        <w:rPr>
-          <w:rFonts w:ascii="Arial" w:eastAsia="Arial" w:hAnsi="Arial"/>
-          <w:color w:val="1F2933"/>
-          <w:sz w:val="21"/>
-          <w:lang w:val="en-GB"/>
-        </w:rPr>
-        <w:t>Answer: _____________________________________________________________________________</w:t>
-      </w:r>
-    </w:p>
-    <w:p>
-      <w:pPr>
-        <w:spacing w:before="200" w:after="120"/>
-        <w:rPr>
-          <w:rFonts w:asciiTheme="minorBidi" w:eastAsia="Arial" w:hAnsiTheme="minorBidi"/>
-          <w:b/>
-          <w:sz w:val="22"/>
-          <w:lang w:val="en-GB"/>
-        </w:rPr>
-      </w:pPr>
-      <w:r>
-        <w:rPr>
-          <w:rFonts w:asciiTheme="minorBidi" w:eastAsia="Arial" w:hAnsiTheme="minorBidi"/>
-          <w:b/>
-          <w:sz w:val="22"/>
-          <w:lang w:val="en-GB"/>
-        </w:rPr>
-        <w:t>What would be unsafe to claim from this lab evidence alone?</w:t>
-      </w:r>
-    </w:p>
-    <w:p>
-      <w:pPr>
-        <w:spacing w:after="20"/>
-        <w:rPr>
-          <w:rFonts w:ascii="Arial" w:eastAsia="Arial" w:hAnsi="Arial"/>
-          <w:color w:val="1F2933"/>
-          <w:sz w:val="21"/>
-          <w:lang w:val="en-GB"/>
-        </w:rPr>
-      </w:pPr>
-      <w:r>
-        <w:rPr>
-          <w:rFonts w:ascii="Arial" w:eastAsia="Arial" w:hAnsi="Arial"/>
-          <w:color w:val="1F2933"/>
-          <w:sz w:val="21"/>
-          <w:lang w:val="en-GB"/>
-        </w:rPr>
-        <w:t>Answer: _____________________________________________________________________________</w:t>
+        <w:t xml:space="preserve">Answer: </w:t>
+      </w:r>
+      <w:r>
+        <w:rPr>
+          <w:rFonts w:ascii="Arial" w:hAnsi="Arial" w:cs="Arial"/>
+        </w:rPr>
+        <w:t>It would be unsafe to claim that the script is fully automated, always reliable, error-free, or suitable for long-term production use.</w:t>
       </w:r>
     </w:p>
     <w:p>
@@ -9434,307 +10495,9 @@
     </w:p>
     <w:p>
       <w:pPr>
-        <w:spacing w:after="40"/>
-        <w:rPr>
-          <w:rFonts w:asciiTheme="minorBidi" w:hAnsiTheme="minorBidi"/>
-        </w:rPr>
-      </w:pPr>
-      <w:r>
-        <w:rPr>
-          <w:rFonts w:asciiTheme="minorBidi" w:hAnsiTheme="minorBidi"/>
-        </w:rPr>
-        <w:t>________________________________________________________________________________</w:t>
-      </w:r>
-      <w:r>
-        <w:rPr>
-          <w:rFonts w:asciiTheme="minorBidi" w:hAnsiTheme="minorBidi"/>
-        </w:rPr>
-        <w:t>____</w:t>
-      </w:r>
-      <w:r>
-        <w:rPr>
-          <w:rFonts w:asciiTheme="minorBidi" w:hAnsiTheme="minorBidi"/>
-        </w:rPr>
-        <w:t>____</w:t>
-      </w:r>
-    </w:p>
-    <w:p>
-      <w:pPr>
-        <w:spacing w:after="40"/>
-        <w:rPr>
-          <w:rFonts w:asciiTheme="minorBidi" w:hAnsiTheme="minorBidi"/>
-        </w:rPr>
-      </w:pPr>
-      <w:r>
-        <w:rPr>
-          <w:rFonts w:asciiTheme="minorBidi" w:hAnsiTheme="minorBidi"/>
-        </w:rPr>
-        <w:t>____________________________________________________________________________</w:t>
-      </w:r>
-      <w:r>
-        <w:rPr>
-          <w:rFonts w:asciiTheme="minorBidi" w:hAnsiTheme="minorBidi"/>
-        </w:rPr>
-        <w:t>____</w:t>
-      </w:r>
-      <w:r>
-        <w:rPr>
-          <w:rFonts w:asciiTheme="minorBidi" w:hAnsiTheme="minorBidi"/>
-        </w:rPr>
-        <w:t>________</w:t>
-      </w:r>
-    </w:p>
-    <w:p>
-      <w:pPr>
-        <w:spacing w:after="40"/>
-        <w:rPr>
-          <w:rFonts w:asciiTheme="minorBidi" w:hAnsiTheme="minorBidi"/>
-        </w:rPr>
-      </w:pPr>
-      <w:r>
-        <w:rPr>
-          <w:rFonts w:asciiTheme="minorBidi" w:hAnsiTheme="minorBidi"/>
-        </w:rPr>
-        <w:t>________________________________________________________________________________</w:t>
-      </w:r>
-      <w:r>
-        <w:rPr>
-          <w:rFonts w:asciiTheme="minorBidi" w:hAnsiTheme="minorBidi"/>
-        </w:rPr>
-        <w:t>____</w:t>
-      </w:r>
-      <w:r>
-        <w:rPr>
-          <w:rFonts w:asciiTheme="minorBidi" w:hAnsiTheme="minorBidi"/>
-        </w:rPr>
-        <w:t>____</w:t>
-      </w:r>
-    </w:p>
-    <w:p>
-      <w:pPr>
-        <w:spacing w:after="40"/>
-        <w:rPr>
-          <w:rFonts w:asciiTheme="minorBidi" w:hAnsiTheme="minorBidi"/>
-        </w:rPr>
-      </w:pPr>
-      <w:r>
-        <w:rPr>
-          <w:rFonts w:asciiTheme="minorBidi" w:hAnsiTheme="minorBidi"/>
-        </w:rPr>
-        <w:t>____________________________________________________________________________________</w:t>
-      </w:r>
-      <w:r>
-        <w:rPr>
-          <w:rFonts w:asciiTheme="minorBidi" w:hAnsiTheme="minorBidi"/>
-        </w:rPr>
-        <w:t>____</w:t>
-      </w:r>
-    </w:p>
-    <w:p>
-      <w:pPr>
-        <w:spacing w:after="40"/>
-        <w:rPr>
-          <w:rFonts w:asciiTheme="minorBidi" w:hAnsiTheme="minorBidi"/>
-        </w:rPr>
-      </w:pPr>
-      <w:r>
-        <w:rPr>
-          <w:rFonts w:asciiTheme="minorBidi" w:hAnsiTheme="minorBidi"/>
-        </w:rPr>
-        <w:t>____________________________________________________________________________________</w:t>
-      </w:r>
-      <w:r>
-        <w:rPr>
-          <w:rFonts w:asciiTheme="minorBidi" w:hAnsiTheme="minorBidi"/>
-        </w:rPr>
-        <w:t>____</w:t>
-      </w:r>
-    </w:p>
-    <w:p>
-      <w:pPr>
-        <w:spacing w:after="40"/>
-        <w:rPr>
-          <w:rFonts w:asciiTheme="minorBidi" w:hAnsiTheme="minorBidi"/>
-        </w:rPr>
-      </w:pPr>
-      <w:r>
-        <w:rPr>
-          <w:rFonts w:asciiTheme="minorBidi" w:hAnsiTheme="minorBidi"/>
-        </w:rPr>
-        <w:t>____________________________________________________________________________________</w:t>
-      </w:r>
-      <w:r>
-        <w:rPr>
-          <w:rFonts w:asciiTheme="minorBidi" w:hAnsiTheme="minorBidi"/>
-        </w:rPr>
-        <w:t>____</w:t>
-      </w:r>
-    </w:p>
-    <w:p>
-      <w:pPr>
-        <w:spacing w:after="40"/>
-        <w:rPr>
-          <w:rFonts w:asciiTheme="minorBidi" w:hAnsiTheme="minorBidi"/>
-        </w:rPr>
-      </w:pPr>
-      <w:r>
-        <w:rPr>
-          <w:rFonts w:asciiTheme="minorBidi" w:hAnsiTheme="minorBidi"/>
-        </w:rPr>
-        <w:t>____________________________________________________________________________________</w:t>
-      </w:r>
-      <w:r>
-        <w:rPr>
-          <w:rFonts w:asciiTheme="minorBidi" w:hAnsiTheme="minorBidi"/>
-        </w:rPr>
-        <w:t>____</w:t>
-      </w:r>
-    </w:p>
-    <w:p>
-      <w:pPr>
-        <w:spacing w:after="40"/>
-        <w:rPr>
-          <w:rFonts w:asciiTheme="minorBidi" w:hAnsiTheme="minorBidi"/>
-        </w:rPr>
-      </w:pPr>
-      <w:r>
-        <w:rPr>
-          <w:rFonts w:asciiTheme="minorBidi" w:hAnsiTheme="minorBidi"/>
-        </w:rPr>
-        <w:t>____________________________________________________________________________________</w:t>
-      </w:r>
-      <w:r>
-        <w:rPr>
-          <w:rFonts w:asciiTheme="minorBidi" w:hAnsiTheme="minorBidi"/>
-        </w:rPr>
-        <w:t>____</w:t>
-      </w:r>
-    </w:p>
-    <w:p>
-      <w:pPr>
-        <w:spacing w:after="40"/>
-        <w:rPr>
-          <w:rFonts w:asciiTheme="minorBidi" w:hAnsiTheme="minorBidi"/>
-        </w:rPr>
-      </w:pPr>
-      <w:r>
-        <w:rPr>
-          <w:rFonts w:asciiTheme="minorBidi" w:hAnsiTheme="minorBidi"/>
-        </w:rPr>
-        <w:t>____________________________________________________________________________________</w:t>
-      </w:r>
-      <w:r>
-        <w:rPr>
-          <w:rFonts w:asciiTheme="minorBidi" w:hAnsiTheme="minorBidi"/>
-        </w:rPr>
-        <w:t>____</w:t>
-      </w:r>
-    </w:p>
-    <w:p>
-      <w:pPr>
-        <w:spacing w:after="40"/>
-        <w:rPr>
-          <w:rFonts w:asciiTheme="minorBidi" w:hAnsiTheme="minorBidi"/>
-        </w:rPr>
-      </w:pPr>
-      <w:r>
-        <w:rPr>
-          <w:rFonts w:asciiTheme="minorBidi" w:hAnsiTheme="minorBidi"/>
-        </w:rPr>
-        <w:t>____________________________________________________________________________________</w:t>
-      </w:r>
-      <w:r>
-        <w:rPr>
-          <w:rFonts w:asciiTheme="minorBidi" w:hAnsiTheme="minorBidi"/>
-        </w:rPr>
-        <w:t>____</w:t>
-      </w:r>
-    </w:p>
-    <w:p>
-      <w:pPr>
-        <w:spacing w:after="40"/>
-        <w:rPr>
-          <w:rFonts w:asciiTheme="minorBidi" w:hAnsiTheme="minorBidi"/>
-        </w:rPr>
-      </w:pPr>
-      <w:r>
-        <w:rPr>
-          <w:rFonts w:asciiTheme="minorBidi" w:hAnsiTheme="minorBidi"/>
-        </w:rPr>
-        <w:t>____________________________________________________________________________________</w:t>
-      </w:r>
-      <w:r>
-        <w:rPr>
-          <w:rFonts w:asciiTheme="minorBidi" w:hAnsiTheme="minorBidi"/>
-        </w:rPr>
-        <w:t>____</w:t>
-      </w:r>
-    </w:p>
-    <w:p>
-      <w:pPr>
-        <w:spacing w:after="40"/>
-        <w:rPr>
-          <w:rFonts w:asciiTheme="minorBidi" w:hAnsiTheme="minorBidi"/>
-        </w:rPr>
-      </w:pPr>
-      <w:r>
-        <w:rPr>
-          <w:rFonts w:asciiTheme="minorBidi" w:hAnsiTheme="minorBidi"/>
-        </w:rPr>
-        <w:t>____________________________________________________________________________________</w:t>
-      </w:r>
-      <w:r>
-        <w:rPr>
-          <w:rFonts w:asciiTheme="minorBidi" w:hAnsiTheme="minorBidi"/>
-        </w:rPr>
-        <w:t>____</w:t>
-      </w:r>
-    </w:p>
-    <w:p>
-      <w:pPr>
-        <w:spacing w:after="40"/>
-        <w:rPr>
-          <w:rFonts w:asciiTheme="minorBidi" w:hAnsiTheme="minorBidi"/>
-        </w:rPr>
-      </w:pPr>
-      <w:r>
-        <w:rPr>
-          <w:rFonts w:asciiTheme="minorBidi" w:hAnsiTheme="minorBidi"/>
-        </w:rPr>
-        <w:t>____________________________________________________________________________________</w:t>
-      </w:r>
-      <w:r>
-        <w:rPr>
-          <w:rFonts w:asciiTheme="minorBidi" w:hAnsiTheme="minorBidi"/>
-        </w:rPr>
-        <w:t>____</w:t>
-      </w:r>
-    </w:p>
-    <w:p>
-      <w:pPr>
-        <w:spacing w:after="40"/>
-        <w:rPr>
-          <w:rFonts w:asciiTheme="minorBidi" w:hAnsiTheme="minorBidi"/>
-        </w:rPr>
-      </w:pPr>
-      <w:r>
-        <w:rPr>
-          <w:rFonts w:asciiTheme="minorBidi" w:hAnsiTheme="minorBidi"/>
-        </w:rPr>
-        <w:t>____</w:t>
-      </w:r>
-      <w:r>
-        <w:rPr>
-          <w:rFonts w:asciiTheme="minorBidi" w:hAnsiTheme="minorBidi"/>
-        </w:rPr>
-        <w:t>____________________________________________________________________________________</w:t>
-      </w:r>
-    </w:p>
-    <w:p>
-      <w:pPr>
         <w:spacing w:before="360"/>
         <w:rPr>
-          <w:rFonts w:asciiTheme="minorBidi" w:eastAsia="Calibri" w:hAnsiTheme="minorBidi"/>
+          <w:rFonts w:ascii="Arial" w:eastAsia="Calibri" w:hAnsi="Arial" w:cs="Arial"/>
           <w:b/>
           <w:sz w:val="24"/>
           <w:szCs w:val="24"/>
@@ -9743,7 +10506,23 @@
       </w:pPr>
       <w:r>
         <w:rPr>
-          <w:rFonts w:asciiTheme="minorBidi" w:eastAsia="Calibri" w:hAnsiTheme="minorBidi"/>
+          <w:rFonts w:ascii="Arial" w:hAnsi="Arial" w:cs="Arial"/>
+        </w:rPr>
+        <w:t>A simple Bash script can make a repeated inspection task more consistent because it performs the same checks in the same order each time. Variables store values such as the report title and directory name, making the script easier to update. Functions reduce repeated code and keep headings formatted consistently. Conditionals allow the script to make decisions, such as reporting whether an evidence directory exists. Loops repeat selected commands a fixed number of times, which helps produce controlled and predictable results. The output can also be redirected into a text file, creating a record that can be reviewed later. However, this evidence has limits. It shows that the script ran and produced output at that time, but it does not prove that the script is fully automated, always accurate, error-free, or reliable in every situation.</w:t>
+      </w:r>
+      <w:r>
+        <w:rPr>
+          <w:rFonts w:ascii="Arial" w:eastAsia="Calibri" w:hAnsi="Arial" w:cs="Arial"/>
+          <w:b/>
+          <w:sz w:val="24"/>
+          <w:szCs w:val="24"/>
+          <w:lang w:val="en-GB"/>
+        </w:rPr>
+        <w:t xml:space="preserve"> </w:t>
+      </w:r>
+      <w:r>
+        <w:rPr>
+          <w:rFonts w:ascii="Arial" w:eastAsia="Calibri" w:hAnsi="Arial" w:cs="Arial"/>
           <w:b/>
           <w:sz w:val="24"/>
           <w:szCs w:val="24"/>
@@ -9912,7 +10691,24 @@
                 <w:rFonts w:asciiTheme="minorBidi" w:hAnsiTheme="minorBidi"/>
                 <w:szCs w:val="20"/>
               </w:rPr>
-              <w:t>[   ]</w:t>
+              <w:t>[</w:t>
+            </w:r>
+            <w:r>
+              <w:rPr>
+                <w:rFonts w:ascii="Segoe UI Symbol" w:hAnsi="Segoe UI Symbol" w:cs="Segoe UI Symbol"/>
+                <w:color w:val="474747"/>
+                <w:sz w:val="21"/>
+                <w:szCs w:val="21"/>
+                <w:shd w:val="clear" w:color="auto" w:fill="FFFFFF"/>
+              </w:rPr>
+              <w:t>✓</w:t>
+            </w:r>
+            <w:r>
+              <w:rPr>
+                <w:rFonts w:asciiTheme="minorBidi" w:hAnsiTheme="minorBidi"/>
+                <w:szCs w:val="20"/>
+              </w:rPr>
+              <w:t>]</w:t>
             </w:r>
           </w:p>
         </w:tc>
@@ -9961,7 +10757,24 @@
                 <w:rFonts w:asciiTheme="minorBidi" w:hAnsiTheme="minorBidi"/>
                 <w:szCs w:val="20"/>
               </w:rPr>
-              <w:t>[   ]</w:t>
+              <w:t>[</w:t>
+            </w:r>
+            <w:r>
+              <w:rPr>
+                <w:rFonts w:ascii="Segoe UI Symbol" w:hAnsi="Segoe UI Symbol" w:cs="Segoe UI Symbol"/>
+                <w:color w:val="474747"/>
+                <w:sz w:val="21"/>
+                <w:szCs w:val="21"/>
+                <w:shd w:val="clear" w:color="auto" w:fill="FFFFFF"/>
+              </w:rPr>
+              <w:t>✓</w:t>
+            </w:r>
+            <w:r>
+              <w:rPr>
+                <w:rFonts w:asciiTheme="minorBidi" w:hAnsiTheme="minorBidi"/>
+                <w:szCs w:val="20"/>
+              </w:rPr>
+              <w:t>]</w:t>
             </w:r>
           </w:p>
         </w:tc>
@@ -10010,7 +10823,24 @@
                 <w:rFonts w:asciiTheme="minorBidi" w:hAnsiTheme="minorBidi"/>
                 <w:szCs w:val="20"/>
               </w:rPr>
-              <w:t>[   ]</w:t>
+              <w:t>[</w:t>
+            </w:r>
+            <w:r>
+              <w:rPr>
+                <w:rFonts w:ascii="Segoe UI Symbol" w:hAnsi="Segoe UI Symbol" w:cs="Segoe UI Symbol"/>
+                <w:color w:val="474747"/>
+                <w:sz w:val="21"/>
+                <w:szCs w:val="21"/>
+                <w:shd w:val="clear" w:color="auto" w:fill="FFFFFF"/>
+              </w:rPr>
+              <w:t>✓</w:t>
+            </w:r>
+            <w:r>
+              <w:rPr>
+                <w:rFonts w:asciiTheme="minorBidi" w:hAnsiTheme="minorBidi"/>
+                <w:szCs w:val="20"/>
+              </w:rPr>
+              <w:t>]</w:t>
             </w:r>
           </w:p>
         </w:tc>
@@ -10059,7 +10889,24 @@
                 <w:rFonts w:asciiTheme="minorBidi" w:hAnsiTheme="minorBidi"/>
                 <w:szCs w:val="20"/>
               </w:rPr>
-              <w:t>[   ]</w:t>
+              <w:t>[</w:t>
+            </w:r>
+            <w:r>
+              <w:rPr>
+                <w:rFonts w:ascii="Segoe UI Symbol" w:hAnsi="Segoe UI Symbol" w:cs="Segoe UI Symbol"/>
+                <w:color w:val="474747"/>
+                <w:sz w:val="21"/>
+                <w:szCs w:val="21"/>
+                <w:shd w:val="clear" w:color="auto" w:fill="FFFFFF"/>
+              </w:rPr>
+              <w:t>✓</w:t>
+            </w:r>
+            <w:r>
+              <w:rPr>
+                <w:rFonts w:asciiTheme="minorBidi" w:hAnsiTheme="minorBidi"/>
+                <w:szCs w:val="20"/>
+              </w:rPr>
+              <w:t>]</w:t>
             </w:r>
           </w:p>
         </w:tc>
@@ -10108,7 +10955,24 @@
                 <w:rFonts w:asciiTheme="minorBidi" w:hAnsiTheme="minorBidi"/>
                 <w:szCs w:val="20"/>
               </w:rPr>
-              <w:t>[   ]</w:t>
+              <w:t>[</w:t>
+            </w:r>
+            <w:r>
+              <w:rPr>
+                <w:rFonts w:ascii="Segoe UI Symbol" w:hAnsi="Segoe UI Symbol" w:cs="Segoe UI Symbol"/>
+                <w:color w:val="474747"/>
+                <w:sz w:val="21"/>
+                <w:szCs w:val="21"/>
+                <w:shd w:val="clear" w:color="auto" w:fill="FFFFFF"/>
+              </w:rPr>
+              <w:t>✓</w:t>
+            </w:r>
+            <w:r>
+              <w:rPr>
+                <w:rFonts w:asciiTheme="minorBidi" w:hAnsiTheme="minorBidi"/>
+                <w:szCs w:val="20"/>
+              </w:rPr>
+              <w:t>]</w:t>
             </w:r>
           </w:p>
         </w:tc>
@@ -10157,7 +11021,24 @@
                 <w:rFonts w:asciiTheme="minorBidi" w:hAnsiTheme="minorBidi"/>
                 <w:szCs w:val="20"/>
               </w:rPr>
-              <w:t>[   ]</w:t>
+              <w:t>[</w:t>
+            </w:r>
+            <w:r>
+              <w:rPr>
+                <w:rFonts w:ascii="Segoe UI Symbol" w:hAnsi="Segoe UI Symbol" w:cs="Segoe UI Symbol"/>
+                <w:color w:val="474747"/>
+                <w:sz w:val="21"/>
+                <w:szCs w:val="21"/>
+                <w:shd w:val="clear" w:color="auto" w:fill="FFFFFF"/>
+              </w:rPr>
+              <w:t>✓</w:t>
+            </w:r>
+            <w:r>
+              <w:rPr>
+                <w:rFonts w:asciiTheme="minorBidi" w:hAnsiTheme="minorBidi"/>
+                <w:szCs w:val="20"/>
+              </w:rPr>
+              <w:t>]</w:t>
             </w:r>
           </w:p>
         </w:tc>
@@ -10206,7 +11087,24 @@
                 <w:rFonts w:asciiTheme="minorBidi" w:hAnsiTheme="minorBidi"/>
                 <w:szCs w:val="20"/>
               </w:rPr>
-              <w:t>[   ]</w:t>
+              <w:t>[</w:t>
+            </w:r>
+            <w:r>
+              <w:rPr>
+                <w:rFonts w:ascii="Segoe UI Symbol" w:hAnsi="Segoe UI Symbol" w:cs="Segoe UI Symbol"/>
+                <w:color w:val="474747"/>
+                <w:sz w:val="21"/>
+                <w:szCs w:val="21"/>
+                <w:shd w:val="clear" w:color="auto" w:fill="FFFFFF"/>
+              </w:rPr>
+              <w:t>✓</w:t>
+            </w:r>
+            <w:r>
+              <w:rPr>
+                <w:rFonts w:asciiTheme="minorBidi" w:hAnsiTheme="minorBidi"/>
+                <w:szCs w:val="20"/>
+              </w:rPr>
+              <w:t>]</w:t>
             </w:r>
           </w:p>
         </w:tc>
@@ -10255,7 +11153,24 @@
                 <w:rFonts w:asciiTheme="minorBidi" w:hAnsiTheme="minorBidi"/>
                 <w:szCs w:val="20"/>
               </w:rPr>
-              <w:t>[   ]</w:t>
+              <w:t>[</w:t>
+            </w:r>
+            <w:r>
+              <w:rPr>
+                <w:rFonts w:ascii="Segoe UI Symbol" w:hAnsi="Segoe UI Symbol" w:cs="Segoe UI Symbol"/>
+                <w:color w:val="474747"/>
+                <w:sz w:val="21"/>
+                <w:szCs w:val="21"/>
+                <w:shd w:val="clear" w:color="auto" w:fill="FFFFFF"/>
+              </w:rPr>
+              <w:t>✓</w:t>
+            </w:r>
+            <w:r>
+              <w:rPr>
+                <w:rFonts w:asciiTheme="minorBidi" w:hAnsiTheme="minorBidi"/>
+                <w:szCs w:val="20"/>
+              </w:rPr>
+              <w:t>]</w:t>
             </w:r>
           </w:p>
         </w:tc>
@@ -10304,7 +11219,24 @@
                 <w:rFonts w:asciiTheme="minorBidi" w:hAnsiTheme="minorBidi"/>
                 <w:szCs w:val="20"/>
               </w:rPr>
-              <w:t>[   ]</w:t>
+              <w:t>[</w:t>
+            </w:r>
+            <w:r>
+              <w:rPr>
+                <w:rFonts w:ascii="Segoe UI Symbol" w:hAnsi="Segoe UI Symbol" w:cs="Segoe UI Symbol"/>
+                <w:color w:val="474747"/>
+                <w:sz w:val="21"/>
+                <w:szCs w:val="21"/>
+                <w:shd w:val="clear" w:color="auto" w:fill="FFFFFF"/>
+              </w:rPr>
+              <w:t>✓</w:t>
+            </w:r>
+            <w:r>
+              <w:rPr>
+                <w:rFonts w:asciiTheme="minorBidi" w:hAnsiTheme="minorBidi"/>
+                <w:szCs w:val="20"/>
+              </w:rPr>
+              <w:t>]</w:t>
             </w:r>
           </w:p>
         </w:tc>
@@ -10353,7 +11285,24 @@
                 <w:rFonts w:asciiTheme="minorBidi" w:hAnsiTheme="minorBidi"/>
                 <w:szCs w:val="20"/>
               </w:rPr>
-              <w:t>[   ]</w:t>
+              <w:t>[</w:t>
+            </w:r>
+            <w:r>
+              <w:rPr>
+                <w:rFonts w:ascii="Segoe UI Symbol" w:hAnsi="Segoe UI Symbol" w:cs="Segoe UI Symbol"/>
+                <w:color w:val="474747"/>
+                <w:sz w:val="21"/>
+                <w:szCs w:val="21"/>
+                <w:shd w:val="clear" w:color="auto" w:fill="FFFFFF"/>
+              </w:rPr>
+              <w:t>✓</w:t>
+            </w:r>
+            <w:r>
+              <w:rPr>
+                <w:rFonts w:asciiTheme="minorBidi" w:hAnsiTheme="minorBidi"/>
+                <w:szCs w:val="20"/>
+              </w:rPr>
+              <w:t>]</w:t>
             </w:r>
           </w:p>
         </w:tc>
@@ -10402,7 +11351,24 @@
                 <w:rFonts w:asciiTheme="minorBidi" w:hAnsiTheme="minorBidi"/>
                 <w:szCs w:val="20"/>
               </w:rPr>
-              <w:t>[   ]</w:t>
+              <w:t>[</w:t>
+            </w:r>
+            <w:r>
+              <w:rPr>
+                <w:rFonts w:ascii="Segoe UI Symbol" w:hAnsi="Segoe UI Symbol" w:cs="Segoe UI Symbol"/>
+                <w:color w:val="474747"/>
+                <w:sz w:val="21"/>
+                <w:szCs w:val="21"/>
+                <w:shd w:val="clear" w:color="auto" w:fill="FFFFFF"/>
+              </w:rPr>
+              <w:t>✓</w:t>
+            </w:r>
+            <w:r>
+              <w:rPr>
+                <w:rFonts w:asciiTheme="minorBidi" w:hAnsiTheme="minorBidi"/>
+                <w:szCs w:val="20"/>
+              </w:rPr>
+              <w:t>]</w:t>
             </w:r>
           </w:p>
         </w:tc>
@@ -10451,7 +11417,24 @@
                 <w:rFonts w:asciiTheme="minorBidi" w:hAnsiTheme="minorBidi"/>
                 <w:szCs w:val="20"/>
               </w:rPr>
-              <w:t>[   ]</w:t>
+              <w:t>[</w:t>
+            </w:r>
+            <w:r>
+              <w:rPr>
+                <w:rFonts w:ascii="Segoe UI Symbol" w:hAnsi="Segoe UI Symbol" w:cs="Segoe UI Symbol"/>
+                <w:color w:val="474747"/>
+                <w:sz w:val="21"/>
+                <w:szCs w:val="21"/>
+                <w:shd w:val="clear" w:color="auto" w:fill="FFFFFF"/>
+              </w:rPr>
+              <w:t>✓</w:t>
+            </w:r>
+            <w:r>
+              <w:rPr>
+                <w:rFonts w:asciiTheme="minorBidi" w:hAnsiTheme="minorBidi"/>
+                <w:szCs w:val="20"/>
+              </w:rPr>
+              <w:t>]</w:t>
             </w:r>
           </w:p>
         </w:tc>
@@ -10592,23 +11575,7 @@
                 <w:rFonts w:asciiTheme="minorBidi" w:hAnsiTheme="minorBidi"/>
                 <w:szCs w:val="20"/>
               </w:rPr>
-              <w:t xml:space="preserve">You are on </w:t>
-            </w:r>
-            <w:proofErr w:type="gramStart"/>
-            <w:r>
-              <w:rPr>
-                <w:rFonts w:asciiTheme="minorBidi" w:hAnsiTheme="minorBidi"/>
-                <w:szCs w:val="20"/>
-              </w:rPr>
-              <w:t>Windows</w:t>
-            </w:r>
-            <w:proofErr w:type="gramEnd"/>
-            <w:r>
-              <w:rPr>
-                <w:rFonts w:asciiTheme="minorBidi" w:hAnsiTheme="minorBidi"/>
-                <w:szCs w:val="20"/>
-              </w:rPr>
-              <w:t xml:space="preserve"> and the commands look different</w:t>
+              <w:t>You are on Windows and the commands look different</w:t>
             </w:r>
           </w:p>
         </w:tc>
@@ -11204,6 +12171,7 @@
                 <w:rFonts w:asciiTheme="minorBidi" w:hAnsiTheme="minorBidi"/>
                 <w:szCs w:val="20"/>
               </w:rPr>
+              <w:lastRenderedPageBreak/>
               <w:t>Week 10</w:t>
             </w:r>
           </w:p>
@@ -11268,7 +12236,7 @@
 </file>
 
 <file path=word/endnotes.xml><?xml version="1.0" encoding="utf-8"?>
-<w:endnotes xmlns:wpc="http://schemas.microsoft.com/office/word/2010/wordprocessingCanvas" xmlns:cx="http://schemas.microsoft.com/office/drawing/2014/chartex" xmlns:cx1="http://schemas.microsoft.com/office/drawing/2015/9/8/chartex" xmlns:cx2="http://schemas.microsoft.com/office/drawing/2015/10/21/chartex" xmlns:cx3="http://schemas.microsoft.com/office/drawing/2016/5/9/chartex" xmlns:cx4="http://schemas.microsoft.com/office/drawing/2016/5/10/chartex" xmlns:cx5="http://schemas.microsoft.com/office/drawing/2016/5/11/chartex" xmlns:cx6="http://schemas.microsoft.com/office/drawing/2016/5/12/chartex" xmlns:cx7="http://schemas.microsoft.com/office/drawing/2016/5/13/chartex" xmlns:cx8="http://schemas.microsoft.com/office/drawing/2016/5/14/chartex" xmlns:mc="http://schemas.openxmlformats.org/markup-compatibility/2006" xmlns:aink="http://schemas.microsoft.com/office/drawing/2016/ink" xmlns:am3d="http://schemas.microsoft.com/office/drawing/2017/model3d" xmlns:o="urn:schemas-microsoft-com:office:office" xmlns:oel="http://schemas.microsoft.com/office/2019/extlst" xmlns:r="http://schemas.openxmlformats.org/officeDocument/2006/relationships" xmlns:m="http://schemas.openxmlformats.org/officeDocument/2006/math" xmlns:v="urn:schemas-microsoft-com:vml" xmlns:wp14="http://schemas.microsoft.com/office/word/2010/wordprocessingDrawing" xmlns:wp="http://schemas.openxmlformats.org/drawingml/2006/wordprocessingDrawing" xmlns:w10="urn:schemas-microsoft-com:office:word" xmlns:w="http://schemas.openxmlformats.org/wordprocessingml/2006/main" xmlns:w14="http://schemas.microsoft.com/office/word/2010/wordml" xmlns:w15="http://schemas.microsoft.com/office/word/2012/wordml" xmlns:w16cex="http://schemas.microsoft.com/office/word/2018/wordml/cex" xmlns:w16cid="http://schemas.microsoft.com/office/word/2016/wordml/cid" xmlns:w16="http://schemas.microsoft.com/office/word/2018/wordml" xmlns:w16du="http://schemas.microsoft.com/office/word/2023/wordml/word16du" xmlns:w16sdtdh="http://schemas.microsoft.com/office/word/2020/wordml/sdtdatahash" xmlns:w16sdtfl="http://schemas.microsoft.com/office/word/2024/wordml/sdtformatlock" xmlns:w16se="http://schemas.microsoft.com/office/word/2015/wordml/symex" xmlns:wpg="http://schemas.microsoft.com/office/word/2010/wordprocessingGroup" xmlns:wpi="http://schemas.microsoft.com/office/word/2010/wordprocessingInk" xmlns:wne="http://schemas.microsoft.com/office/word/2006/wordml" xmlns:wps="http://schemas.microsoft.com/office/word/2010/wordprocessingShape" mc:Ignorable="w14 w15 w16se w16cid w16 w16cex w16sdtdh w16sdtfl w16du wp14">
+<w:endnotes xmlns:wpc="http://schemas.microsoft.com/office/word/2010/wordprocessingCanvas" xmlns:cx="http://schemas.microsoft.com/office/drawing/2014/chartex" xmlns:cx1="http://schemas.microsoft.com/office/drawing/2015/9/8/chartex" xmlns:cx2="http://schemas.microsoft.com/office/drawing/2015/10/21/chartex" xmlns:cx3="http://schemas.microsoft.com/office/drawing/2016/5/9/chartex" xmlns:cx4="http://schemas.microsoft.com/office/drawing/2016/5/10/chartex" xmlns:cx5="http://schemas.microsoft.com/office/drawing/2016/5/11/chartex" xmlns:cx6="http://schemas.microsoft.com/office/drawing/2016/5/12/chartex" xmlns:cx7="http://schemas.microsoft.com/office/drawing/2016/5/13/chartex" xmlns:cx8="http://schemas.microsoft.com/office/drawing/2016/5/14/chartex" xmlns:mc="http://schemas.openxmlformats.org/markup-compatibility/2006" xmlns:m="http://schemas.openxmlformats.org/officeDocument/2006/math" xmlns:aink="http://schemas.microsoft.com/office/drawing/2016/ink" xmlns:am3d="http://schemas.microsoft.com/office/drawing/2017/model3d" xmlns:oel="http://schemas.microsoft.com/office/2019/extlst" xmlns:r="http://schemas.openxmlformats.org/officeDocument/2006/relationships" xmlns:wp14="http://schemas.microsoft.com/office/word/2010/wordprocessingDrawing" xmlns:wp="http://schemas.openxmlformats.org/drawingml/2006/wordprocessingDrawing" xmlns:wpg="http://schemas.microsoft.com/office/word/2010/wordprocessingGroup" xmlns:wpi="http://schemas.microsoft.com/office/word/2010/wordprocessingInk" xmlns:wps="http://schemas.microsoft.com/office/word/2010/wordprocessingShape" xmlns:o="urn:schemas-microsoft-com:office:office" xmlns:v="urn:schemas-microsoft-com:vml" xmlns:w10="urn:schemas-microsoft-com:office:word" xmlns:w="http://schemas.openxmlformats.org/wordprocessingml/2006/main" xmlns:w14="http://schemas.microsoft.com/office/word/2010/wordml" xmlns:w15="http://schemas.microsoft.com/office/word/2012/wordml" xmlns:w16cei="http://schemas.microsoft.com/office/word/2026/wordml/cei" xmlns:w16cex="http://schemas.microsoft.com/office/word/2018/wordml/cex" xmlns:w16cid="http://schemas.microsoft.com/office/word/2016/wordml/cid" xmlns:w16="http://schemas.microsoft.com/office/word/2018/wordml" xmlns:w16sdtdh="http://schemas.microsoft.com/office/word/2020/wordml/sdtdatahash" xmlns:w16sdtfl="http://schemas.microsoft.com/office/word/2024/wordml/sdtformatlock" xmlns:w16se="http://schemas.microsoft.com/office/word/2015/wordml/symex" xmlns:w16du="http://schemas.microsoft.com/office/word/2023/wordml/word16du" xmlns:wne="http://schemas.microsoft.com/office/word/2006/wordml" mc:Ignorable="w14 w15 w16se w16cid w16 w16cex w16sdtdh w16sdtfl w16du wp14">
   <w:endnote w:type="separator" w:id="-1">
     <w:p>
       <w:pPr>
@@ -11293,7 +12261,7 @@
 </file>
 
 <file path=word/footer1.xml><?xml version="1.0" encoding="utf-8"?>
-<w:ftr xmlns:wpc="http://schemas.microsoft.com/office/word/2010/wordprocessingCanvas" xmlns:cx="http://schemas.microsoft.com/office/drawing/2014/chartex" xmlns:cx1="http://schemas.microsoft.com/office/drawing/2015/9/8/chartex" xmlns:cx2="http://schemas.microsoft.com/office/drawing/2015/10/21/chartex" xmlns:cx3="http://schemas.microsoft.com/office/drawing/2016/5/9/chartex" xmlns:cx4="http://schemas.microsoft.com/office/drawing/2016/5/10/chartex" xmlns:cx5="http://schemas.microsoft.com/office/drawing/2016/5/11/chartex" xmlns:cx6="http://schemas.microsoft.com/office/drawing/2016/5/12/chartex" xmlns:cx7="http://schemas.microsoft.com/office/drawing/2016/5/13/chartex" xmlns:cx8="http://schemas.microsoft.com/office/drawing/2016/5/14/chartex" xmlns:mc="http://schemas.openxmlformats.org/markup-compatibility/2006" xmlns:aink="http://schemas.microsoft.com/office/drawing/2016/ink" xmlns:am3d="http://schemas.microsoft.com/office/drawing/2017/model3d" xmlns:o="urn:schemas-microsoft-com:office:office" xmlns:oel="http://schemas.microsoft.com/office/2019/extlst" xmlns:r="http://schemas.openxmlformats.org/officeDocument/2006/relationships" xmlns:m="http://schemas.openxmlformats.org/officeDocument/2006/math" xmlns:v="urn:schemas-microsoft-com:vml" xmlns:wp14="http://schemas.microsoft.com/office/word/2010/wordprocessingDrawing" xmlns:wp="http://schemas.openxmlformats.org/drawingml/2006/wordprocessingDrawing" xmlns:w10="urn:schemas-microsoft-com:office:word" xmlns:w="http://schemas.openxmlformats.org/wordprocessingml/2006/main" xmlns:w14="http://schemas.microsoft.com/office/word/2010/wordml" xmlns:w15="http://schemas.microsoft.com/office/word/2012/wordml" xmlns:w16cex="http://schemas.microsoft.com/office/word/2018/wordml/cex" xmlns:w16cid="http://schemas.microsoft.com/office/word/2016/wordml/cid" xmlns:w16="http://schemas.microsoft.com/office/word/2018/wordml" xmlns:w16du="http://schemas.microsoft.com/office/word/2023/wordml/word16du" xmlns:w16sdtdh="http://schemas.microsoft.com/office/word/2020/wordml/sdtdatahash" xmlns:w16sdtfl="http://schemas.microsoft.com/office/word/2024/wordml/sdtformatlock" xmlns:w16se="http://schemas.microsoft.com/office/word/2015/wordml/symex" xmlns:wpg="http://schemas.microsoft.com/office/word/2010/wordprocessingGroup" xmlns:wpi="http://schemas.microsoft.com/office/word/2010/wordprocessingInk" xmlns:wne="http://schemas.microsoft.com/office/word/2006/wordml" xmlns:wps="http://schemas.microsoft.com/office/word/2010/wordprocessingShape" mc:Ignorable="w14 w15 w16se w16cid w16 w16cex w16sdtdh w16sdtfl w16du wp14">
+<w:ftr xmlns:wpc="http://schemas.microsoft.com/office/word/2010/wordprocessingCanvas" xmlns:cx="http://schemas.microsoft.com/office/drawing/2014/chartex" xmlns:cx1="http://schemas.microsoft.com/office/drawing/2015/9/8/chartex" xmlns:cx2="http://schemas.microsoft.com/office/drawing/2015/10/21/chartex" xmlns:cx3="http://schemas.microsoft.com/office/drawing/2016/5/9/chartex" xmlns:cx4="http://schemas.microsoft.com/office/drawing/2016/5/10/chartex" xmlns:cx5="http://schemas.microsoft.com/office/drawing/2016/5/11/chartex" xmlns:cx6="http://schemas.microsoft.com/office/drawing/2016/5/12/chartex" xmlns:cx7="http://schemas.microsoft.com/office/drawing/2016/5/13/chartex" xmlns:cx8="http://schemas.microsoft.com/office/drawing/2016/5/14/chartex" xmlns:mc="http://schemas.openxmlformats.org/markup-compatibility/2006" xmlns:m="http://schemas.openxmlformats.org/officeDocument/2006/math" xmlns:aink="http://schemas.microsoft.com/office/drawing/2016/ink" xmlns:am3d="http://schemas.microsoft.com/office/drawing/2017/model3d" xmlns:oel="http://schemas.microsoft.com/office/2019/extlst" xmlns:r="http://schemas.openxmlformats.org/officeDocument/2006/relationships" xmlns:wp14="http://schemas.microsoft.com/office/word/2010/wordprocessingDrawing" xmlns:wp="http://schemas.openxmlformats.org/drawingml/2006/wordprocessingDrawing" xmlns:wpg="http://schemas.microsoft.com/office/word/2010/wordprocessingGroup" xmlns:wpi="http://schemas.microsoft.com/office/word/2010/wordprocessingInk" xmlns:wps="http://schemas.microsoft.com/office/word/2010/wordprocessingShape" xmlns:o="urn:schemas-microsoft-com:office:office" xmlns:v="urn:schemas-microsoft-com:vml" xmlns:w10="urn:schemas-microsoft-com:office:word" xmlns:w="http://schemas.openxmlformats.org/wordprocessingml/2006/main" xmlns:w14="http://schemas.microsoft.com/office/word/2010/wordml" xmlns:w15="http://schemas.microsoft.com/office/word/2012/wordml" xmlns:w16cei="http://schemas.microsoft.com/office/word/2026/wordml/cei" xmlns:w16cex="http://schemas.microsoft.com/office/word/2018/wordml/cex" xmlns:w16cid="http://schemas.microsoft.com/office/word/2016/wordml/cid" xmlns:w16="http://schemas.microsoft.com/office/word/2018/wordml" xmlns:w16sdtdh="http://schemas.microsoft.com/office/word/2020/wordml/sdtdatahash" xmlns:w16sdtfl="http://schemas.microsoft.com/office/word/2024/wordml/sdtformatlock" xmlns:w16se="http://schemas.microsoft.com/office/word/2015/wordml/symex" xmlns:w16du="http://schemas.microsoft.com/office/word/2023/wordml/word16du" xmlns:wne="http://schemas.microsoft.com/office/word/2006/wordml" mc:Ignorable="w14 w15 w16se w16cid w16 w16cex w16sdtdh w16sdtfl w16du wp14">
   <w:p>
     <w:pPr>
       <w:pStyle w:val="Footer"/>
@@ -11325,7 +12293,7 @@
 </file>
 
 <file path=word/footnotes.xml><?xml version="1.0" encoding="utf-8"?>
-<w:footnotes xmlns:wpc="http://schemas.microsoft.com/office/word/2010/wordprocessingCanvas" xmlns:cx="http://schemas.microsoft.com/office/drawing/2014/chartex" xmlns:cx1="http://schemas.microsoft.com/office/drawing/2015/9/8/chartex" xmlns:cx2="http://schemas.microsoft.com/office/drawing/2015/10/21/chartex" xmlns:cx3="http://schemas.microsoft.com/office/drawing/2016/5/9/chartex" xmlns:cx4="http://schemas.microsoft.com/office/drawing/2016/5/10/chartex" xmlns:cx5="http://schemas.microsoft.com/office/drawing/2016/5/11/chartex" xmlns:cx6="http://schemas.microsoft.com/office/drawing/2016/5/12/chartex" xmlns:cx7="http://schemas.microsoft.com/office/drawing/2016/5/13/chartex" xmlns:cx8="http://schemas.microsoft.com/office/drawing/2016/5/14/chartex" xmlns:mc="http://schemas.openxmlformats.org/markup-compatibility/2006" xmlns:aink="http://schemas.microsoft.com/office/drawing/2016/ink" xmlns:am3d="http://schemas.microsoft.com/office/drawing/2017/model3d" xmlns:o="urn:schemas-microsoft-com:office:office" xmlns:oel="http://schemas.microsoft.com/office/2019/extlst" xmlns:r="http://schemas.openxmlformats.org/officeDocument/2006/relationships" xmlns:m="http://schemas.openxmlformats.org/officeDocument/2006/math" xmlns:v="urn:schemas-microsoft-com:vml" xmlns:wp14="http://schemas.microsoft.com/office/word/2010/wordprocessingDrawing" xmlns:wp="http://schemas.openxmlformats.org/drawingml/2006/wordprocessingDrawing" xmlns:w10="urn:schemas-microsoft-com:office:word" xmlns:w="http://schemas.openxmlformats.org/wordprocessingml/2006/main" xmlns:w14="http://schemas.microsoft.com/office/word/2010/wordml" xmlns:w15="http://schemas.microsoft.com/office/word/2012/wordml" xmlns:w16cex="http://schemas.microsoft.com/office/word/2018/wordml/cex" xmlns:w16cid="http://schemas.microsoft.com/office/word/2016/wordml/cid" xmlns:w16="http://schemas.microsoft.com/office/word/2018/wordml" xmlns:w16du="http://schemas.microsoft.com/office/word/2023/wordml/word16du" xmlns:w16sdtdh="http://schemas.microsoft.com/office/word/2020/wordml/sdtdatahash" xmlns:w16sdtfl="http://schemas.microsoft.com/office/word/2024/wordml/sdtformatlock" xmlns:w16se="http://schemas.microsoft.com/office/word/2015/wordml/symex" xmlns:wpg="http://schemas.microsoft.com/office/word/2010/wordprocessingGroup" xmlns:wpi="http://schemas.microsoft.com/office/word/2010/wordprocessingInk" xmlns:wne="http://schemas.microsoft.com/office/word/2006/wordml" xmlns:wps="http://schemas.microsoft.com/office/word/2010/wordprocessingShape" mc:Ignorable="w14 w15 w16se w16cid w16 w16cex w16sdtdh w16sdtfl w16du wp14">
+<w:footnotes xmlns:wpc="http://schemas.microsoft.com/office/word/2010/wordprocessingCanvas" xmlns:cx="http://schemas.microsoft.com/office/drawing/2014/chartex" xmlns:cx1="http://schemas.microsoft.com/office/drawing/2015/9/8/chartex" xmlns:cx2="http://schemas.microsoft.com/office/drawing/2015/10/21/chartex" xmlns:cx3="http://schemas.microsoft.com/office/drawing/2016/5/9/chartex" xmlns:cx4="http://schemas.microsoft.com/office/drawing/2016/5/10/chartex" xmlns:cx5="http://schemas.microsoft.com/office/drawing/2016/5/11/chartex" xmlns:cx6="http://schemas.microsoft.com/office/drawing/2016/5/12/chartex" xmlns:cx7="http://schemas.microsoft.com/office/drawing/2016/5/13/chartex" xmlns:cx8="http://schemas.microsoft.com/office/drawing/2016/5/14/chartex" xmlns:mc="http://schemas.openxmlformats.org/markup-compatibility/2006" xmlns:m="http://schemas.openxmlformats.org/officeDocument/2006/math" xmlns:aink="http://schemas.microsoft.com/office/drawing/2016/ink" xmlns:am3d="http://schemas.microsoft.com/office/drawing/2017/model3d" xmlns:oel="http://schemas.microsoft.com/office/2019/extlst" xmlns:r="http://schemas.openxmlformats.org/officeDocument/2006/relationships" xmlns:wp14="http://schemas.microsoft.com/office/word/2010/wordprocessingDrawing" xmlns:wp="http://schemas.openxmlformats.org/drawingml/2006/wordprocessingDrawing" xmlns:wpg="http://schemas.microsoft.com/office/word/2010/wordprocessingGroup" xmlns:wpi="http://schemas.microsoft.com/office/word/2010/wordprocessingInk" xmlns:wps="http://schemas.microsoft.com/office/word/2010/wordprocessingShape" xmlns:o="urn:schemas-microsoft-com:office:office" xmlns:v="urn:schemas-microsoft-com:vml" xmlns:w10="urn:schemas-microsoft-com:office:word" xmlns:w="http://schemas.openxmlformats.org/wordprocessingml/2006/main" xmlns:w14="http://schemas.microsoft.com/office/word/2010/wordml" xmlns:w15="http://schemas.microsoft.com/office/word/2012/wordml" xmlns:w16cei="http://schemas.microsoft.com/office/word/2026/wordml/cei" xmlns:w16cex="http://schemas.microsoft.com/office/word/2018/wordml/cex" xmlns:w16cid="http://schemas.microsoft.com/office/word/2016/wordml/cid" xmlns:w16="http://schemas.microsoft.com/office/word/2018/wordml" xmlns:w16sdtdh="http://schemas.microsoft.com/office/word/2020/wordml/sdtdatahash" xmlns:w16sdtfl="http://schemas.microsoft.com/office/word/2024/wordml/sdtformatlock" xmlns:w16se="http://schemas.microsoft.com/office/word/2015/wordml/symex" xmlns:w16du="http://schemas.microsoft.com/office/word/2023/wordml/word16du" xmlns:wne="http://schemas.microsoft.com/office/word/2006/wordml" mc:Ignorable="w14 w15 w16se w16cid w16 w16cex w16sdtdh w16sdtfl w16du wp14">
   <w:footnote w:type="separator" w:id="-1">
     <w:p>
       <w:pPr>
@@ -11350,7 +12318,7 @@
 </file>
 
 <file path=word/header1.xml><?xml version="1.0" encoding="utf-8"?>
-<w:hdr xmlns:wpc="http://schemas.microsoft.com/office/word/2010/wordprocessingCanvas" xmlns:cx="http://schemas.microsoft.com/office/drawing/2014/chartex" xmlns:cx1="http://schemas.microsoft.com/office/drawing/2015/9/8/chartex" xmlns:cx2="http://schemas.microsoft.com/office/drawing/2015/10/21/chartex" xmlns:cx3="http://schemas.microsoft.com/office/drawing/2016/5/9/chartex" xmlns:cx4="http://schemas.microsoft.com/office/drawing/2016/5/10/chartex" xmlns:cx5="http://schemas.microsoft.com/office/drawing/2016/5/11/chartex" xmlns:cx6="http://schemas.microsoft.com/office/drawing/2016/5/12/chartex" xmlns:cx7="http://schemas.microsoft.com/office/drawing/2016/5/13/chartex" xmlns:cx8="http://schemas.microsoft.com/office/drawing/2016/5/14/chartex" xmlns:mc="http://schemas.openxmlformats.org/markup-compatibility/2006" xmlns:aink="http://schemas.microsoft.com/office/drawing/2016/ink" xmlns:am3d="http://schemas.microsoft.com/office/drawing/2017/model3d" xmlns:o="urn:schemas-microsoft-com:office:office" xmlns:oel="http://schemas.microsoft.com/office/2019/extlst" xmlns:r="http://schemas.openxmlformats.org/officeDocument/2006/relationships" xmlns:m="http://schemas.openxmlformats.org/officeDocument/2006/math" xmlns:v="urn:schemas-microsoft-com:vml" xmlns:wp14="http://schemas.microsoft.com/office/word/2010/wordprocessingDrawing" xmlns:wp="http://schemas.openxmlformats.org/drawingml/2006/wordprocessingDrawing" xmlns:w10="urn:schemas-microsoft-com:office:word" xmlns:w="http://schemas.openxmlformats.org/wordprocessingml/2006/main" xmlns:w14="http://schemas.microsoft.com/office/word/2010/wordml" xmlns:w15="http://schemas.microsoft.com/office/word/2012/wordml" xmlns:w16cex="http://schemas.microsoft.com/office/word/2018/wordml/cex" xmlns:w16cid="http://schemas.microsoft.com/office/word/2016/wordml/cid" xmlns:w16="http://schemas.microsoft.com/office/word/2018/wordml" xmlns:w16du="http://schemas.microsoft.com/office/word/2023/wordml/word16du" xmlns:w16sdtdh="http://schemas.microsoft.com/office/word/2020/wordml/sdtdatahash" xmlns:w16sdtfl="http://schemas.microsoft.com/office/word/2024/wordml/sdtformatlock" xmlns:w16se="http://schemas.microsoft.com/office/word/2015/wordml/symex" xmlns:wpg="http://schemas.microsoft.com/office/word/2010/wordprocessingGroup" xmlns:wpi="http://schemas.microsoft.com/office/word/2010/wordprocessingInk" xmlns:wne="http://schemas.microsoft.com/office/word/2006/wordml" xmlns:wps="http://schemas.microsoft.com/office/word/2010/wordprocessingShape" mc:Ignorable="w14 w15 w16se w16cid w16 w16cex w16sdtdh w16sdtfl w16du wp14">
+<w:hdr xmlns:wpc="http://schemas.microsoft.com/office/word/2010/wordprocessingCanvas" xmlns:cx="http://schemas.microsoft.com/office/drawing/2014/chartex" xmlns:cx1="http://schemas.microsoft.com/office/drawing/2015/9/8/chartex" xmlns:cx2="http://schemas.microsoft.com/office/drawing/2015/10/21/chartex" xmlns:cx3="http://schemas.microsoft.com/office/drawing/2016/5/9/chartex" xmlns:cx4="http://schemas.microsoft.com/office/drawing/2016/5/10/chartex" xmlns:cx5="http://schemas.microsoft.com/office/drawing/2016/5/11/chartex" xmlns:cx6="http://schemas.microsoft.com/office/drawing/2016/5/12/chartex" xmlns:cx7="http://schemas.microsoft.com/office/drawing/2016/5/13/chartex" xmlns:cx8="http://schemas.microsoft.com/office/drawing/2016/5/14/chartex" xmlns:mc="http://schemas.openxmlformats.org/markup-compatibility/2006" xmlns:m="http://schemas.openxmlformats.org/officeDocument/2006/math" xmlns:aink="http://schemas.microsoft.com/office/drawing/2016/ink" xmlns:am3d="http://schemas.microsoft.com/office/drawing/2017/model3d" xmlns:oel="http://schemas.microsoft.com/office/2019/extlst" xmlns:r="http://schemas.openxmlformats.org/officeDocument/2006/relationships" xmlns:wp14="http://schemas.microsoft.com/office/word/2010/wordprocessingDrawing" xmlns:wp="http://schemas.openxmlformats.org/drawingml/2006/wordprocessingDrawing" xmlns:wpg="http://schemas.microsoft.com/office/word/2010/wordprocessingGroup" xmlns:wpi="http://schemas.microsoft.com/office/word/2010/wordprocessingInk" xmlns:wps="http://schemas.microsoft.com/office/word/2010/wordprocessingShape" xmlns:o="urn:schemas-microsoft-com:office:office" xmlns:v="urn:schemas-microsoft-com:vml" xmlns:w10="urn:schemas-microsoft-com:office:word" xmlns:w="http://schemas.openxmlformats.org/wordprocessingml/2006/main" xmlns:w14="http://schemas.microsoft.com/office/word/2010/wordml" xmlns:w15="http://schemas.microsoft.com/office/word/2012/wordml" xmlns:w16cei="http://schemas.microsoft.com/office/word/2026/wordml/cei" xmlns:w16cex="http://schemas.microsoft.com/office/word/2018/wordml/cex" xmlns:w16cid="http://schemas.microsoft.com/office/word/2016/wordml/cid" xmlns:w16="http://schemas.microsoft.com/office/word/2018/wordml" xmlns:w16sdtdh="http://schemas.microsoft.com/office/word/2020/wordml/sdtdatahash" xmlns:w16sdtfl="http://schemas.microsoft.com/office/word/2024/wordml/sdtformatlock" xmlns:w16se="http://schemas.microsoft.com/office/word/2015/wordml/symex" xmlns:w16du="http://schemas.microsoft.com/office/word/2023/wordml/word16du" xmlns:wne="http://schemas.microsoft.com/office/word/2006/wordml" mc:Ignorable="w14 w15 w16se w16cid w16 w16cex w16sdtdh w16sdtfl w16du wp14">
   <w:p>
     <w:pPr>
       <w:pStyle w:val="Header"/>
@@ -11372,7 +12340,7 @@
 </file>
 
 <file path=word/numbering.xml><?xml version="1.0" encoding="utf-8"?>
-<w:numbering xmlns:wpc="http://schemas.microsoft.com/office/word/2010/wordprocessingCanvas" xmlns:cx="http://schemas.microsoft.com/office/drawing/2014/chartex" xmlns:cx1="http://schemas.microsoft.com/office/drawing/2015/9/8/chartex" xmlns:cx2="http://schemas.microsoft.com/office/drawing/2015/10/21/chartex" xmlns:cx3="http://schemas.microsoft.com/office/drawing/2016/5/9/chartex" xmlns:cx4="http://schemas.microsoft.com/office/drawing/2016/5/10/chartex" xmlns:cx5="http://schemas.microsoft.com/office/drawing/2016/5/11/chartex" xmlns:cx6="http://schemas.microsoft.com/office/drawing/2016/5/12/chartex" xmlns:cx7="http://schemas.microsoft.com/office/drawing/2016/5/13/chartex" xmlns:cx8="http://schemas.microsoft.com/office/drawing/2016/5/14/chartex" xmlns:mc="http://schemas.openxmlformats.org/markup-compatibility/2006" xmlns:aink="http://schemas.microsoft.com/office/drawing/2016/ink" xmlns:am3d="http://schemas.microsoft.com/office/drawing/2017/model3d" xmlns:o="urn:schemas-microsoft-com:office:office" xmlns:oel="http://schemas.microsoft.com/office/2019/extlst" xmlns:r="http://schemas.openxmlformats.org/officeDocument/2006/relationships" xmlns:m="http://schemas.openxmlformats.org/officeDocument/2006/math" xmlns:v="urn:schemas-microsoft-com:vml" xmlns:wp14="http://schemas.microsoft.com/office/word/2010/wordprocessingDrawing" xmlns:wp="http://schemas.openxmlformats.org/drawingml/2006/wordprocessingDrawing" xmlns:w10="urn:schemas-microsoft-com:office:word" xmlns:w="http://schemas.openxmlformats.org/wordprocessingml/2006/main" xmlns:w14="http://schemas.microsoft.com/office/word/2010/wordml" xmlns:w15="http://schemas.microsoft.com/office/word/2012/wordml" xmlns:w16cex="http://schemas.microsoft.com/office/word/2018/wordml/cex" xmlns:w16cid="http://schemas.microsoft.com/office/word/2016/wordml/cid" xmlns:w16="http://schemas.microsoft.com/office/word/2018/wordml" xmlns:w16du="http://schemas.microsoft.com/office/word/2023/wordml/word16du" xmlns:w16sdtdh="http://schemas.microsoft.com/office/word/2020/wordml/sdtdatahash" xmlns:w16sdtfl="http://schemas.microsoft.com/office/word/2024/wordml/sdtformatlock" xmlns:w16se="http://schemas.microsoft.com/office/word/2015/wordml/symex" xmlns:wpg="http://schemas.microsoft.com/office/word/2010/wordprocessingGroup" xmlns:wpi="http://schemas.microsoft.com/office/word/2010/wordprocessingInk" xmlns:wne="http://schemas.microsoft.com/office/word/2006/wordml" xmlns:wps="http://schemas.microsoft.com/office/word/2010/wordprocessingShape" mc:Ignorable="w14 w15 w16se w16cid w16 w16cex w16sdtdh w16sdtfl w16du wp14">
+<w:numbering xmlns:wpc="http://schemas.microsoft.com/office/word/2010/wordprocessingCanvas" xmlns:cx="http://schemas.microsoft.com/office/drawing/2014/chartex" xmlns:cx1="http://schemas.microsoft.com/office/drawing/2015/9/8/chartex" xmlns:cx2="http://schemas.microsoft.com/office/drawing/2015/10/21/chartex" xmlns:cx3="http://schemas.microsoft.com/office/drawing/2016/5/9/chartex" xmlns:cx4="http://schemas.microsoft.com/office/drawing/2016/5/10/chartex" xmlns:cx5="http://schemas.microsoft.com/office/drawing/2016/5/11/chartex" xmlns:cx6="http://schemas.microsoft.com/office/drawing/2016/5/12/chartex" xmlns:cx7="http://schemas.microsoft.com/office/drawing/2016/5/13/chartex" xmlns:cx8="http://schemas.microsoft.com/office/drawing/2016/5/14/chartex" xmlns:mc="http://schemas.openxmlformats.org/markup-compatibility/2006" xmlns:m="http://schemas.openxmlformats.org/officeDocument/2006/math" xmlns:aink="http://schemas.microsoft.com/office/drawing/2016/ink" xmlns:am3d="http://schemas.microsoft.com/office/drawing/2017/model3d" xmlns:oel="http://schemas.microsoft.com/office/2019/extlst" xmlns:r="http://schemas.openxmlformats.org/officeDocument/2006/relationships" xmlns:wp14="http://schemas.microsoft.com/office/word/2010/wordprocessingDrawing" xmlns:wp="http://schemas.openxmlformats.org/drawingml/2006/wordprocessingDrawing" xmlns:wpg="http://schemas.microsoft.com/office/word/2010/wordprocessingGroup" xmlns:wpi="http://schemas.microsoft.com/office/word/2010/wordprocessingInk" xmlns:wps="http://schemas.microsoft.com/office/word/2010/wordprocessingShape" xmlns:o="urn:schemas-microsoft-com:office:office" xmlns:v="urn:schemas-microsoft-com:vml" xmlns:w10="urn:schemas-microsoft-com:office:word" xmlns:w="http://schemas.openxmlformats.org/wordprocessingml/2006/main" xmlns:w14="http://schemas.microsoft.com/office/word/2010/wordml" xmlns:w15="http://schemas.microsoft.com/office/word/2012/wordml" xmlns:w16cei="http://schemas.microsoft.com/office/word/2026/wordml/cei" xmlns:w16cex="http://schemas.microsoft.com/office/word/2018/wordml/cex" xmlns:w16cid="http://schemas.microsoft.com/office/word/2016/wordml/cid" xmlns:w16="http://schemas.microsoft.com/office/word/2018/wordml" xmlns:w16sdtdh="http://schemas.microsoft.com/office/word/2020/wordml/sdtdatahash" xmlns:w16sdtfl="http://schemas.microsoft.com/office/word/2024/wordml/sdtformatlock" xmlns:w16se="http://schemas.microsoft.com/office/word/2015/wordml/symex" xmlns:w16du="http://schemas.microsoft.com/office/word/2023/wordml/word16du" xmlns:wne="http://schemas.microsoft.com/office/word/2006/wordml" mc:Ignorable="w14 w15 w16se w16cid w16 w16cex w16sdtdh w16sdtfl w16du wp14">
   <w:abstractNum w:abstractNumId="0" w15:restartNumberingAfterBreak="0">
     <w:nsid w:val="FFFFFF7C"/>
     <w:multiLevelType w:val="singleLevel"/>
@@ -11664,7 +12632,7 @@
 </file>
 
 <file path=word/styles.xml><?xml version="1.0" encoding="utf-8"?>
-<w:styles xmlns:mc="http://schemas.openxmlformats.org/markup-compatibility/2006" xmlns:r="http://schemas.openxmlformats.org/officeDocument/2006/relationships" xmlns:w="http://schemas.openxmlformats.org/wordprocessingml/2006/main" xmlns:w14="http://schemas.microsoft.com/office/word/2010/wordml" xmlns:w15="http://schemas.microsoft.com/office/word/2012/wordml" xmlns:w16cex="http://schemas.microsoft.com/office/word/2018/wordml/cex" xmlns:w16cid="http://schemas.microsoft.com/office/word/2016/wordml/cid" xmlns:w16="http://schemas.microsoft.com/office/word/2018/wordml" xmlns:w16du="http://schemas.microsoft.com/office/word/2023/wordml/word16du" xmlns:w16sdtdh="http://schemas.microsoft.com/office/word/2020/wordml/sdtdatahash" xmlns:w16sdtfl="http://schemas.microsoft.com/office/word/2024/wordml/sdtformatlock" xmlns:w16se="http://schemas.microsoft.com/office/word/2015/wordml/symex" mc:Ignorable="w14 w15 w16se w16cid w16 w16cex w16sdtdh w16sdtfl w16du">
+<w:styles xmlns:mc="http://schemas.openxmlformats.org/markup-compatibility/2006" xmlns:r="http://schemas.openxmlformats.org/officeDocument/2006/relationships" xmlns:w="http://schemas.openxmlformats.org/wordprocessingml/2006/main" xmlns:w14="http://schemas.microsoft.com/office/word/2010/wordml" xmlns:w15="http://schemas.microsoft.com/office/word/2012/wordml" xmlns:w16cex="http://schemas.microsoft.com/office/word/2018/wordml/cex" xmlns:w16cid="http://schemas.microsoft.com/office/word/2016/wordml/cid" xmlns:w16="http://schemas.microsoft.com/office/word/2018/wordml" xmlns:w16sdtdh="http://schemas.microsoft.com/office/word/2020/wordml/sdtdatahash" xmlns:w16sdtfl="http://schemas.microsoft.com/office/word/2024/wordml/sdtformatlock" xmlns:w16se="http://schemas.microsoft.com/office/word/2015/wordml/symex" xmlns:w16du="http://schemas.microsoft.com/office/word/2023/wordml/word16du" mc:Ignorable="w14 w15 w16se w16cid w16 w16cex w16sdtdh w16sdtfl w16du">
   <w:docDefaults>
     <w:rPrDefault>
       <w:rPr>
@@ -23046,6 +24014,29 @@
       </w:tcPr>
     </w:tblStylePr>
   </w:style>
+  <w:style w:type="character" w:styleId="HTMLCode">
+    <w:name w:val="HTML Code"/>
+    <w:basedOn w:val="DefaultParagraphFont"/>
+    <w:uiPriority w:val="99"/>
+    <w:semiHidden/>
+    <w:unhideWhenUsed/>
+    <w:rsid w:val="009B7999"/>
+    <w:rPr>
+      <w:rFonts w:ascii="Courier New" w:eastAsia="Times New Roman" w:hAnsi="Courier New" w:cs="Courier New"/>
+      <w:sz w:val="20"/>
+      <w:szCs w:val="20"/>
+    </w:rPr>
+  </w:style>
+  <w:style w:type="character" w:customStyle="1" w:styleId="k">
+    <w:name w:val="ͼk"/>
+    <w:basedOn w:val="DefaultParagraphFont"/>
+    <w:rsid w:val="008802ED"/>
+  </w:style>
+  <w:style w:type="character" w:customStyle="1" w:styleId="m">
+    <w:name w:val="ͼm"/>
+    <w:basedOn w:val="DefaultParagraphFont"/>
+    <w:rsid w:val="008802ED"/>
+  </w:style>
 </w:styles>
 </file>
 

</xml_diff>